<commit_message>
Add line breaks between battle phases in TurnUI
Inserted IO.println() calls between thinking, defense, and action phases in TurnUI to improve console output readability during battle turns.
</commit_message>
<xml_diff>
--- a/Modules/Semester_1/Modern Code/Aufgaben/03_Methods_and_Combat/Protocol.docx
+++ b/Modules/Semester_1/Modern Code/Aufgaben/03_Methods_and_Combat/Protocol.docx
@@ -454,6 +454,17 @@
           </w:r>
         </w:p>
         <w:p>
+          <w:pPr>
+            <w:pStyle w:val="TOC1"/>
+            <w:tabs>
+              <w:tab w:val="right" w:leader="dot" w:pos="8152"/>
+            </w:tabs>
+            <w:rPr>
+              <w:rFonts w:asciiTheme="minorHAnsi" w:eastAsiaTheme="minorEastAsia" w:hAnsiTheme="minorHAnsi"/>
+              <w:noProof/>
+              <w:lang w:val="en-AT" w:eastAsia="en-AT"/>
+            </w:rPr>
+          </w:pPr>
           <w:r>
             <w:fldChar w:fldCharType="begin"/>
           </w:r>
@@ -463,14 +474,1457 @@
           <w:r>
             <w:fldChar w:fldCharType="separate"/>
           </w:r>
-          <w:r>
+          <w:hyperlink w:anchor="_Toc214798860" w:history="1">
+            <w:r>
+              <w:rPr>
+                <w:rStyle w:val="Hyperlink"/>
+                <w:noProof/>
+              </w:rPr>
+              <w:t>excidium</w:t>
+            </w:r>
+            <w:r>
+              <w:rPr>
+                <w:noProof/>
+                <w:webHidden/>
+              </w:rPr>
+              <w:tab/>
+            </w:r>
+            <w:r>
+              <w:rPr>
+                <w:noProof/>
+                <w:webHidden/>
+              </w:rPr>
+              <w:fldChar w:fldCharType="begin"/>
+            </w:r>
+            <w:r>
+              <w:rPr>
+                <w:noProof/>
+                <w:webHidden/>
+              </w:rPr>
+              <w:instrText xml:space="preserve"> PAGEREF _Toc214798860 \h </w:instrText>
+            </w:r>
+            <w:r>
+              <w:rPr>
+                <w:noProof/>
+                <w:webHidden/>
+              </w:rPr>
+            </w:r>
+            <w:r>
+              <w:rPr>
+                <w:noProof/>
+                <w:webHidden/>
+              </w:rPr>
+              <w:fldChar w:fldCharType="separate"/>
+            </w:r>
+            <w:r>
+              <w:rPr>
+                <w:noProof/>
+                <w:webHidden/>
+              </w:rPr>
+              <w:t>2</w:t>
+            </w:r>
+            <w:r>
+              <w:rPr>
+                <w:noProof/>
+                <w:webHidden/>
+              </w:rPr>
+              <w:fldChar w:fldCharType="end"/>
+            </w:r>
+          </w:hyperlink>
+        </w:p>
+        <w:p>
+          <w:pPr>
+            <w:pStyle w:val="TOC2"/>
+            <w:tabs>
+              <w:tab w:val="right" w:leader="dot" w:pos="8152"/>
+            </w:tabs>
             <w:rPr>
-              <w:b/>
-              <w:bCs/>
+              <w:rFonts w:asciiTheme="minorHAnsi" w:eastAsiaTheme="minorEastAsia" w:hAnsiTheme="minorHAnsi"/>
+              <w:noProof/>
+              <w:lang w:val="en-AT" w:eastAsia="en-AT"/>
+            </w:rPr>
+          </w:pPr>
+          <w:hyperlink w:anchor="_Toc214798861" w:history="1">
+            <w:r>
+              <w:rPr>
+                <w:rStyle w:val="Hyperlink"/>
+                <w:noProof/>
+              </w:rPr>
+              <w:t>Start of the Game</w:t>
+            </w:r>
+            <w:r>
+              <w:rPr>
+                <w:noProof/>
+                <w:webHidden/>
+              </w:rPr>
+              <w:tab/>
+            </w:r>
+            <w:r>
+              <w:rPr>
+                <w:noProof/>
+                <w:webHidden/>
+              </w:rPr>
+              <w:fldChar w:fldCharType="begin"/>
+            </w:r>
+            <w:r>
+              <w:rPr>
+                <w:noProof/>
+                <w:webHidden/>
+              </w:rPr>
+              <w:instrText xml:space="preserve"> PAGEREF _Toc214798861 \h </w:instrText>
+            </w:r>
+            <w:r>
+              <w:rPr>
+                <w:noProof/>
+                <w:webHidden/>
+              </w:rPr>
+            </w:r>
+            <w:r>
+              <w:rPr>
+                <w:noProof/>
+                <w:webHidden/>
+              </w:rPr>
+              <w:fldChar w:fldCharType="separate"/>
+            </w:r>
+            <w:r>
+              <w:rPr>
+                <w:noProof/>
+                <w:webHidden/>
+              </w:rPr>
+              <w:t>2</w:t>
+            </w:r>
+            <w:r>
+              <w:rPr>
+                <w:noProof/>
+                <w:webHidden/>
+              </w:rPr>
+              <w:fldChar w:fldCharType="end"/>
+            </w:r>
+          </w:hyperlink>
+        </w:p>
+        <w:p>
+          <w:pPr>
+            <w:pStyle w:val="TOC3"/>
+            <w:tabs>
+              <w:tab w:val="right" w:leader="dot" w:pos="8152"/>
+            </w:tabs>
+            <w:rPr>
               <w:noProof/>
             </w:rPr>
-            <w:t>No table of contents entries found.</w:t>
-          </w:r>
+          </w:pPr>
+          <w:hyperlink w:anchor="_Toc214798862" w:history="1">
+            <w:r>
+              <w:rPr>
+                <w:rStyle w:val="Hyperlink"/>
+                <w:noProof/>
+              </w:rPr>
+              <w:t>Character Creation</w:t>
+            </w:r>
+            <w:r>
+              <w:rPr>
+                <w:noProof/>
+                <w:webHidden/>
+              </w:rPr>
+              <w:tab/>
+            </w:r>
+            <w:r>
+              <w:rPr>
+                <w:noProof/>
+                <w:webHidden/>
+              </w:rPr>
+              <w:fldChar w:fldCharType="begin"/>
+            </w:r>
+            <w:r>
+              <w:rPr>
+                <w:noProof/>
+                <w:webHidden/>
+              </w:rPr>
+              <w:instrText xml:space="preserve"> PAGEREF _Toc214798862 \h </w:instrText>
+            </w:r>
+            <w:r>
+              <w:rPr>
+                <w:noProof/>
+                <w:webHidden/>
+              </w:rPr>
+            </w:r>
+            <w:r>
+              <w:rPr>
+                <w:noProof/>
+                <w:webHidden/>
+              </w:rPr>
+              <w:fldChar w:fldCharType="separate"/>
+            </w:r>
+            <w:r>
+              <w:rPr>
+                <w:noProof/>
+                <w:webHidden/>
+              </w:rPr>
+              <w:t>3</w:t>
+            </w:r>
+            <w:r>
+              <w:rPr>
+                <w:noProof/>
+                <w:webHidden/>
+              </w:rPr>
+              <w:fldChar w:fldCharType="end"/>
+            </w:r>
+          </w:hyperlink>
+        </w:p>
+        <w:p>
+          <w:pPr>
+            <w:pStyle w:val="TOC3"/>
+            <w:tabs>
+              <w:tab w:val="right" w:leader="dot" w:pos="8152"/>
+            </w:tabs>
+            <w:rPr>
+              <w:noProof/>
+            </w:rPr>
+          </w:pPr>
+          <w:hyperlink w:anchor="_Toc214798863" w:history="1">
+            <w:r>
+              <w:rPr>
+                <w:rStyle w:val="Hyperlink"/>
+                <w:noProof/>
+              </w:rPr>
+              <w:t>Difficulty Selection</w:t>
+            </w:r>
+            <w:r>
+              <w:rPr>
+                <w:noProof/>
+                <w:webHidden/>
+              </w:rPr>
+              <w:tab/>
+            </w:r>
+            <w:r>
+              <w:rPr>
+                <w:noProof/>
+                <w:webHidden/>
+              </w:rPr>
+              <w:fldChar w:fldCharType="begin"/>
+            </w:r>
+            <w:r>
+              <w:rPr>
+                <w:noProof/>
+                <w:webHidden/>
+              </w:rPr>
+              <w:instrText xml:space="preserve"> PAGEREF _Toc214798863 \h </w:instrText>
+            </w:r>
+            <w:r>
+              <w:rPr>
+                <w:noProof/>
+                <w:webHidden/>
+              </w:rPr>
+            </w:r>
+            <w:r>
+              <w:rPr>
+                <w:noProof/>
+                <w:webHidden/>
+              </w:rPr>
+              <w:fldChar w:fldCharType="separate"/>
+            </w:r>
+            <w:r>
+              <w:rPr>
+                <w:noProof/>
+                <w:webHidden/>
+              </w:rPr>
+              <w:t>4</w:t>
+            </w:r>
+            <w:r>
+              <w:rPr>
+                <w:noProof/>
+                <w:webHidden/>
+              </w:rPr>
+              <w:fldChar w:fldCharType="end"/>
+            </w:r>
+          </w:hyperlink>
+        </w:p>
+        <w:p>
+          <w:pPr>
+            <w:pStyle w:val="TOC3"/>
+            <w:tabs>
+              <w:tab w:val="right" w:leader="dot" w:pos="8152"/>
+            </w:tabs>
+            <w:rPr>
+              <w:noProof/>
+            </w:rPr>
+          </w:pPr>
+          <w:hyperlink w:anchor="_Toc214798864" w:history="1">
+            <w:r>
+              <w:rPr>
+                <w:rStyle w:val="Hyperlink"/>
+                <w:noProof/>
+              </w:rPr>
+              <w:t>Playing excidium</w:t>
+            </w:r>
+            <w:r>
+              <w:rPr>
+                <w:noProof/>
+                <w:webHidden/>
+              </w:rPr>
+              <w:tab/>
+            </w:r>
+            <w:r>
+              <w:rPr>
+                <w:noProof/>
+                <w:webHidden/>
+              </w:rPr>
+              <w:fldChar w:fldCharType="begin"/>
+            </w:r>
+            <w:r>
+              <w:rPr>
+                <w:noProof/>
+                <w:webHidden/>
+              </w:rPr>
+              <w:instrText xml:space="preserve"> PAGEREF _Toc214798864 \h </w:instrText>
+            </w:r>
+            <w:r>
+              <w:rPr>
+                <w:noProof/>
+                <w:webHidden/>
+              </w:rPr>
+            </w:r>
+            <w:r>
+              <w:rPr>
+                <w:noProof/>
+                <w:webHidden/>
+              </w:rPr>
+              <w:fldChar w:fldCharType="separate"/>
+            </w:r>
+            <w:r>
+              <w:rPr>
+                <w:noProof/>
+                <w:webHidden/>
+              </w:rPr>
+              <w:t>5</w:t>
+            </w:r>
+            <w:r>
+              <w:rPr>
+                <w:noProof/>
+                <w:webHidden/>
+              </w:rPr>
+              <w:fldChar w:fldCharType="end"/>
+            </w:r>
+          </w:hyperlink>
+        </w:p>
+        <w:p>
+          <w:pPr>
+            <w:pStyle w:val="TOC2"/>
+            <w:tabs>
+              <w:tab w:val="right" w:leader="dot" w:pos="8152"/>
+            </w:tabs>
+            <w:rPr>
+              <w:rFonts w:asciiTheme="minorHAnsi" w:eastAsiaTheme="minorEastAsia" w:hAnsiTheme="minorHAnsi"/>
+              <w:noProof/>
+              <w:lang w:val="en-AT" w:eastAsia="en-AT"/>
+            </w:rPr>
+          </w:pPr>
+          <w:hyperlink w:anchor="_Toc214798865" w:history="1">
+            <w:r>
+              <w:rPr>
+                <w:rStyle w:val="Hyperlink"/>
+                <w:noProof/>
+              </w:rPr>
+              <w:t>Battles</w:t>
+            </w:r>
+            <w:r>
+              <w:rPr>
+                <w:noProof/>
+                <w:webHidden/>
+              </w:rPr>
+              <w:tab/>
+            </w:r>
+            <w:r>
+              <w:rPr>
+                <w:noProof/>
+                <w:webHidden/>
+              </w:rPr>
+              <w:fldChar w:fldCharType="begin"/>
+            </w:r>
+            <w:r>
+              <w:rPr>
+                <w:noProof/>
+                <w:webHidden/>
+              </w:rPr>
+              <w:instrText xml:space="preserve"> PAGEREF _Toc214798865 \h </w:instrText>
+            </w:r>
+            <w:r>
+              <w:rPr>
+                <w:noProof/>
+                <w:webHidden/>
+              </w:rPr>
+            </w:r>
+            <w:r>
+              <w:rPr>
+                <w:noProof/>
+                <w:webHidden/>
+              </w:rPr>
+              <w:fldChar w:fldCharType="separate"/>
+            </w:r>
+            <w:r>
+              <w:rPr>
+                <w:noProof/>
+                <w:webHidden/>
+              </w:rPr>
+              <w:t>5</w:t>
+            </w:r>
+            <w:r>
+              <w:rPr>
+                <w:noProof/>
+                <w:webHidden/>
+              </w:rPr>
+              <w:fldChar w:fldCharType="end"/>
+            </w:r>
+          </w:hyperlink>
+        </w:p>
+        <w:p>
+          <w:pPr>
+            <w:pStyle w:val="TOC3"/>
+            <w:tabs>
+              <w:tab w:val="right" w:leader="dot" w:pos="8152"/>
+            </w:tabs>
+            <w:rPr>
+              <w:noProof/>
+            </w:rPr>
+          </w:pPr>
+          <w:hyperlink w:anchor="_Toc214798866" w:history="1">
+            <w:r>
+              <w:rPr>
+                <w:rStyle w:val="Hyperlink"/>
+                <w:noProof/>
+              </w:rPr>
+              <w:t>Turns</w:t>
+            </w:r>
+            <w:r>
+              <w:rPr>
+                <w:noProof/>
+                <w:webHidden/>
+              </w:rPr>
+              <w:tab/>
+            </w:r>
+            <w:r>
+              <w:rPr>
+                <w:noProof/>
+                <w:webHidden/>
+              </w:rPr>
+              <w:fldChar w:fldCharType="begin"/>
+            </w:r>
+            <w:r>
+              <w:rPr>
+                <w:noProof/>
+                <w:webHidden/>
+              </w:rPr>
+              <w:instrText xml:space="preserve"> PAGEREF _Toc214798866 \h </w:instrText>
+            </w:r>
+            <w:r>
+              <w:rPr>
+                <w:noProof/>
+                <w:webHidden/>
+              </w:rPr>
+            </w:r>
+            <w:r>
+              <w:rPr>
+                <w:noProof/>
+                <w:webHidden/>
+              </w:rPr>
+              <w:fldChar w:fldCharType="separate"/>
+            </w:r>
+            <w:r>
+              <w:rPr>
+                <w:noProof/>
+                <w:webHidden/>
+              </w:rPr>
+              <w:t>6</w:t>
+            </w:r>
+            <w:r>
+              <w:rPr>
+                <w:noProof/>
+                <w:webHidden/>
+              </w:rPr>
+              <w:fldChar w:fldCharType="end"/>
+            </w:r>
+          </w:hyperlink>
+        </w:p>
+        <w:p>
+          <w:pPr>
+            <w:pStyle w:val="TOC1"/>
+            <w:tabs>
+              <w:tab w:val="right" w:leader="dot" w:pos="8152"/>
+            </w:tabs>
+            <w:rPr>
+              <w:rFonts w:asciiTheme="minorHAnsi" w:eastAsiaTheme="minorEastAsia" w:hAnsiTheme="minorHAnsi"/>
+              <w:noProof/>
+              <w:lang w:val="en-AT" w:eastAsia="en-AT"/>
+            </w:rPr>
+          </w:pPr>
+          <w:hyperlink w:anchor="_Toc214798867" w:history="1">
+            <w:r>
+              <w:rPr>
+                <w:rStyle w:val="Hyperlink"/>
+                <w:noProof/>
+              </w:rPr>
+              <w:t>GameCharacter</w:t>
+            </w:r>
+            <w:r>
+              <w:rPr>
+                <w:noProof/>
+                <w:webHidden/>
+              </w:rPr>
+              <w:tab/>
+            </w:r>
+            <w:r>
+              <w:rPr>
+                <w:noProof/>
+                <w:webHidden/>
+              </w:rPr>
+              <w:fldChar w:fldCharType="begin"/>
+            </w:r>
+            <w:r>
+              <w:rPr>
+                <w:noProof/>
+                <w:webHidden/>
+              </w:rPr>
+              <w:instrText xml:space="preserve"> PAGEREF _Toc214798867 \h </w:instrText>
+            </w:r>
+            <w:r>
+              <w:rPr>
+                <w:noProof/>
+                <w:webHidden/>
+              </w:rPr>
+            </w:r>
+            <w:r>
+              <w:rPr>
+                <w:noProof/>
+                <w:webHidden/>
+              </w:rPr>
+              <w:fldChar w:fldCharType="separate"/>
+            </w:r>
+            <w:r>
+              <w:rPr>
+                <w:noProof/>
+                <w:webHidden/>
+              </w:rPr>
+              <w:t>6</w:t>
+            </w:r>
+            <w:r>
+              <w:rPr>
+                <w:noProof/>
+                <w:webHidden/>
+              </w:rPr>
+              <w:fldChar w:fldCharType="end"/>
+            </w:r>
+          </w:hyperlink>
+        </w:p>
+        <w:p>
+          <w:pPr>
+            <w:pStyle w:val="TOC2"/>
+            <w:tabs>
+              <w:tab w:val="right" w:leader="dot" w:pos="8152"/>
+            </w:tabs>
+            <w:rPr>
+              <w:rFonts w:asciiTheme="minorHAnsi" w:eastAsiaTheme="minorEastAsia" w:hAnsiTheme="minorHAnsi"/>
+              <w:noProof/>
+              <w:lang w:val="en-AT" w:eastAsia="en-AT"/>
+            </w:rPr>
+          </w:pPr>
+          <w:hyperlink w:anchor="_Toc214798868" w:history="1">
+            <w:r>
+              <w:rPr>
+                <w:rStyle w:val="Hyperlink"/>
+                <w:noProof/>
+              </w:rPr>
+              <w:t>Player</w:t>
+            </w:r>
+            <w:r>
+              <w:rPr>
+                <w:noProof/>
+                <w:webHidden/>
+              </w:rPr>
+              <w:tab/>
+            </w:r>
+            <w:r>
+              <w:rPr>
+                <w:noProof/>
+                <w:webHidden/>
+              </w:rPr>
+              <w:fldChar w:fldCharType="begin"/>
+            </w:r>
+            <w:r>
+              <w:rPr>
+                <w:noProof/>
+                <w:webHidden/>
+              </w:rPr>
+              <w:instrText xml:space="preserve"> PAGEREF _Toc214798868 \h </w:instrText>
+            </w:r>
+            <w:r>
+              <w:rPr>
+                <w:noProof/>
+                <w:webHidden/>
+              </w:rPr>
+            </w:r>
+            <w:r>
+              <w:rPr>
+                <w:noProof/>
+                <w:webHidden/>
+              </w:rPr>
+              <w:fldChar w:fldCharType="separate"/>
+            </w:r>
+            <w:r>
+              <w:rPr>
+                <w:noProof/>
+                <w:webHidden/>
+              </w:rPr>
+              <w:t>6</w:t>
+            </w:r>
+            <w:r>
+              <w:rPr>
+                <w:noProof/>
+                <w:webHidden/>
+              </w:rPr>
+              <w:fldChar w:fldCharType="end"/>
+            </w:r>
+          </w:hyperlink>
+        </w:p>
+        <w:p>
+          <w:pPr>
+            <w:pStyle w:val="TOC2"/>
+            <w:tabs>
+              <w:tab w:val="right" w:leader="dot" w:pos="8152"/>
+            </w:tabs>
+            <w:rPr>
+              <w:rFonts w:asciiTheme="minorHAnsi" w:eastAsiaTheme="minorEastAsia" w:hAnsiTheme="minorHAnsi"/>
+              <w:noProof/>
+              <w:lang w:val="en-AT" w:eastAsia="en-AT"/>
+            </w:rPr>
+          </w:pPr>
+          <w:hyperlink w:anchor="_Toc214798869" w:history="1">
+            <w:r>
+              <w:rPr>
+                <w:rStyle w:val="Hyperlink"/>
+                <w:noProof/>
+              </w:rPr>
+              <w:t>Enemy</w:t>
+            </w:r>
+            <w:r>
+              <w:rPr>
+                <w:noProof/>
+                <w:webHidden/>
+              </w:rPr>
+              <w:tab/>
+            </w:r>
+            <w:r>
+              <w:rPr>
+                <w:noProof/>
+                <w:webHidden/>
+              </w:rPr>
+              <w:fldChar w:fldCharType="begin"/>
+            </w:r>
+            <w:r>
+              <w:rPr>
+                <w:noProof/>
+                <w:webHidden/>
+              </w:rPr>
+              <w:instrText xml:space="preserve"> PAGEREF _Toc214798869 \h </w:instrText>
+            </w:r>
+            <w:r>
+              <w:rPr>
+                <w:noProof/>
+                <w:webHidden/>
+              </w:rPr>
+            </w:r>
+            <w:r>
+              <w:rPr>
+                <w:noProof/>
+                <w:webHidden/>
+              </w:rPr>
+              <w:fldChar w:fldCharType="separate"/>
+            </w:r>
+            <w:r>
+              <w:rPr>
+                <w:noProof/>
+                <w:webHidden/>
+              </w:rPr>
+              <w:t>6</w:t>
+            </w:r>
+            <w:r>
+              <w:rPr>
+                <w:noProof/>
+                <w:webHidden/>
+              </w:rPr>
+              <w:fldChar w:fldCharType="end"/>
+            </w:r>
+          </w:hyperlink>
+        </w:p>
+        <w:p>
+          <w:pPr>
+            <w:pStyle w:val="TOC1"/>
+            <w:tabs>
+              <w:tab w:val="right" w:leader="dot" w:pos="8152"/>
+            </w:tabs>
+            <w:rPr>
+              <w:rFonts w:asciiTheme="minorHAnsi" w:eastAsiaTheme="minorEastAsia" w:hAnsiTheme="minorHAnsi"/>
+              <w:noProof/>
+              <w:lang w:val="en-AT" w:eastAsia="en-AT"/>
+            </w:rPr>
+          </w:pPr>
+          <w:hyperlink w:anchor="_Toc214798870" w:history="1">
+            <w:r>
+              <w:rPr>
+                <w:rStyle w:val="Hyperlink"/>
+                <w:noProof/>
+              </w:rPr>
+              <w:t>GameManager</w:t>
+            </w:r>
+            <w:r>
+              <w:rPr>
+                <w:noProof/>
+                <w:webHidden/>
+              </w:rPr>
+              <w:tab/>
+            </w:r>
+            <w:r>
+              <w:rPr>
+                <w:noProof/>
+                <w:webHidden/>
+              </w:rPr>
+              <w:fldChar w:fldCharType="begin"/>
+            </w:r>
+            <w:r>
+              <w:rPr>
+                <w:noProof/>
+                <w:webHidden/>
+              </w:rPr>
+              <w:instrText xml:space="preserve"> PAGEREF _Toc214798870 \h </w:instrText>
+            </w:r>
+            <w:r>
+              <w:rPr>
+                <w:noProof/>
+                <w:webHidden/>
+              </w:rPr>
+            </w:r>
+            <w:r>
+              <w:rPr>
+                <w:noProof/>
+                <w:webHidden/>
+              </w:rPr>
+              <w:fldChar w:fldCharType="separate"/>
+            </w:r>
+            <w:r>
+              <w:rPr>
+                <w:noProof/>
+                <w:webHidden/>
+              </w:rPr>
+              <w:t>6</w:t>
+            </w:r>
+            <w:r>
+              <w:rPr>
+                <w:noProof/>
+                <w:webHidden/>
+              </w:rPr>
+              <w:fldChar w:fldCharType="end"/>
+            </w:r>
+          </w:hyperlink>
+        </w:p>
+        <w:p>
+          <w:pPr>
+            <w:pStyle w:val="TOC1"/>
+            <w:tabs>
+              <w:tab w:val="right" w:leader="dot" w:pos="8152"/>
+            </w:tabs>
+            <w:rPr>
+              <w:rFonts w:asciiTheme="minorHAnsi" w:eastAsiaTheme="minorEastAsia" w:hAnsiTheme="minorHAnsi"/>
+              <w:noProof/>
+              <w:lang w:val="en-AT" w:eastAsia="en-AT"/>
+            </w:rPr>
+          </w:pPr>
+          <w:hyperlink w:anchor="_Toc214798871" w:history="1">
+            <w:r>
+              <w:rPr>
+                <w:rStyle w:val="Hyperlink"/>
+                <w:noProof/>
+              </w:rPr>
+              <w:t>Inventory</w:t>
+            </w:r>
+            <w:r>
+              <w:rPr>
+                <w:noProof/>
+                <w:webHidden/>
+              </w:rPr>
+              <w:tab/>
+            </w:r>
+            <w:r>
+              <w:rPr>
+                <w:noProof/>
+                <w:webHidden/>
+              </w:rPr>
+              <w:fldChar w:fldCharType="begin"/>
+            </w:r>
+            <w:r>
+              <w:rPr>
+                <w:noProof/>
+                <w:webHidden/>
+              </w:rPr>
+              <w:instrText xml:space="preserve"> PAGEREF _Toc214798871 \h </w:instrText>
+            </w:r>
+            <w:r>
+              <w:rPr>
+                <w:noProof/>
+                <w:webHidden/>
+              </w:rPr>
+            </w:r>
+            <w:r>
+              <w:rPr>
+                <w:noProof/>
+                <w:webHidden/>
+              </w:rPr>
+              <w:fldChar w:fldCharType="separate"/>
+            </w:r>
+            <w:r>
+              <w:rPr>
+                <w:noProof/>
+                <w:webHidden/>
+              </w:rPr>
+              <w:t>6</w:t>
+            </w:r>
+            <w:r>
+              <w:rPr>
+                <w:noProof/>
+                <w:webHidden/>
+              </w:rPr>
+              <w:fldChar w:fldCharType="end"/>
+            </w:r>
+          </w:hyperlink>
+        </w:p>
+        <w:p>
+          <w:pPr>
+            <w:pStyle w:val="TOC1"/>
+            <w:tabs>
+              <w:tab w:val="right" w:leader="dot" w:pos="8152"/>
+            </w:tabs>
+            <w:rPr>
+              <w:rFonts w:asciiTheme="minorHAnsi" w:eastAsiaTheme="minorEastAsia" w:hAnsiTheme="minorHAnsi"/>
+              <w:noProof/>
+              <w:lang w:val="en-AT" w:eastAsia="en-AT"/>
+            </w:rPr>
+          </w:pPr>
+          <w:hyperlink w:anchor="_Toc214798872" w:history="1">
+            <w:r>
+              <w:rPr>
+                <w:rStyle w:val="Hyperlink"/>
+                <w:noProof/>
+              </w:rPr>
+              <w:t>Items</w:t>
+            </w:r>
+            <w:r>
+              <w:rPr>
+                <w:noProof/>
+                <w:webHidden/>
+              </w:rPr>
+              <w:tab/>
+            </w:r>
+            <w:r>
+              <w:rPr>
+                <w:noProof/>
+                <w:webHidden/>
+              </w:rPr>
+              <w:fldChar w:fldCharType="begin"/>
+            </w:r>
+            <w:r>
+              <w:rPr>
+                <w:noProof/>
+                <w:webHidden/>
+              </w:rPr>
+              <w:instrText xml:space="preserve"> PAGEREF _Toc214798872 \h </w:instrText>
+            </w:r>
+            <w:r>
+              <w:rPr>
+                <w:noProof/>
+                <w:webHidden/>
+              </w:rPr>
+            </w:r>
+            <w:r>
+              <w:rPr>
+                <w:noProof/>
+                <w:webHidden/>
+              </w:rPr>
+              <w:fldChar w:fldCharType="separate"/>
+            </w:r>
+            <w:r>
+              <w:rPr>
+                <w:noProof/>
+                <w:webHidden/>
+              </w:rPr>
+              <w:t>6</w:t>
+            </w:r>
+            <w:r>
+              <w:rPr>
+                <w:noProof/>
+                <w:webHidden/>
+              </w:rPr>
+              <w:fldChar w:fldCharType="end"/>
+            </w:r>
+          </w:hyperlink>
+        </w:p>
+        <w:p>
+          <w:pPr>
+            <w:pStyle w:val="TOC2"/>
+            <w:tabs>
+              <w:tab w:val="right" w:leader="dot" w:pos="8152"/>
+            </w:tabs>
+            <w:rPr>
+              <w:rFonts w:asciiTheme="minorHAnsi" w:eastAsiaTheme="minorEastAsia" w:hAnsiTheme="minorHAnsi"/>
+              <w:noProof/>
+              <w:lang w:val="en-AT" w:eastAsia="en-AT"/>
+            </w:rPr>
+          </w:pPr>
+          <w:hyperlink w:anchor="_Toc214798873" w:history="1">
+            <w:r>
+              <w:rPr>
+                <w:rStyle w:val="Hyperlink"/>
+                <w:noProof/>
+              </w:rPr>
+              <w:t>Weapons</w:t>
+            </w:r>
+            <w:r>
+              <w:rPr>
+                <w:noProof/>
+                <w:webHidden/>
+              </w:rPr>
+              <w:tab/>
+            </w:r>
+            <w:r>
+              <w:rPr>
+                <w:noProof/>
+                <w:webHidden/>
+              </w:rPr>
+              <w:fldChar w:fldCharType="begin"/>
+            </w:r>
+            <w:r>
+              <w:rPr>
+                <w:noProof/>
+                <w:webHidden/>
+              </w:rPr>
+              <w:instrText xml:space="preserve"> PAGEREF _Toc214798873 \h </w:instrText>
+            </w:r>
+            <w:r>
+              <w:rPr>
+                <w:noProof/>
+                <w:webHidden/>
+              </w:rPr>
+            </w:r>
+            <w:r>
+              <w:rPr>
+                <w:noProof/>
+                <w:webHidden/>
+              </w:rPr>
+              <w:fldChar w:fldCharType="separate"/>
+            </w:r>
+            <w:r>
+              <w:rPr>
+                <w:noProof/>
+                <w:webHidden/>
+              </w:rPr>
+              <w:t>6</w:t>
+            </w:r>
+            <w:r>
+              <w:rPr>
+                <w:noProof/>
+                <w:webHidden/>
+              </w:rPr>
+              <w:fldChar w:fldCharType="end"/>
+            </w:r>
+          </w:hyperlink>
+        </w:p>
+        <w:p>
+          <w:pPr>
+            <w:pStyle w:val="TOC2"/>
+            <w:tabs>
+              <w:tab w:val="right" w:leader="dot" w:pos="8152"/>
+            </w:tabs>
+            <w:rPr>
+              <w:rFonts w:asciiTheme="minorHAnsi" w:eastAsiaTheme="minorEastAsia" w:hAnsiTheme="minorHAnsi"/>
+              <w:noProof/>
+              <w:lang w:val="en-AT" w:eastAsia="en-AT"/>
+            </w:rPr>
+          </w:pPr>
+          <w:hyperlink w:anchor="_Toc214798874" w:history="1">
+            <w:r>
+              <w:rPr>
+                <w:rStyle w:val="Hyperlink"/>
+                <w:noProof/>
+              </w:rPr>
+              <w:t>Shields</w:t>
+            </w:r>
+            <w:r>
+              <w:rPr>
+                <w:noProof/>
+                <w:webHidden/>
+              </w:rPr>
+              <w:tab/>
+            </w:r>
+            <w:r>
+              <w:rPr>
+                <w:noProof/>
+                <w:webHidden/>
+              </w:rPr>
+              <w:fldChar w:fldCharType="begin"/>
+            </w:r>
+            <w:r>
+              <w:rPr>
+                <w:noProof/>
+                <w:webHidden/>
+              </w:rPr>
+              <w:instrText xml:space="preserve"> PAGEREF _Toc214798874 \h </w:instrText>
+            </w:r>
+            <w:r>
+              <w:rPr>
+                <w:noProof/>
+                <w:webHidden/>
+              </w:rPr>
+            </w:r>
+            <w:r>
+              <w:rPr>
+                <w:noProof/>
+                <w:webHidden/>
+              </w:rPr>
+              <w:fldChar w:fldCharType="separate"/>
+            </w:r>
+            <w:r>
+              <w:rPr>
+                <w:noProof/>
+                <w:webHidden/>
+              </w:rPr>
+              <w:t>6</w:t>
+            </w:r>
+            <w:r>
+              <w:rPr>
+                <w:noProof/>
+                <w:webHidden/>
+              </w:rPr>
+              <w:fldChar w:fldCharType="end"/>
+            </w:r>
+          </w:hyperlink>
+        </w:p>
+        <w:p>
+          <w:pPr>
+            <w:pStyle w:val="TOC2"/>
+            <w:tabs>
+              <w:tab w:val="right" w:leader="dot" w:pos="8152"/>
+            </w:tabs>
+            <w:rPr>
+              <w:rFonts w:asciiTheme="minorHAnsi" w:eastAsiaTheme="minorEastAsia" w:hAnsiTheme="minorHAnsi"/>
+              <w:noProof/>
+              <w:lang w:val="en-AT" w:eastAsia="en-AT"/>
+            </w:rPr>
+          </w:pPr>
+          <w:hyperlink w:anchor="_Toc214798875" w:history="1">
+            <w:r>
+              <w:rPr>
+                <w:rStyle w:val="Hyperlink"/>
+                <w:noProof/>
+              </w:rPr>
+              <w:t>Armours</w:t>
+            </w:r>
+            <w:r>
+              <w:rPr>
+                <w:noProof/>
+                <w:webHidden/>
+              </w:rPr>
+              <w:tab/>
+            </w:r>
+            <w:r>
+              <w:rPr>
+                <w:noProof/>
+                <w:webHidden/>
+              </w:rPr>
+              <w:fldChar w:fldCharType="begin"/>
+            </w:r>
+            <w:r>
+              <w:rPr>
+                <w:noProof/>
+                <w:webHidden/>
+              </w:rPr>
+              <w:instrText xml:space="preserve"> PAGEREF _Toc214798875 \h </w:instrText>
+            </w:r>
+            <w:r>
+              <w:rPr>
+                <w:noProof/>
+                <w:webHidden/>
+              </w:rPr>
+            </w:r>
+            <w:r>
+              <w:rPr>
+                <w:noProof/>
+                <w:webHidden/>
+              </w:rPr>
+              <w:fldChar w:fldCharType="separate"/>
+            </w:r>
+            <w:r>
+              <w:rPr>
+                <w:noProof/>
+                <w:webHidden/>
+              </w:rPr>
+              <w:t>6</w:t>
+            </w:r>
+            <w:r>
+              <w:rPr>
+                <w:noProof/>
+                <w:webHidden/>
+              </w:rPr>
+              <w:fldChar w:fldCharType="end"/>
+            </w:r>
+          </w:hyperlink>
+        </w:p>
+        <w:p>
+          <w:pPr>
+            <w:pStyle w:val="TOC2"/>
+            <w:tabs>
+              <w:tab w:val="right" w:leader="dot" w:pos="8152"/>
+            </w:tabs>
+            <w:rPr>
+              <w:rFonts w:asciiTheme="minorHAnsi" w:eastAsiaTheme="minorEastAsia" w:hAnsiTheme="minorHAnsi"/>
+              <w:noProof/>
+              <w:lang w:val="en-AT" w:eastAsia="en-AT"/>
+            </w:rPr>
+          </w:pPr>
+          <w:hyperlink w:anchor="_Toc214798876" w:history="1">
+            <w:r>
+              <w:rPr>
+                <w:rStyle w:val="Hyperlink"/>
+                <w:noProof/>
+              </w:rPr>
+              <w:t>Healing Items</w:t>
+            </w:r>
+            <w:r>
+              <w:rPr>
+                <w:noProof/>
+                <w:webHidden/>
+              </w:rPr>
+              <w:tab/>
+            </w:r>
+            <w:r>
+              <w:rPr>
+                <w:noProof/>
+                <w:webHidden/>
+              </w:rPr>
+              <w:fldChar w:fldCharType="begin"/>
+            </w:r>
+            <w:r>
+              <w:rPr>
+                <w:noProof/>
+                <w:webHidden/>
+              </w:rPr>
+              <w:instrText xml:space="preserve"> PAGEREF _Toc214798876 \h </w:instrText>
+            </w:r>
+            <w:r>
+              <w:rPr>
+                <w:noProof/>
+                <w:webHidden/>
+              </w:rPr>
+            </w:r>
+            <w:r>
+              <w:rPr>
+                <w:noProof/>
+                <w:webHidden/>
+              </w:rPr>
+              <w:fldChar w:fldCharType="separate"/>
+            </w:r>
+            <w:r>
+              <w:rPr>
+                <w:noProof/>
+                <w:webHidden/>
+              </w:rPr>
+              <w:t>6</w:t>
+            </w:r>
+            <w:r>
+              <w:rPr>
+                <w:noProof/>
+                <w:webHidden/>
+              </w:rPr>
+              <w:fldChar w:fldCharType="end"/>
+            </w:r>
+          </w:hyperlink>
+        </w:p>
+        <w:p>
+          <w:pPr>
+            <w:pStyle w:val="TOC1"/>
+            <w:tabs>
+              <w:tab w:val="right" w:leader="dot" w:pos="8152"/>
+            </w:tabs>
+            <w:rPr>
+              <w:rFonts w:asciiTheme="minorHAnsi" w:eastAsiaTheme="minorEastAsia" w:hAnsiTheme="minorHAnsi"/>
+              <w:noProof/>
+              <w:lang w:val="en-AT" w:eastAsia="en-AT"/>
+            </w:rPr>
+          </w:pPr>
+          <w:hyperlink w:anchor="_Toc214798877" w:history="1">
+            <w:r>
+              <w:rPr>
+                <w:rStyle w:val="Hyperlink"/>
+                <w:noProof/>
+              </w:rPr>
+              <w:t>Factories</w:t>
+            </w:r>
+            <w:r>
+              <w:rPr>
+                <w:noProof/>
+                <w:webHidden/>
+              </w:rPr>
+              <w:tab/>
+            </w:r>
+            <w:r>
+              <w:rPr>
+                <w:noProof/>
+                <w:webHidden/>
+              </w:rPr>
+              <w:fldChar w:fldCharType="begin"/>
+            </w:r>
+            <w:r>
+              <w:rPr>
+                <w:noProof/>
+                <w:webHidden/>
+              </w:rPr>
+              <w:instrText xml:space="preserve"> PAGEREF _Toc214798877 \h </w:instrText>
+            </w:r>
+            <w:r>
+              <w:rPr>
+                <w:noProof/>
+                <w:webHidden/>
+              </w:rPr>
+            </w:r>
+            <w:r>
+              <w:rPr>
+                <w:noProof/>
+                <w:webHidden/>
+              </w:rPr>
+              <w:fldChar w:fldCharType="separate"/>
+            </w:r>
+            <w:r>
+              <w:rPr>
+                <w:noProof/>
+                <w:webHidden/>
+              </w:rPr>
+              <w:t>7</w:t>
+            </w:r>
+            <w:r>
+              <w:rPr>
+                <w:noProof/>
+                <w:webHidden/>
+              </w:rPr>
+              <w:fldChar w:fldCharType="end"/>
+            </w:r>
+          </w:hyperlink>
+        </w:p>
+        <w:p>
+          <w:pPr>
+            <w:pStyle w:val="TOC1"/>
+            <w:tabs>
+              <w:tab w:val="right" w:leader="dot" w:pos="8152"/>
+            </w:tabs>
+            <w:rPr>
+              <w:rFonts w:asciiTheme="minorHAnsi" w:eastAsiaTheme="minorEastAsia" w:hAnsiTheme="minorHAnsi"/>
+              <w:noProof/>
+              <w:lang w:val="en-AT" w:eastAsia="en-AT"/>
+            </w:rPr>
+          </w:pPr>
+          <w:hyperlink w:anchor="_Toc214798878" w:history="1">
+            <w:r>
+              <w:rPr>
+                <w:rStyle w:val="Hyperlink"/>
+                <w:noProof/>
+              </w:rPr>
+              <w:t>User Interface</w:t>
+            </w:r>
+            <w:r>
+              <w:rPr>
+                <w:noProof/>
+                <w:webHidden/>
+              </w:rPr>
+              <w:tab/>
+            </w:r>
+            <w:r>
+              <w:rPr>
+                <w:noProof/>
+                <w:webHidden/>
+              </w:rPr>
+              <w:fldChar w:fldCharType="begin"/>
+            </w:r>
+            <w:r>
+              <w:rPr>
+                <w:noProof/>
+                <w:webHidden/>
+              </w:rPr>
+              <w:instrText xml:space="preserve"> PAGEREF _Toc214798878 \h </w:instrText>
+            </w:r>
+            <w:r>
+              <w:rPr>
+                <w:noProof/>
+                <w:webHidden/>
+              </w:rPr>
+            </w:r>
+            <w:r>
+              <w:rPr>
+                <w:noProof/>
+                <w:webHidden/>
+              </w:rPr>
+              <w:fldChar w:fldCharType="separate"/>
+            </w:r>
+            <w:r>
+              <w:rPr>
+                <w:noProof/>
+                <w:webHidden/>
+              </w:rPr>
+              <w:t>7</w:t>
+            </w:r>
+            <w:r>
+              <w:rPr>
+                <w:noProof/>
+                <w:webHidden/>
+              </w:rPr>
+              <w:fldChar w:fldCharType="end"/>
+            </w:r>
+          </w:hyperlink>
+        </w:p>
+        <w:p>
+          <w:pPr>
+            <w:pStyle w:val="TOC1"/>
+            <w:tabs>
+              <w:tab w:val="right" w:leader="dot" w:pos="8152"/>
+            </w:tabs>
+            <w:rPr>
+              <w:rFonts w:asciiTheme="minorHAnsi" w:eastAsiaTheme="minorEastAsia" w:hAnsiTheme="minorHAnsi"/>
+              <w:noProof/>
+              <w:lang w:val="en-AT" w:eastAsia="en-AT"/>
+            </w:rPr>
+          </w:pPr>
+          <w:hyperlink w:anchor="_Toc214798879" w:history="1">
+            <w:r>
+              <w:rPr>
+                <w:rStyle w:val="Hyperlink"/>
+                <w:noProof/>
+              </w:rPr>
+              <w:t>Main Menu</w:t>
+            </w:r>
+            <w:r>
+              <w:rPr>
+                <w:noProof/>
+                <w:webHidden/>
+              </w:rPr>
+              <w:tab/>
+            </w:r>
+            <w:r>
+              <w:rPr>
+                <w:noProof/>
+                <w:webHidden/>
+              </w:rPr>
+              <w:fldChar w:fldCharType="begin"/>
+            </w:r>
+            <w:r>
+              <w:rPr>
+                <w:noProof/>
+                <w:webHidden/>
+              </w:rPr>
+              <w:instrText xml:space="preserve"> PAGEREF _Toc214798879 \h </w:instrText>
+            </w:r>
+            <w:r>
+              <w:rPr>
+                <w:noProof/>
+                <w:webHidden/>
+              </w:rPr>
+            </w:r>
+            <w:r>
+              <w:rPr>
+                <w:noProof/>
+                <w:webHidden/>
+              </w:rPr>
+              <w:fldChar w:fldCharType="separate"/>
+            </w:r>
+            <w:r>
+              <w:rPr>
+                <w:noProof/>
+                <w:webHidden/>
+              </w:rPr>
+              <w:t>7</w:t>
+            </w:r>
+            <w:r>
+              <w:rPr>
+                <w:noProof/>
+                <w:webHidden/>
+              </w:rPr>
+              <w:fldChar w:fldCharType="end"/>
+            </w:r>
+          </w:hyperlink>
+        </w:p>
+        <w:p>
+          <w:pPr>
+            <w:pStyle w:val="TOC1"/>
+            <w:tabs>
+              <w:tab w:val="right" w:leader="dot" w:pos="8152"/>
+            </w:tabs>
+            <w:rPr>
+              <w:rFonts w:asciiTheme="minorHAnsi" w:eastAsiaTheme="minorEastAsia" w:hAnsiTheme="minorHAnsi"/>
+              <w:noProof/>
+              <w:lang w:val="en-AT" w:eastAsia="en-AT"/>
+            </w:rPr>
+          </w:pPr>
+          <w:hyperlink w:anchor="_Toc214798880" w:history="1">
+            <w:r>
+              <w:rPr>
+                <w:rStyle w:val="Hyperlink"/>
+                <w:noProof/>
+              </w:rPr>
+              <w:t>Battles</w:t>
+            </w:r>
+            <w:r>
+              <w:rPr>
+                <w:noProof/>
+                <w:webHidden/>
+              </w:rPr>
+              <w:tab/>
+            </w:r>
+            <w:r>
+              <w:rPr>
+                <w:noProof/>
+                <w:webHidden/>
+              </w:rPr>
+              <w:fldChar w:fldCharType="begin"/>
+            </w:r>
+            <w:r>
+              <w:rPr>
+                <w:noProof/>
+                <w:webHidden/>
+              </w:rPr>
+              <w:instrText xml:space="preserve"> PAGEREF _Toc214798880 \h </w:instrText>
+            </w:r>
+            <w:r>
+              <w:rPr>
+                <w:noProof/>
+                <w:webHidden/>
+              </w:rPr>
+            </w:r>
+            <w:r>
+              <w:rPr>
+                <w:noProof/>
+                <w:webHidden/>
+              </w:rPr>
+              <w:fldChar w:fldCharType="separate"/>
+            </w:r>
+            <w:r>
+              <w:rPr>
+                <w:noProof/>
+                <w:webHidden/>
+              </w:rPr>
+              <w:t>7</w:t>
+            </w:r>
+            <w:r>
+              <w:rPr>
+                <w:noProof/>
+                <w:webHidden/>
+              </w:rPr>
+              <w:fldChar w:fldCharType="end"/>
+            </w:r>
+          </w:hyperlink>
+        </w:p>
+        <w:p>
           <w:r>
             <w:rPr>
               <w:b/>
@@ -489,7 +1943,2408 @@
         <w:br w:type="page"/>
       </w:r>
     </w:p>
+    <w:p>
+      <w:pPr>
+        <w:pStyle w:val="Heading1"/>
+      </w:pPr>
+      <w:bookmarkStart w:id="0" w:name="_Toc214798860"/>
+      <w:r>
+        <w:lastRenderedPageBreak/>
+        <w:t>e</w:t>
+      </w:r>
+      <w:r>
+        <w:t>xcidium</w:t>
+      </w:r>
+      <w:bookmarkEnd w:id="0"/>
+    </w:p>
+    <w:p>
+      <w:r>
+        <w:t xml:space="preserve">I had a bit too much fun with this exercise and created an entire playable text-based RPG game! </w:t>
+      </w:r>
+      <w:r>
+        <w:t xml:space="preserve">I’m calling this </w:t>
+      </w:r>
+      <w:r>
+        <w:rPr>
+          <w:rStyle w:val="excidiumChar"/>
+        </w:rPr>
+        <w:t>e</w:t>
+      </w:r>
+      <w:r>
+        <w:rPr>
+          <w:rStyle w:val="excidiumChar"/>
+        </w:rPr>
+        <w:t>xcidium</w:t>
+      </w:r>
+      <w:r>
+        <w:t xml:space="preserve">, Latin for destruction or demise. </w:t>
+      </w:r>
+      <w:r>
+        <w:t xml:space="preserve">In this chapter I want to make a small overview of what </w:t>
+      </w:r>
+      <w:r>
+        <w:rPr>
+          <w:rStyle w:val="excidiumChar"/>
+        </w:rPr>
+        <w:t>excidium</w:t>
+      </w:r>
+      <w:r>
+        <w:rPr>
+          <w:b/>
+          <w:bCs/>
+        </w:rPr>
+        <w:t xml:space="preserve"> </w:t>
+      </w:r>
+      <w:r>
+        <w:t xml:space="preserve">is and how to play it. </w:t>
+      </w:r>
+    </w:p>
+    <w:p>
+      <w:pPr>
+        <w:pStyle w:val="Pseoudocode"/>
+      </w:pPr>
+      <w:r>
+        <w:t xml:space="preserve">                     .__    .___.__               </w:t>
+      </w:r>
+    </w:p>
+    <w:p>
+      <w:pPr>
+        <w:pStyle w:val="Pseoudocode"/>
+      </w:pPr>
+      <w:r>
+        <w:t xml:space="preserve">  ____ ___  ___ ____ |__| __| _/|__|__ __  _____  </w:t>
+      </w:r>
+    </w:p>
+    <w:p>
+      <w:pPr>
+        <w:pStyle w:val="Pseoudocode"/>
+      </w:pPr>
+      <w:r>
+        <w:t xml:space="preserve">_/ __ \\  \/  // ___\|  |/ __ | |  |  |  \/     \ </w:t>
+      </w:r>
+    </w:p>
+    <w:p>
+      <w:pPr>
+        <w:pStyle w:val="Pseoudocode"/>
+      </w:pPr>
+      <w:r>
+        <w:t>\  ___/ &gt;    &lt;\  \___|  / /_/ | |  |  |  /  Y Y  \</w:t>
+      </w:r>
+    </w:p>
+    <w:p>
+      <w:pPr>
+        <w:pStyle w:val="Pseoudocode"/>
+      </w:pPr>
+      <w:r>
+        <w:t xml:space="preserve"> \___  &gt;__/\_ \\___  &gt;__\____ | |__|____/|__|_|  /</w:t>
+      </w:r>
+    </w:p>
+    <w:p>
+      <w:pPr>
+        <w:pStyle w:val="Pseoudocode"/>
+      </w:pPr>
+      <w:r>
+        <w:t xml:space="preserve">     \/      \/    \/        \/                \/ </w:t>
+      </w:r>
+    </w:p>
+    <w:p>
+      <w:pPr>
+        <w:pStyle w:val="Pseoudocode"/>
+      </w:pPr>
+      <w:r>
+        <w:t xml:space="preserve">                                                  </w:t>
+      </w:r>
+    </w:p>
+    <w:p>
+      <w:pPr>
+        <w:pStyle w:val="Pseoudocode"/>
+      </w:pPr>
+    </w:p>
+    <w:p>
+      <w:pPr>
+        <w:pStyle w:val="Pseoudocode"/>
+      </w:pPr>
+      <w:r>
+        <w:t>by Zoe McFife</w:t>
+      </w:r>
+    </w:p>
+    <w:p>
+      <w:pPr>
+        <w:pStyle w:val="Caption"/>
+      </w:pPr>
+      <w:r>
+        <w:t xml:space="preserve">Figure </w:t>
+      </w:r>
+      <w:r>
+        <w:fldChar w:fldCharType="begin"/>
+      </w:r>
+      <w:r>
+        <w:instrText xml:space="preserve"> SEQ Figure \* ARABIC </w:instrText>
+      </w:r>
+      <w:r>
+        <w:fldChar w:fldCharType="separate"/>
+      </w:r>
+      <w:r>
+        <w:rPr>
+          <w:noProof/>
+        </w:rPr>
+        <w:t>1</w:t>
+      </w:r>
+      <w:r>
+        <w:fldChar w:fldCharType="end"/>
+      </w:r>
+      <w:r>
+        <w:t xml:space="preserve">: </w:t>
+      </w:r>
+      <w:r>
+        <w:t>e</w:t>
+      </w:r>
+      <w:r>
+        <w:t>xcidium Logo</w:t>
+      </w:r>
+    </w:p>
+    <w:p>
+      <w:pPr>
+        <w:pStyle w:val="Heading2"/>
+      </w:pPr>
+      <w:bookmarkStart w:id="1" w:name="_Toc214798861"/>
+      <w:r>
+        <w:t>Start of the Game</w:t>
+      </w:r>
+      <w:bookmarkEnd w:id="1"/>
+    </w:p>
+    <w:p>
+      <w:pPr>
+        <w:pStyle w:val="Pseoudocode"/>
+      </w:pPr>
+      <w:r>
+        <w:t xml:space="preserve">                     .__    .___.__               </w:t>
+      </w:r>
+    </w:p>
+    <w:p>
+      <w:pPr>
+        <w:pStyle w:val="Pseoudocode"/>
+      </w:pPr>
+      <w:r>
+        <w:t xml:space="preserve">  ____ ___  ___ ____ |__| __| _/|__|__ __  _____  </w:t>
+      </w:r>
+    </w:p>
+    <w:p>
+      <w:pPr>
+        <w:pStyle w:val="Pseoudocode"/>
+      </w:pPr>
+      <w:r>
+        <w:t xml:space="preserve">_/ __ \\  \/  // ___\|  |/ __ | |  |  |  \/     \ </w:t>
+      </w:r>
+    </w:p>
+    <w:p>
+      <w:pPr>
+        <w:pStyle w:val="Pseoudocode"/>
+      </w:pPr>
+      <w:proofErr w:type="gramStart"/>
+      <w:r>
+        <w:t>\  _</w:t>
+      </w:r>
+      <w:proofErr w:type="gramEnd"/>
+      <w:r>
+        <w:t>__/ &gt;    &lt;</w:t>
+      </w:r>
+      <w:proofErr w:type="gramStart"/>
+      <w:r>
+        <w:t>\  \</w:t>
+      </w:r>
+      <w:proofErr w:type="gramEnd"/>
+      <w:r>
+        <w:t>___</w:t>
+      </w:r>
+      <w:proofErr w:type="gramStart"/>
+      <w:r>
+        <w:t>|  /</w:t>
+      </w:r>
+      <w:proofErr w:type="gramEnd"/>
+      <w:r>
+        <w:t xml:space="preserve"> /_/ | </w:t>
+      </w:r>
+      <w:proofErr w:type="gramStart"/>
+      <w:r>
+        <w:t>|  |</w:t>
+      </w:r>
+      <w:proofErr w:type="gramEnd"/>
+      <w:r>
+        <w:t xml:space="preserve">  </w:t>
+      </w:r>
+      <w:proofErr w:type="gramStart"/>
+      <w:r>
+        <w:t>|  /</w:t>
+      </w:r>
+      <w:proofErr w:type="gramEnd"/>
+      <w:r>
+        <w:t xml:space="preserve">  Y </w:t>
+      </w:r>
+      <w:proofErr w:type="spellStart"/>
+      <w:proofErr w:type="gramStart"/>
+      <w:r>
+        <w:t>Y</w:t>
+      </w:r>
+      <w:proofErr w:type="spellEnd"/>
+      <w:r>
+        <w:t xml:space="preserve">  \</w:t>
+      </w:r>
+      <w:proofErr w:type="gramEnd"/>
+    </w:p>
+    <w:p>
+      <w:pPr>
+        <w:pStyle w:val="Pseoudocode"/>
+      </w:pPr>
+      <w:r>
+        <w:t xml:space="preserve"> \___  &gt;__/\_ \\___  &gt;__\____ | |__|____/|__|_|  /</w:t>
+      </w:r>
+    </w:p>
+    <w:p>
+      <w:pPr>
+        <w:pStyle w:val="Pseoudocode"/>
+      </w:pPr>
+      <w:r>
+        <w:t xml:space="preserve">     \/      \/    \/        \/                \/ </w:t>
+      </w:r>
+    </w:p>
+    <w:p>
+      <w:pPr>
+        <w:pStyle w:val="Pseoudocode"/>
+      </w:pPr>
+      <w:r>
+        <w:t xml:space="preserve">                                                  </w:t>
+      </w:r>
+    </w:p>
+    <w:p>
+      <w:pPr>
+        <w:pStyle w:val="Pseoudocode"/>
+      </w:pPr>
+    </w:p>
+    <w:p>
+      <w:pPr>
+        <w:pStyle w:val="Pseoudocode"/>
+      </w:pPr>
+      <w:proofErr w:type="gramStart"/>
+      <w:r>
+        <w:t>by</w:t>
+      </w:r>
+      <w:proofErr w:type="gramEnd"/>
+      <w:r>
+        <w:t xml:space="preserve"> Zoe McFife</w:t>
+      </w:r>
+    </w:p>
+    <w:p>
+      <w:pPr>
+        <w:pStyle w:val="Pseoudocode"/>
+      </w:pPr>
+    </w:p>
+    <w:p>
+      <w:pPr>
+        <w:pStyle w:val="Pseoudocode"/>
+      </w:pPr>
+      <w:r>
+        <w:t xml:space="preserve">1. </w:t>
+      </w:r>
+      <w:proofErr w:type="spellStart"/>
+      <w:r>
+        <w:t>Create</w:t>
+      </w:r>
+      <w:proofErr w:type="spellEnd"/>
+      <w:r>
+        <w:t xml:space="preserve"> </w:t>
+      </w:r>
+      <w:proofErr w:type="spellStart"/>
+      <w:r>
+        <w:t>Character</w:t>
+      </w:r>
+      <w:proofErr w:type="spellEnd"/>
+    </w:p>
+    <w:p>
+      <w:pPr>
+        <w:pStyle w:val="Pseoudocode"/>
+      </w:pPr>
+      <w:r>
+        <w:t xml:space="preserve">2. </w:t>
+      </w:r>
+      <w:proofErr w:type="spellStart"/>
+      <w:r>
+        <w:t>Choose</w:t>
+      </w:r>
+      <w:proofErr w:type="spellEnd"/>
+      <w:r>
+        <w:t xml:space="preserve"> </w:t>
+      </w:r>
+      <w:proofErr w:type="spellStart"/>
+      <w:r>
+        <w:t>Difficulty</w:t>
+      </w:r>
+      <w:proofErr w:type="spellEnd"/>
+    </w:p>
+    <w:p>
+      <w:pPr>
+        <w:pStyle w:val="Pseoudocode"/>
+      </w:pPr>
+      <w:r>
+        <w:t>3. Start Game</w:t>
+      </w:r>
+    </w:p>
+    <w:p>
+      <w:pPr>
+        <w:pStyle w:val="Pseoudocode"/>
+      </w:pPr>
+      <w:r>
+        <w:t>4. Exit</w:t>
+      </w:r>
+    </w:p>
+    <w:p>
+      <w:pPr>
+        <w:pStyle w:val="Pseoudocode"/>
+      </w:pPr>
+      <w:proofErr w:type="spellStart"/>
+      <w:r>
+        <w:t>Choose</w:t>
+      </w:r>
+      <w:proofErr w:type="spellEnd"/>
+      <w:r>
+        <w:t xml:space="preserve"> an option (1-4)</w:t>
+      </w:r>
+    </w:p>
+    <w:p>
+      <w:pPr>
+        <w:pStyle w:val="Caption"/>
+      </w:pPr>
+      <w:r>
+        <w:t xml:space="preserve">Figure </w:t>
+      </w:r>
+      <w:r>
+        <w:fldChar w:fldCharType="begin"/>
+      </w:r>
+      <w:r>
+        <w:instrText xml:space="preserve"> SEQ Figure \* ARABIC </w:instrText>
+      </w:r>
+      <w:r>
+        <w:fldChar w:fldCharType="separate"/>
+      </w:r>
+      <w:r>
+        <w:rPr>
+          <w:noProof/>
+        </w:rPr>
+        <w:t>2</w:t>
+      </w:r>
+      <w:r>
+        <w:fldChar w:fldCharType="end"/>
+      </w:r>
+      <w:r>
+        <w:t>: excidium main menu</w:t>
+      </w:r>
+    </w:p>
+    <w:p>
+      <w:r>
+        <w:t xml:space="preserve">To start </w:t>
+      </w:r>
+      <w:r>
+        <w:rPr>
+          <w:rStyle w:val="excidiumChar"/>
+        </w:rPr>
+        <w:t>excidium</w:t>
+      </w:r>
+      <w:r>
+        <w:t xml:space="preserve"> the player must first create their character and choose a difficulty. </w:t>
+      </w:r>
+    </w:p>
+    <w:p>
+      <w:pPr>
+        <w:pStyle w:val="Heading3"/>
+      </w:pPr>
+      <w:bookmarkStart w:id="2" w:name="_Toc214798862"/>
+      <w:r>
+        <w:lastRenderedPageBreak/>
+        <w:t>Character Creation</w:t>
+      </w:r>
+      <w:bookmarkEnd w:id="2"/>
+    </w:p>
+    <w:p>
+      <w:pPr>
+        <w:pStyle w:val="Pseoudocode"/>
+      </w:pPr>
+      <w:r>
+        <w:t>=== Character Creator ===</w:t>
+      </w:r>
+    </w:p>
+    <w:p>
+      <w:pPr>
+        <w:pStyle w:val="Pseoudocode"/>
+      </w:pPr>
+    </w:p>
+    <w:p>
+      <w:pPr>
+        <w:pStyle w:val="Pseoudocode"/>
+      </w:pPr>
+    </w:p>
+    <w:p>
+      <w:pPr>
+        <w:pStyle w:val="Pseoudocode"/>
+      </w:pPr>
+      <w:r>
+        <w:t xml:space="preserve">Enter character </w:t>
+      </w:r>
+      <w:proofErr w:type="gramStart"/>
+      <w:r>
+        <w:t>name:</w:t>
+      </w:r>
+      <w:proofErr w:type="gramEnd"/>
+      <w:r>
+        <w:t xml:space="preserve"> </w:t>
+      </w:r>
+      <w:proofErr w:type="spellStart"/>
+      <w:r>
+        <w:rPr>
+          <w:i/>
+          <w:iCs/>
+          <w:color w:val="4EA72E" w:themeColor="accent6"/>
+        </w:rPr>
+        <w:t>Starjumper</w:t>
+      </w:r>
+      <w:proofErr w:type="spellEnd"/>
+    </w:p>
+    <w:p>
+      <w:pPr>
+        <w:pStyle w:val="Pseoudocode"/>
+      </w:pPr>
+    </w:p>
+    <w:p>
+      <w:pPr>
+        <w:pStyle w:val="Pseoudocode"/>
+      </w:pPr>
+      <w:r>
+        <w:t xml:space="preserve">Allocate your skill </w:t>
+      </w:r>
+      <w:proofErr w:type="gramStart"/>
+      <w:r>
+        <w:t>points:</w:t>
+      </w:r>
+      <w:proofErr w:type="gramEnd"/>
+    </w:p>
+    <w:p>
+      <w:pPr>
+        <w:pStyle w:val="Pseoudocode"/>
+      </w:pPr>
+      <w:r>
+        <w:t xml:space="preserve">1. </w:t>
+      </w:r>
+      <w:proofErr w:type="gramStart"/>
+      <w:r>
+        <w:t>Strength:</w:t>
+      </w:r>
+      <w:proofErr w:type="gramEnd"/>
+      <w:r>
+        <w:t xml:space="preserve"> 1</w:t>
+      </w:r>
+    </w:p>
+    <w:p>
+      <w:pPr>
+        <w:pStyle w:val="Pseoudocode"/>
+      </w:pPr>
+      <w:r>
+        <w:t xml:space="preserve">2. </w:t>
+      </w:r>
+      <w:proofErr w:type="gramStart"/>
+      <w:r>
+        <w:t>Dexterity:</w:t>
+      </w:r>
+      <w:proofErr w:type="gramEnd"/>
+      <w:r>
+        <w:t xml:space="preserve"> 1</w:t>
+      </w:r>
+    </w:p>
+    <w:p>
+      <w:pPr>
+        <w:pStyle w:val="Pseoudocode"/>
+      </w:pPr>
+      <w:r>
+        <w:t xml:space="preserve">3. </w:t>
+      </w:r>
+      <w:proofErr w:type="gramStart"/>
+      <w:r>
+        <w:t>Intelligence:</w:t>
+      </w:r>
+      <w:proofErr w:type="gramEnd"/>
+      <w:r>
+        <w:t xml:space="preserve"> 1</w:t>
+      </w:r>
+    </w:p>
+    <w:p>
+      <w:pPr>
+        <w:pStyle w:val="Pseoudocode"/>
+      </w:pPr>
+      <w:r>
+        <w:t xml:space="preserve">Remaining </w:t>
+      </w:r>
+      <w:proofErr w:type="gramStart"/>
+      <w:r>
+        <w:t>Points:</w:t>
+      </w:r>
+      <w:proofErr w:type="gramEnd"/>
+      <w:r>
+        <w:t xml:space="preserve"> 5</w:t>
+      </w:r>
+    </w:p>
+    <w:p>
+      <w:pPr>
+        <w:pStyle w:val="Pseoudocode"/>
+      </w:pPr>
+      <w:r>
+        <w:t xml:space="preserve">Choose a stat to </w:t>
+      </w:r>
+      <w:proofErr w:type="gramStart"/>
+      <w:r>
+        <w:t>increase:</w:t>
+      </w:r>
+      <w:proofErr w:type="gramEnd"/>
+      <w:r>
+        <w:t xml:space="preserve"> (1=STR, 2=DEX, 3=INT)</w:t>
+      </w:r>
+    </w:p>
+    <w:p>
+      <w:pPr>
+        <w:pStyle w:val="Pseoudocode"/>
+      </w:pPr>
+      <w:r>
+        <w:t>&gt;</w:t>
+      </w:r>
+    </w:p>
+    <w:p>
+      <w:r>
+        <w:t xml:space="preserve">The character creator is simple. The player </w:t>
+      </w:r>
+      <w:r>
+        <w:t>must</w:t>
+      </w:r>
+      <w:r>
+        <w:t xml:space="preserve"> name their character and has five skill points available to add to their </w:t>
+      </w:r>
+      <w:r>
+        <w:t>character’s</w:t>
+      </w:r>
+      <w:r>
+        <w:t xml:space="preserve"> strength, dexterity and intelligence. </w:t>
+      </w:r>
+    </w:p>
+    <w:p>
+      <w:r>
+        <w:t xml:space="preserve">Strength increases </w:t>
+      </w:r>
+      <w:r>
+        <w:t xml:space="preserve">damage of physical weapons and increases carry </w:t>
+      </w:r>
+      <w:r>
+        <w:t>capacity;</w:t>
+      </w:r>
+      <w:r>
+        <w:t xml:space="preserve"> dexterity determined dodge change and turn order and intelligence influences the damage of magical weapons. </w:t>
+      </w:r>
+      <w:r>
+        <w:t>All</w:t>
+      </w:r>
+      <w:r>
+        <w:t xml:space="preserve"> these also increase the </w:t>
+      </w:r>
+      <w:r>
+        <w:t>players’</w:t>
+      </w:r>
+      <w:r>
+        <w:t xml:space="preserve"> max health. </w:t>
+      </w:r>
+      <w:r>
+        <w:t xml:space="preserve">Stats will be covered in more detail later. </w:t>
+      </w:r>
+    </w:p>
+    <w:p>
+      <w:r>
+        <w:t>After the stat points have been distributed, the player gets prompted, whether they are satisfied with their character or not.</w:t>
+      </w:r>
+    </w:p>
+    <w:p>
+      <w:pPr>
+        <w:pStyle w:val="Pseoudocode"/>
+      </w:pPr>
+      <w:r>
+        <w:t xml:space="preserve">=== </w:t>
+      </w:r>
+      <w:proofErr w:type="spellStart"/>
+      <w:r>
+        <w:t>Starjumper</w:t>
+      </w:r>
+      <w:proofErr w:type="spellEnd"/>
+      <w:r>
+        <w:t xml:space="preserve"> ===</w:t>
+      </w:r>
+    </w:p>
+    <w:p>
+      <w:pPr>
+        <w:pStyle w:val="Pseoudocode"/>
+      </w:pPr>
+    </w:p>
+    <w:p>
+      <w:pPr>
+        <w:pStyle w:val="Pseoudocode"/>
+      </w:pPr>
+    </w:p>
+    <w:p>
+      <w:pPr>
+        <w:pStyle w:val="Pseoudocode"/>
+      </w:pPr>
+      <w:r>
+        <w:t>== Stats ==</w:t>
+      </w:r>
+    </w:p>
+    <w:p>
+      <w:pPr>
+        <w:pStyle w:val="Pseoudocode"/>
+      </w:pPr>
+    </w:p>
+    <w:p>
+      <w:pPr>
+        <w:pStyle w:val="Pseoudocode"/>
+      </w:pPr>
+      <w:proofErr w:type="gramStart"/>
+      <w:r>
+        <w:t>Health:</w:t>
+      </w:r>
+      <w:proofErr w:type="gramEnd"/>
+      <w:r>
+        <w:t xml:space="preserve"> </w:t>
+      </w:r>
+      <w:r>
+        <w:tab/>
+        <w:t>182.0 / 182.0</w:t>
+      </w:r>
+    </w:p>
+    <w:p>
+      <w:pPr>
+        <w:pStyle w:val="Pseoudocode"/>
+      </w:pPr>
+      <w:proofErr w:type="gramStart"/>
+      <w:r>
+        <w:t>Strength:</w:t>
+      </w:r>
+      <w:proofErr w:type="gramEnd"/>
+      <w:r>
+        <w:t xml:space="preserve"> </w:t>
+      </w:r>
+      <w:r>
+        <w:tab/>
+        <w:t>5</w:t>
+      </w:r>
+    </w:p>
+    <w:p>
+      <w:pPr>
+        <w:pStyle w:val="Pseoudocode"/>
+      </w:pPr>
+      <w:proofErr w:type="gramStart"/>
+      <w:r>
+        <w:t>Dexterity:</w:t>
+      </w:r>
+      <w:proofErr w:type="gramEnd"/>
+      <w:r>
+        <w:t xml:space="preserve"> </w:t>
+      </w:r>
+      <w:r>
+        <w:tab/>
+        <w:t>2</w:t>
+      </w:r>
+    </w:p>
+    <w:p>
+      <w:pPr>
+        <w:pStyle w:val="Pseoudocode"/>
+      </w:pPr>
+      <w:proofErr w:type="gramStart"/>
+      <w:r>
+        <w:t>Intelligence:</w:t>
+      </w:r>
+      <w:proofErr w:type="gramEnd"/>
+      <w:r>
+        <w:t xml:space="preserve"> </w:t>
+      </w:r>
+      <w:r>
+        <w:tab/>
+        <w:t>1</w:t>
+      </w:r>
+    </w:p>
+    <w:p>
+      <w:pPr>
+        <w:pStyle w:val="Pseoudocode"/>
+      </w:pPr>
+      <w:proofErr w:type="gramStart"/>
+      <w:r>
+        <w:t>Status:</w:t>
+      </w:r>
+      <w:proofErr w:type="gramEnd"/>
+      <w:r>
+        <w:t xml:space="preserve"> </w:t>
+      </w:r>
+      <w:r>
+        <w:tab/>
+        <w:t>ALIVE</w:t>
+      </w:r>
+    </w:p>
+    <w:p>
+      <w:pPr>
+        <w:pStyle w:val="Pseoudocode"/>
+      </w:pPr>
+    </w:p>
+    <w:p>
+      <w:pPr>
+        <w:pStyle w:val="Pseoudocode"/>
+      </w:pPr>
+      <w:r>
+        <w:t>== Equipment ==</w:t>
+      </w:r>
+    </w:p>
+    <w:p>
+      <w:pPr>
+        <w:pStyle w:val="Pseoudocode"/>
+      </w:pPr>
+    </w:p>
+    <w:p>
+      <w:pPr>
+        <w:pStyle w:val="Pseoudocode"/>
+      </w:pPr>
+      <w:proofErr w:type="gramStart"/>
+      <w:r>
+        <w:t>Weapon:</w:t>
+      </w:r>
+      <w:proofErr w:type="gramEnd"/>
+      <w:r>
+        <w:t xml:space="preserve"> </w:t>
+      </w:r>
+      <w:r>
+        <w:tab/>
+        <w:t>Fists +14.0 P DMG +16.0</w:t>
+      </w:r>
+    </w:p>
+    <w:p>
+      <w:pPr>
+        <w:pStyle w:val="Pseoudocode"/>
+      </w:pPr>
+      <w:proofErr w:type="gramStart"/>
+      <w:r>
+        <w:t>Name:</w:t>
+      </w:r>
+      <w:proofErr w:type="gramEnd"/>
+      <w:r>
+        <w:tab/>
+        <w:t>Fists</w:t>
+      </w:r>
+    </w:p>
+    <w:p>
+      <w:pPr>
+        <w:pStyle w:val="Pseoudocode"/>
+      </w:pPr>
+      <w:proofErr w:type="gramStart"/>
+      <w:r>
+        <w:t>Weight:</w:t>
+      </w:r>
+      <w:proofErr w:type="gramEnd"/>
+      <w:r>
+        <w:tab/>
+        <w:t>0.0</w:t>
+      </w:r>
+    </w:p>
+    <w:p>
+      <w:pPr>
+        <w:pStyle w:val="Pseoudocode"/>
+      </w:pPr>
+      <w:proofErr w:type="gramStart"/>
+      <w:r>
+        <w:lastRenderedPageBreak/>
+        <w:t>Value:</w:t>
+      </w:r>
+      <w:proofErr w:type="gramEnd"/>
+      <w:r>
+        <w:tab/>
+        <w:t>0.0</w:t>
+      </w:r>
+    </w:p>
+    <w:p>
+      <w:pPr>
+        <w:pStyle w:val="Pseoudocode"/>
+      </w:pPr>
+      <w:proofErr w:type="gramStart"/>
+      <w:r>
+        <w:t>Rarity:</w:t>
+      </w:r>
+      <w:proofErr w:type="gramEnd"/>
+      <w:r>
+        <w:tab/>
+        <w:t>LOW</w:t>
+      </w:r>
+    </w:p>
+    <w:p>
+      <w:pPr>
+        <w:pStyle w:val="Pseoudocode"/>
+      </w:pPr>
+      <w:proofErr w:type="gramStart"/>
+      <w:r>
+        <w:t>Damage:</w:t>
+      </w:r>
+      <w:proofErr w:type="gramEnd"/>
+      <w:r>
+        <w:tab/>
+        <w:t>14.0</w:t>
+      </w:r>
+    </w:p>
+    <w:p>
+      <w:pPr>
+        <w:pStyle w:val="Pseoudocode"/>
+      </w:pPr>
+      <w:r>
+        <w:t xml:space="preserve">Is </w:t>
+      </w:r>
+      <w:proofErr w:type="gramStart"/>
+      <w:r>
+        <w:t>Magic:</w:t>
+      </w:r>
+      <w:proofErr w:type="gramEnd"/>
+      <w:r>
+        <w:tab/>
+        <w:t>false</w:t>
+      </w:r>
+    </w:p>
+    <w:p>
+      <w:pPr>
+        <w:pStyle w:val="Pseoudocode"/>
+      </w:pPr>
+      <w:proofErr w:type="gramStart"/>
+      <w:r>
+        <w:t>Special:</w:t>
+      </w:r>
+      <w:proofErr w:type="gramEnd"/>
+      <w:r>
+        <w:t xml:space="preserve"> Desperate Flurry</w:t>
+      </w:r>
+    </w:p>
+    <w:p>
+      <w:pPr>
+        <w:pStyle w:val="Pseoudocode"/>
+      </w:pPr>
+      <w:r>
+        <w:t xml:space="preserve">Special </w:t>
+      </w:r>
+      <w:proofErr w:type="gramStart"/>
+      <w:r>
+        <w:t>Damage:</w:t>
+      </w:r>
+      <w:proofErr w:type="gramEnd"/>
+      <w:r>
+        <w:tab/>
+        <w:t>16.0</w:t>
+      </w:r>
+    </w:p>
+    <w:p>
+      <w:pPr>
+        <w:pStyle w:val="Pseoudocode"/>
+      </w:pPr>
+      <w:proofErr w:type="gramStart"/>
+      <w:r>
+        <w:t>Armor:</w:t>
+      </w:r>
+      <w:proofErr w:type="gramEnd"/>
+      <w:r>
+        <w:t xml:space="preserve"> </w:t>
+      </w:r>
+      <w:r>
+        <w:tab/>
+        <w:t>Clothes +7.0 DEF (PRISTINE)</w:t>
+      </w:r>
+    </w:p>
+    <w:p>
+      <w:pPr>
+        <w:pStyle w:val="Pseoudocode"/>
+      </w:pPr>
+      <w:proofErr w:type="gramStart"/>
+      <w:r>
+        <w:t>Name:</w:t>
+      </w:r>
+      <w:proofErr w:type="gramEnd"/>
+      <w:r>
+        <w:tab/>
+        <w:t>Clothes</w:t>
+      </w:r>
+    </w:p>
+    <w:p>
+      <w:pPr>
+        <w:pStyle w:val="Pseoudocode"/>
+      </w:pPr>
+      <w:proofErr w:type="gramStart"/>
+      <w:r>
+        <w:t>Weight:</w:t>
+      </w:r>
+      <w:proofErr w:type="gramEnd"/>
+      <w:r>
+        <w:tab/>
+        <w:t>1.0</w:t>
+      </w:r>
+    </w:p>
+    <w:p>
+      <w:pPr>
+        <w:pStyle w:val="Pseoudocode"/>
+      </w:pPr>
+      <w:proofErr w:type="gramStart"/>
+      <w:r>
+        <w:t>Value:</w:t>
+      </w:r>
+      <w:proofErr w:type="gramEnd"/>
+      <w:r>
+        <w:tab/>
+        <w:t>50.0</w:t>
+      </w:r>
+    </w:p>
+    <w:p>
+      <w:pPr>
+        <w:pStyle w:val="Pseoudocode"/>
+      </w:pPr>
+      <w:proofErr w:type="gramStart"/>
+      <w:r>
+        <w:t>Rarity:</w:t>
+      </w:r>
+      <w:proofErr w:type="gramEnd"/>
+      <w:r>
+        <w:tab/>
+        <w:t>LOW</w:t>
+      </w:r>
+    </w:p>
+    <w:p>
+      <w:pPr>
+        <w:pStyle w:val="Pseoudocode"/>
+      </w:pPr>
+      <w:proofErr w:type="gramStart"/>
+      <w:r>
+        <w:t>Defense:</w:t>
+      </w:r>
+      <w:proofErr w:type="gramEnd"/>
+      <w:r>
+        <w:tab/>
+        <w:t>7.0</w:t>
+      </w:r>
+    </w:p>
+    <w:p>
+      <w:pPr>
+        <w:pStyle w:val="Pseoudocode"/>
+      </w:pPr>
+      <w:proofErr w:type="gramStart"/>
+      <w:r>
+        <w:t>Durability:</w:t>
+      </w:r>
+      <w:proofErr w:type="gramEnd"/>
+      <w:r>
+        <w:tab/>
+        <w:t>675.0 / 675.0 (PRISTINE)</w:t>
+      </w:r>
+    </w:p>
+    <w:p>
+      <w:pPr>
+        <w:pStyle w:val="Pseoudocode"/>
+      </w:pPr>
+      <w:proofErr w:type="gramStart"/>
+      <w:r>
+        <w:t>State:</w:t>
+      </w:r>
+      <w:proofErr w:type="gramEnd"/>
+      <w:r>
+        <w:tab/>
+        <w:t>PRISTINE</w:t>
+      </w:r>
+    </w:p>
+    <w:p>
+      <w:pPr>
+        <w:pStyle w:val="Pseoudocode"/>
+      </w:pPr>
+      <w:proofErr w:type="gramStart"/>
+      <w:r>
+        <w:t>Shield:</w:t>
+      </w:r>
+      <w:proofErr w:type="gramEnd"/>
+      <w:r>
+        <w:t xml:space="preserve"> </w:t>
+      </w:r>
+      <w:r>
+        <w:tab/>
+        <w:t>Fists +4.0 DEF</w:t>
+      </w:r>
+    </w:p>
+    <w:p>
+      <w:pPr>
+        <w:pStyle w:val="Pseoudocode"/>
+      </w:pPr>
+      <w:proofErr w:type="gramStart"/>
+      <w:r>
+        <w:t>Name:</w:t>
+      </w:r>
+      <w:proofErr w:type="gramEnd"/>
+      <w:r>
+        <w:tab/>
+        <w:t>Fists</w:t>
+      </w:r>
+    </w:p>
+    <w:p>
+      <w:pPr>
+        <w:pStyle w:val="Pseoudocode"/>
+      </w:pPr>
+      <w:proofErr w:type="gramStart"/>
+      <w:r>
+        <w:t>Weight:</w:t>
+      </w:r>
+      <w:proofErr w:type="gramEnd"/>
+      <w:r>
+        <w:tab/>
+        <w:t>0.0</w:t>
+      </w:r>
+    </w:p>
+    <w:p>
+      <w:pPr>
+        <w:pStyle w:val="Pseoudocode"/>
+      </w:pPr>
+      <w:proofErr w:type="gramStart"/>
+      <w:r>
+        <w:t>Value:</w:t>
+      </w:r>
+      <w:proofErr w:type="gramEnd"/>
+      <w:r>
+        <w:tab/>
+        <w:t>0.0</w:t>
+      </w:r>
+    </w:p>
+    <w:p>
+      <w:pPr>
+        <w:pStyle w:val="Pseoudocode"/>
+      </w:pPr>
+      <w:proofErr w:type="gramStart"/>
+      <w:r>
+        <w:t>Rarity:</w:t>
+      </w:r>
+      <w:proofErr w:type="gramEnd"/>
+      <w:r>
+        <w:tab/>
+        <w:t>LOW</w:t>
+      </w:r>
+    </w:p>
+    <w:p>
+      <w:pPr>
+        <w:pStyle w:val="Pseoudocode"/>
+      </w:pPr>
+      <w:proofErr w:type="gramStart"/>
+      <w:r>
+        <w:t>Defense:</w:t>
+      </w:r>
+      <w:proofErr w:type="gramEnd"/>
+      <w:r>
+        <w:tab/>
+        <w:t>4.0</w:t>
+      </w:r>
+    </w:p>
+    <w:p>
+      <w:pPr>
+        <w:pStyle w:val="Pseoudocode"/>
+      </w:pPr>
+    </w:p>
+    <w:p>
+      <w:pPr>
+        <w:pStyle w:val="Pseoudocode"/>
+      </w:pPr>
+      <w:r>
+        <w:t xml:space="preserve">Are you satisfied with your </w:t>
+      </w:r>
+      <w:proofErr w:type="gramStart"/>
+      <w:r>
+        <w:t>creation?</w:t>
+      </w:r>
+      <w:proofErr w:type="gramEnd"/>
+      <w:r>
+        <w:t xml:space="preserve"> (</w:t>
+      </w:r>
+      <w:proofErr w:type="gramStart"/>
+      <w:r>
+        <w:t>y</w:t>
+      </w:r>
+      <w:proofErr w:type="gramEnd"/>
+      <w:r>
+        <w:t>/n</w:t>
+      </w:r>
+      <w:proofErr w:type="gramStart"/>
+      <w:r>
+        <w:t>):</w:t>
+      </w:r>
+      <w:proofErr w:type="gramEnd"/>
+    </w:p>
+    <w:p>
+      <w:pPr>
+        <w:pStyle w:val="Caption"/>
+      </w:pPr>
+      <w:r>
+        <w:t xml:space="preserve">Figure </w:t>
+      </w:r>
+      <w:r>
+        <w:fldChar w:fldCharType="begin"/>
+      </w:r>
+      <w:r>
+        <w:instrText xml:space="preserve"> SEQ Figure \* ARABIC </w:instrText>
+      </w:r>
+      <w:r>
+        <w:fldChar w:fldCharType="separate"/>
+      </w:r>
+      <w:r>
+        <w:rPr>
+          <w:noProof/>
+        </w:rPr>
+        <w:t>3</w:t>
+      </w:r>
+      <w:r>
+        <w:fldChar w:fldCharType="end"/>
+      </w:r>
+      <w:r>
+        <w:t>: Character creation satisfaction prompt</w:t>
+      </w:r>
+    </w:p>
+    <w:p>
+      <w:pPr>
+        <w:pStyle w:val="Heading3"/>
+      </w:pPr>
+      <w:bookmarkStart w:id="3" w:name="_Toc214798863"/>
+      <w:r>
+        <w:t xml:space="preserve">Difficulty </w:t>
+      </w:r>
+      <w:r>
+        <w:t>S</w:t>
+      </w:r>
+      <w:r>
+        <w:t>election</w:t>
+      </w:r>
+      <w:bookmarkEnd w:id="3"/>
+    </w:p>
+    <w:p>
+      <w:r>
+        <w:rPr>
+          <w:rStyle w:val="excidiumChar"/>
+        </w:rPr>
+        <w:t>excidium</w:t>
+      </w:r>
+      <w:r>
+        <w:t xml:space="preserve"> has three difficulties</w:t>
+      </w:r>
+      <w:r>
+        <w:t>:</w:t>
+      </w:r>
+      <w:r>
+        <w:t xml:space="preserve"> </w:t>
+      </w:r>
+      <w:r>
+        <w:t>easy, medium and hard.</w:t>
+      </w:r>
+      <w:r>
+        <w:t xml:space="preserve"> These determine how fast more difficult battles appear. </w:t>
+      </w:r>
+      <w:r>
+        <w:t xml:space="preserve">I don’t recommend </w:t>
+      </w:r>
+      <w:r>
+        <w:t>playing</w:t>
+      </w:r>
+      <w:r>
+        <w:t xml:space="preserve"> </w:t>
+      </w:r>
+      <w:r>
+        <w:t>with</w:t>
+      </w:r>
+      <w:r>
+        <w:t xml:space="preserve"> </w:t>
+      </w:r>
+      <w:r>
+        <w:t>hard</w:t>
+      </w:r>
+      <w:r>
+        <w:t xml:space="preserve"> difficulty</w:t>
+      </w:r>
+      <w:r>
+        <w:t>.</w:t>
+      </w:r>
+      <w:r>
+        <w:t xml:space="preserve"> </w:t>
+      </w:r>
+    </w:p>
+    <w:p>
+      <w:pPr>
+        <w:pStyle w:val="Pseoudocode"/>
+      </w:pPr>
+      <w:r>
+        <w:t>=== Difficulty Selection ===</w:t>
+      </w:r>
+    </w:p>
+    <w:p>
+      <w:pPr>
+        <w:pStyle w:val="Pseoudocode"/>
+      </w:pPr>
+    </w:p>
+    <w:p>
+      <w:pPr>
+        <w:pStyle w:val="Pseoudocode"/>
+      </w:pPr>
+    </w:p>
+    <w:p>
+      <w:pPr>
+        <w:pStyle w:val="Pseoudocode"/>
+      </w:pPr>
+      <w:proofErr w:type="gramStart"/>
+      <w:r>
+        <w:t>Difficulty:</w:t>
+      </w:r>
+      <w:proofErr w:type="gramEnd"/>
+    </w:p>
+    <w:p>
+      <w:pPr>
+        <w:pStyle w:val="Pseoudocode"/>
+      </w:pPr>
+      <w:r>
+        <w:t xml:space="preserve">1. </w:t>
+      </w:r>
+      <w:proofErr w:type="gramStart"/>
+      <w:r>
+        <w:t>EASY:</w:t>
+      </w:r>
+      <w:proofErr w:type="gramEnd"/>
+      <w:r>
+        <w:t xml:space="preserve"> Smell the flowers.</w:t>
+      </w:r>
+    </w:p>
+    <w:p>
+      <w:pPr>
+        <w:pStyle w:val="Pseoudocode"/>
+      </w:pPr>
+      <w:r>
+        <w:t xml:space="preserve">2. </w:t>
+      </w:r>
+      <w:proofErr w:type="gramStart"/>
+      <w:r>
+        <w:t>MEDIUM:</w:t>
+      </w:r>
+      <w:proofErr w:type="gramEnd"/>
+      <w:r>
+        <w:t xml:space="preserve"> Hold your ground.</w:t>
+      </w:r>
+    </w:p>
+    <w:p>
+      <w:pPr>
+        <w:pStyle w:val="Pseoudocode"/>
+      </w:pPr>
+      <w:r>
+        <w:t xml:space="preserve">3. </w:t>
+      </w:r>
+      <w:proofErr w:type="gramStart"/>
+      <w:r>
+        <w:t>HARD:</w:t>
+      </w:r>
+      <w:proofErr w:type="gramEnd"/>
+      <w:r>
+        <w:t xml:space="preserve"> This will make your life hell.</w:t>
+      </w:r>
+    </w:p>
+    <w:p>
+      <w:pPr>
+        <w:pStyle w:val="Pseoudocode"/>
+      </w:pPr>
+      <w:r>
+        <w:t xml:space="preserve">Choose a stat to </w:t>
+      </w:r>
+      <w:proofErr w:type="gramStart"/>
+      <w:r>
+        <w:t>increase:</w:t>
+      </w:r>
+      <w:proofErr w:type="gramEnd"/>
+      <w:r>
+        <w:t xml:space="preserve"> (1=EASY, 2=MEDIUM, 3=HARD)</w:t>
+      </w:r>
+    </w:p>
+    <w:p>
+      <w:pPr>
+        <w:pStyle w:val="Pseoudocode"/>
+      </w:pPr>
+      <w:r>
+        <w:t>&gt;</w:t>
+      </w:r>
+    </w:p>
+    <w:p>
+      <w:pPr>
+        <w:pStyle w:val="Caption"/>
+      </w:pPr>
+      <w:r>
+        <w:t xml:space="preserve">Figure </w:t>
+      </w:r>
+      <w:r>
+        <w:fldChar w:fldCharType="begin"/>
+      </w:r>
+      <w:r>
+        <w:instrText xml:space="preserve"> SEQ Figure \* ARABIC </w:instrText>
+      </w:r>
+      <w:r>
+        <w:fldChar w:fldCharType="separate"/>
+      </w:r>
+      <w:r>
+        <w:rPr>
+          <w:noProof/>
+        </w:rPr>
+        <w:t>4</w:t>
+      </w:r>
+      <w:r>
+        <w:fldChar w:fldCharType="end"/>
+      </w:r>
+      <w:r>
+        <w:t>: Difficulty Selection</w:t>
+      </w:r>
+    </w:p>
     <w:p/>
+    <w:p>
+      <w:pPr>
+        <w:pStyle w:val="Heading3"/>
+      </w:pPr>
+      <w:bookmarkStart w:id="4" w:name="_Toc214798864"/>
+      <w:r>
+        <w:lastRenderedPageBreak/>
+        <w:t>Playing excidium</w:t>
+      </w:r>
+      <w:bookmarkEnd w:id="4"/>
+    </w:p>
+    <w:p>
+      <w:r>
+        <w:t xml:space="preserve">After having created a character and selected a difficulty, you can select the start option. </w:t>
+      </w:r>
+      <w:r>
+        <w:t>A battle will start.</w:t>
+      </w:r>
+    </w:p>
+    <w:p>
+      <w:pPr>
+        <w:pStyle w:val="Heading2"/>
+      </w:pPr>
+      <w:bookmarkStart w:id="5" w:name="_Toc214798865"/>
+      <w:r>
+        <w:t>Battles</w:t>
+      </w:r>
+      <w:bookmarkEnd w:id="5"/>
+    </w:p>
+    <w:p>
+      <w:pPr>
+        <w:pStyle w:val="Pseoudocode"/>
+      </w:pPr>
+      <w:r>
+        <w:t xml:space="preserve">  ____        _   _   _         _____ _             _   </w:t>
+      </w:r>
+    </w:p>
+    <w:p>
+      <w:pPr>
+        <w:pStyle w:val="Pseoudocode"/>
+      </w:pPr>
+      <w:r>
+        <w:t xml:space="preserve"> |  _ \      | | | | | |       / ____| |           | |  </w:t>
+      </w:r>
+    </w:p>
+    <w:p>
+      <w:pPr>
+        <w:pStyle w:val="Pseoudocode"/>
+      </w:pPr>
+      <w:r>
+        <w:t xml:space="preserve"> | |_) | __ _| |_| |_| | ___  | (___ | |_ __ _ _ __| |_ </w:t>
+      </w:r>
+    </w:p>
+    <w:p>
+      <w:pPr>
+        <w:pStyle w:val="Pseoudocode"/>
+      </w:pPr>
+      <w:r>
+        <w:t xml:space="preserve"> |  _ &lt; / _` | __| __| |/ _ \  \___ \| __/ _` | '__| __|</w:t>
+      </w:r>
+    </w:p>
+    <w:p>
+      <w:pPr>
+        <w:pStyle w:val="Pseoudocode"/>
+      </w:pPr>
+      <w:r>
+        <w:t xml:space="preserve"> | |_) | (_| | |_| |_| |  __/  ____) | || (_| | |  | |_ </w:t>
+      </w:r>
+    </w:p>
+    <w:p>
+      <w:pPr>
+        <w:pStyle w:val="Pseoudocode"/>
+      </w:pPr>
+      <w:r>
+        <w:t xml:space="preserve"> |____/ \_</w:t>
+      </w:r>
+      <w:proofErr w:type="gramStart"/>
+      <w:r>
+        <w:t>_,_</w:t>
+      </w:r>
+      <w:proofErr w:type="gramEnd"/>
+      <w:r>
+        <w:t xml:space="preserve">|\__|\__|_|\___| |_____/ </w:t>
+      </w:r>
+      <w:proofErr w:type="gramStart"/>
+      <w:r>
+        <w:t>\__\__,_</w:t>
+      </w:r>
+      <w:proofErr w:type="gramEnd"/>
+      <w:r>
+        <w:t>|_|   \__|</w:t>
+      </w:r>
+    </w:p>
+    <w:p>
+      <w:pPr>
+        <w:pStyle w:val="Pseoudocode"/>
+      </w:pPr>
+      <w:r>
+        <w:t xml:space="preserve">                                                        </w:t>
+      </w:r>
+    </w:p>
+    <w:p>
+      <w:pPr>
+        <w:pStyle w:val="Pseoudocode"/>
+      </w:pPr>
+      <w:r>
+        <w:t xml:space="preserve">                                                        </w:t>
+      </w:r>
+    </w:p>
+    <w:p>
+      <w:pPr>
+        <w:pStyle w:val="Pseoudocode"/>
+      </w:pPr>
+      <w:r>
+        <w:t xml:space="preserve">Battle 1 </w:t>
+      </w:r>
+      <w:proofErr w:type="gramStart"/>
+      <w:r>
+        <w:t>begins!</w:t>
+      </w:r>
+      <w:proofErr w:type="gramEnd"/>
+    </w:p>
+    <w:p>
+      <w:pPr>
+        <w:pStyle w:val="Pseoudocode"/>
+      </w:pPr>
+      <w:r>
+        <w:t xml:space="preserve">Danger </w:t>
+      </w:r>
+      <w:proofErr w:type="gramStart"/>
+      <w:r>
+        <w:t>Level:</w:t>
+      </w:r>
+      <w:proofErr w:type="gramEnd"/>
+      <w:r>
+        <w:t xml:space="preserve"> HARMLESS</w:t>
+      </w:r>
+    </w:p>
+    <w:p>
+      <w:pPr>
+        <w:pStyle w:val="Pseoudocode"/>
+      </w:pPr>
+    </w:p>
+    <w:p>
+      <w:pPr>
+        <w:pStyle w:val="Pseoudocode"/>
+      </w:pPr>
+      <w:r>
+        <w:t>=== Turn 1 ===</w:t>
+      </w:r>
+    </w:p>
+    <w:p>
+      <w:pPr>
+        <w:pStyle w:val="Pseoudocode"/>
+      </w:pPr>
+    </w:p>
+    <w:p>
+      <w:pPr>
+        <w:pStyle w:val="Pseoudocode"/>
+      </w:pPr>
+      <w:r>
+        <w:t xml:space="preserve">----------------------------------------   </w:t>
+      </w:r>
+    </w:p>
+    <w:p>
+      <w:pPr>
+        <w:pStyle w:val="Pseoudocode"/>
+      </w:pPr>
+      <w:r>
+        <w:t xml:space="preserve">| Abyssal Marauder                     |   </w:t>
+      </w:r>
+    </w:p>
+    <w:p>
+      <w:pPr>
+        <w:pStyle w:val="Pseoudocode"/>
+      </w:pPr>
+      <w:r>
+        <w:t xml:space="preserve">| </w:t>
+      </w:r>
+      <w:proofErr w:type="gramStart"/>
+      <w:r>
+        <w:t>Health:</w:t>
+      </w:r>
+      <w:proofErr w:type="gramEnd"/>
+      <w:r>
+        <w:t xml:space="preserve"> 35 / 35                      |   </w:t>
+      </w:r>
+    </w:p>
+    <w:p>
+      <w:pPr>
+        <w:pStyle w:val="Pseoudocode"/>
+      </w:pPr>
+      <w:r>
+        <w:t xml:space="preserve">| ==================================== |   </w:t>
+      </w:r>
+    </w:p>
+    <w:p>
+      <w:pPr>
+        <w:pStyle w:val="Pseoudocode"/>
+      </w:pPr>
+      <w:r>
+        <w:t xml:space="preserve">| D2, I1, S1                           |   </w:t>
+      </w:r>
+    </w:p>
+    <w:p>
+      <w:pPr>
+        <w:pStyle w:val="Pseoudocode"/>
+      </w:pPr>
+      <w:r>
+        <w:t xml:space="preserve">| </w:t>
+      </w:r>
+      <w:proofErr w:type="gramStart"/>
+      <w:r>
+        <w:t>Attack:</w:t>
+      </w:r>
+      <w:proofErr w:type="gramEnd"/>
+      <w:r>
+        <w:t xml:space="preserve"> 14, </w:t>
+      </w:r>
+      <w:proofErr w:type="gramStart"/>
+      <w:r>
+        <w:t>Defense:</w:t>
+      </w:r>
+      <w:proofErr w:type="gramEnd"/>
+      <w:r>
+        <w:t xml:space="preserve"> 20              |   </w:t>
+      </w:r>
+    </w:p>
+    <w:p>
+      <w:pPr>
+        <w:pStyle w:val="Pseoudocode"/>
+      </w:pPr>
+      <w:r>
+        <w:t>| (</w:t>
+      </w:r>
+      <w:proofErr w:type="gramStart"/>
+      <w:r>
+        <w:t xml:space="preserve">ALIVE)   </w:t>
+      </w:r>
+      <w:proofErr w:type="gramEnd"/>
+      <w:r>
+        <w:t xml:space="preserve">                           |   </w:t>
+      </w:r>
+    </w:p>
+    <w:p>
+      <w:pPr>
+        <w:pStyle w:val="Pseoudocode"/>
+      </w:pPr>
+      <w:r>
+        <w:t xml:space="preserve">----------------------------------------   </w:t>
+      </w:r>
+    </w:p>
+    <w:p>
+      <w:pPr>
+        <w:pStyle w:val="Pseoudocode"/>
+      </w:pPr>
+      <w:r>
+        <w:t>----------------------------------------</w:t>
+      </w:r>
+    </w:p>
+    <w:p>
+      <w:pPr>
+        <w:pStyle w:val="Pseoudocode"/>
+      </w:pPr>
+      <w:r>
+        <w:t xml:space="preserve">| </w:t>
+      </w:r>
+      <w:proofErr w:type="spellStart"/>
+      <w:r>
+        <w:t>Starjumper</w:t>
+      </w:r>
+      <w:proofErr w:type="spellEnd"/>
+      <w:r>
+        <w:t xml:space="preserve">                           |</w:t>
+      </w:r>
+    </w:p>
+    <w:p>
+      <w:pPr>
+        <w:pStyle w:val="Pseoudocode"/>
+      </w:pPr>
+      <w:r>
+        <w:t xml:space="preserve">| </w:t>
+      </w:r>
+      <w:proofErr w:type="gramStart"/>
+      <w:r>
+        <w:t>Health:</w:t>
+      </w:r>
+      <w:proofErr w:type="gramEnd"/>
+      <w:r>
+        <w:t xml:space="preserve"> 182 / 182                    |</w:t>
+      </w:r>
+    </w:p>
+    <w:p>
+      <w:pPr>
+        <w:pStyle w:val="Pseoudocode"/>
+      </w:pPr>
+      <w:r>
+        <w:t>| ==================================== |</w:t>
+      </w:r>
+    </w:p>
+    <w:p>
+      <w:pPr>
+        <w:pStyle w:val="Pseoudocode"/>
+      </w:pPr>
+      <w:r>
+        <w:t>| Level 1 - D2, I1, S5                 |</w:t>
+      </w:r>
+    </w:p>
+    <w:p>
+      <w:pPr>
+        <w:pStyle w:val="Pseoudocode"/>
+      </w:pPr>
+      <w:r>
+        <w:t xml:space="preserve">| </w:t>
+      </w:r>
+      <w:proofErr w:type="gramStart"/>
+      <w:r>
+        <w:t>Attack:</w:t>
+      </w:r>
+      <w:proofErr w:type="gramEnd"/>
+      <w:r>
+        <w:t xml:space="preserve"> 18, </w:t>
+      </w:r>
+      <w:proofErr w:type="gramStart"/>
+      <w:r>
+        <w:t>Defense:</w:t>
+      </w:r>
+      <w:proofErr w:type="gramEnd"/>
+      <w:r>
+        <w:t xml:space="preserve"> 18              |</w:t>
+      </w:r>
+    </w:p>
+    <w:p>
+      <w:pPr>
+        <w:pStyle w:val="Pseoudocode"/>
+      </w:pPr>
+      <w:r>
+        <w:t xml:space="preserve">| </w:t>
+      </w:r>
+      <w:proofErr w:type="spellStart"/>
+      <w:proofErr w:type="gramStart"/>
+      <w:r>
+        <w:t>Armour</w:t>
+      </w:r>
+      <w:proofErr w:type="spellEnd"/>
+      <w:r>
+        <w:t>:</w:t>
+      </w:r>
+      <w:proofErr w:type="gramEnd"/>
+      <w:r>
+        <w:t xml:space="preserve"> PRISTINE                     |</w:t>
+      </w:r>
+    </w:p>
+    <w:p>
+      <w:pPr>
+        <w:pStyle w:val="Pseoudocode"/>
+      </w:pPr>
+      <w:r>
+        <w:t>| (</w:t>
+      </w:r>
+      <w:proofErr w:type="gramStart"/>
+      <w:r>
+        <w:t xml:space="preserve">ALIVE)   </w:t>
+      </w:r>
+      <w:proofErr w:type="gramEnd"/>
+      <w:r>
+        <w:t xml:space="preserve">                           |</w:t>
+      </w:r>
+    </w:p>
+    <w:p>
+      <w:pPr>
+        <w:pStyle w:val="Pseoudocode"/>
+      </w:pPr>
+      <w:r>
+        <w:t>----------------------------------------</w:t>
+      </w:r>
+    </w:p>
+    <w:p>
+      <w:pPr>
+        <w:pStyle w:val="Caption"/>
+      </w:pPr>
+      <w:r>
+        <w:t xml:space="preserve">Figure </w:t>
+      </w:r>
+      <w:r>
+        <w:fldChar w:fldCharType="begin"/>
+      </w:r>
+      <w:r>
+        <w:instrText xml:space="preserve"> SEQ Figure \* ARABIC </w:instrText>
+      </w:r>
+      <w:r>
+        <w:fldChar w:fldCharType="separate"/>
+      </w:r>
+      <w:r>
+        <w:rPr>
+          <w:noProof/>
+        </w:rPr>
+        <w:t>5</w:t>
+      </w:r>
+      <w:r>
+        <w:fldChar w:fldCharType="end"/>
+      </w:r>
+      <w:r>
+        <w:t>: Battle Start</w:t>
+      </w:r>
+    </w:p>
+    <w:p>
+      <w:r>
+        <w:t>Battles range from HARMLESS; MOSTLY HARMLESS, DANGEROUS, EXTREME and DEATH.</w:t>
+      </w:r>
+      <w:r>
+        <w:t xml:space="preserve"> </w:t>
+      </w:r>
+      <w:r>
+        <w:t xml:space="preserve">Each of these difficulties have varied enemy encounters and different loot pools. </w:t>
+      </w:r>
+    </w:p>
+    <w:p>
+      <w:pPr>
+        <w:pStyle w:val="Heading3"/>
+      </w:pPr>
+      <w:bookmarkStart w:id="6" w:name="_Toc214798866"/>
+      <w:r>
+        <w:lastRenderedPageBreak/>
+        <w:t>Turns</w:t>
+      </w:r>
+      <w:bookmarkEnd w:id="6"/>
+    </w:p>
+    <w:p>
+      <w:r>
+        <w:t xml:space="preserve">A turn is separated into multiple passes. </w:t>
+      </w:r>
+      <w:r>
+        <w:t xml:space="preserve">Turn order is determined by each </w:t>
+      </w:r>
+      <w:r>
+        <w:t>character’s</w:t>
+      </w:r>
+      <w:r>
+        <w:t xml:space="preserve"> dexterity stat. The higher the dexterity, the sooner a character has </w:t>
+      </w:r>
+      <w:r>
+        <w:t>its</w:t>
+      </w:r>
+      <w:r>
+        <w:t xml:space="preserve"> </w:t>
+      </w:r>
+      <w:r>
+        <w:t>turn.</w:t>
+      </w:r>
+    </w:p>
+    <w:p>
+      <w:r>
+        <w:t>The first pass is the thinking pass.</w:t>
+      </w:r>
+      <w:r>
+        <w:t xml:space="preserve"> During the thinki</w:t>
+      </w:r>
+      <w:r>
+        <w:t xml:space="preserve">ng pass, each character can determine their next action. </w:t>
+      </w:r>
+      <w:r>
+        <w:t xml:space="preserve">Enemies can ATTACK, DEFEND and HEAL. </w:t>
+      </w:r>
+      <w:r>
+        <w:t xml:space="preserve">The player </w:t>
+      </w:r>
+      <w:r>
+        <w:t>can</w:t>
+      </w:r>
+      <w:r>
+        <w:t xml:space="preserve"> </w:t>
+      </w:r>
+      <w:r>
+        <w:t xml:space="preserve">additionally </w:t>
+      </w:r>
+      <w:r>
+        <w:t>USE ITEMs or USE SPECIAL.</w:t>
+      </w:r>
+      <w:r>
+        <w:t xml:space="preserve"> </w:t>
+      </w:r>
+    </w:p>
+    <w:p>
+      <w:pPr>
+        <w:pStyle w:val="Pseoudocode"/>
+      </w:pPr>
+      <w:r>
+        <w:t xml:space="preserve">Abyssal </w:t>
+      </w:r>
+      <w:r>
+        <w:t>Marauder</w:t>
+      </w:r>
+      <w:r>
+        <w:t xml:space="preserve"> is thinking...</w:t>
+      </w:r>
+    </w:p>
+    <w:p>
+      <w:pPr>
+        <w:pStyle w:val="Pseoudocode"/>
+      </w:pPr>
+    </w:p>
+    <w:p>
+      <w:pPr>
+        <w:pStyle w:val="Pseoudocode"/>
+      </w:pPr>
+      <w:r>
+        <w:t xml:space="preserve">=== Your </w:t>
+      </w:r>
+      <w:proofErr w:type="gramStart"/>
+      <w:r>
+        <w:t>Turn!</w:t>
+      </w:r>
+      <w:proofErr w:type="gramEnd"/>
+      <w:r>
+        <w:t xml:space="preserve"> ===</w:t>
+      </w:r>
+    </w:p>
+    <w:p>
+      <w:pPr>
+        <w:pStyle w:val="Pseoudocode"/>
+      </w:pPr>
+    </w:p>
+    <w:p>
+      <w:pPr>
+        <w:pStyle w:val="Pseoudocode"/>
+      </w:pPr>
+    </w:p>
+    <w:p>
+      <w:pPr>
+        <w:pStyle w:val="Pseoudocode"/>
+      </w:pPr>
+      <w:r>
+        <w:t>== Select an Enemy to Target ==</w:t>
+      </w:r>
+    </w:p>
+    <w:p>
+      <w:pPr>
+        <w:pStyle w:val="Pseoudocode"/>
+      </w:pPr>
+    </w:p>
+    <w:p>
+      <w:pPr>
+        <w:pStyle w:val="Pseoudocode"/>
+      </w:pPr>
+      <w:r>
+        <w:t>1. Abyssal Marauder</w:t>
+      </w:r>
+    </w:p>
+    <w:p>
+      <w:pPr>
+        <w:pStyle w:val="Pseoudocode"/>
+      </w:pPr>
+      <w:r>
+        <w:t>Select an enemy by entering the corresponding number.</w:t>
+      </w:r>
+    </w:p>
+    <w:p>
+      <w:pPr>
+        <w:pStyle w:val="Pseoudocode"/>
+      </w:pPr>
+      <w:r>
+        <w:t>&gt; 1</w:t>
+      </w:r>
+    </w:p>
+    <w:p>
+      <w:pPr>
+        <w:pStyle w:val="Pseoudocode"/>
+      </w:pPr>
+    </w:p>
+    <w:p>
+      <w:pPr>
+        <w:pStyle w:val="Pseoudocode"/>
+      </w:pPr>
+      <w:r>
+        <w:t>== Battle Options ==</w:t>
+      </w:r>
+    </w:p>
+    <w:p>
+      <w:pPr>
+        <w:pStyle w:val="Pseoudocode"/>
+      </w:pPr>
+    </w:p>
+    <w:p>
+      <w:pPr>
+        <w:pStyle w:val="Pseoudocode"/>
+      </w:pPr>
+      <w:r>
+        <w:t xml:space="preserve">Current </w:t>
+      </w:r>
+      <w:proofErr w:type="gramStart"/>
+      <w:r>
+        <w:t>PP:</w:t>
+      </w:r>
+      <w:proofErr w:type="gramEnd"/>
+      <w:r>
+        <w:t xml:space="preserve"> 0/100</w:t>
+      </w:r>
+    </w:p>
+    <w:p>
+      <w:pPr>
+        <w:pStyle w:val="Pseoudocode"/>
+      </w:pPr>
+      <w:r>
+        <w:t>1. Attack</w:t>
+      </w:r>
+    </w:p>
+    <w:p>
+      <w:pPr>
+        <w:pStyle w:val="Pseoudocode"/>
+      </w:pPr>
+      <w:r>
+        <w:t>2. Desperate Flurry (5 PP)</w:t>
+      </w:r>
+    </w:p>
+    <w:p>
+      <w:pPr>
+        <w:pStyle w:val="Pseoudocode"/>
+      </w:pPr>
+      <w:r>
+        <w:t>3. Defend</w:t>
+      </w:r>
+    </w:p>
+    <w:p>
+      <w:pPr>
+        <w:pStyle w:val="Pseoudocode"/>
+      </w:pPr>
+      <w:r>
+        <w:t>4. Use Item</w:t>
+      </w:r>
+    </w:p>
+    <w:p>
+      <w:pPr>
+        <w:pStyle w:val="Pseoudocode"/>
+      </w:pPr>
+      <w:r>
+        <w:t>Select an action by entering the corresponding number.</w:t>
+      </w:r>
+    </w:p>
+    <w:p>
+      <w:pPr>
+        <w:pStyle w:val="Pseoudocode"/>
+      </w:pPr>
+      <w:r>
+        <w:t>&gt;</w:t>
+      </w:r>
+    </w:p>
+    <w:p>
+      <w:pPr>
+        <w:pStyle w:val="Caption"/>
+      </w:pPr>
+      <w:r>
+        <w:t xml:space="preserve">Figure </w:t>
+      </w:r>
+      <w:r>
+        <w:fldChar w:fldCharType="begin"/>
+      </w:r>
+      <w:r>
+        <w:instrText xml:space="preserve"> SEQ Figure \* ARABIC </w:instrText>
+      </w:r>
+      <w:r>
+        <w:fldChar w:fldCharType="separate"/>
+      </w:r>
+      <w:r>
+        <w:rPr>
+          <w:noProof/>
+        </w:rPr>
+        <w:t>6</w:t>
+      </w:r>
+      <w:r>
+        <w:fldChar w:fldCharType="end"/>
+      </w:r>
+      <w:r>
+        <w:t>: Thinking pass</w:t>
+      </w:r>
+    </w:p>
+    <w:p>
+      <w:r>
+        <w:t>An enemy thinking is displayed as “Enemy is thinking…”</w:t>
+      </w:r>
+      <w:r>
+        <w:t>.</w:t>
+      </w:r>
+      <w:r>
+        <w:t xml:space="preserve"> Once it’s the </w:t>
+      </w:r>
+      <w:r>
+        <w:t>players’</w:t>
+      </w:r>
+      <w:r>
+        <w:t xml:space="preserve"> turn to think, they get a battle options menu. </w:t>
+      </w:r>
+      <w:r>
+        <w:t xml:space="preserve">What PP is and what PP attacks are will </w:t>
+      </w:r>
+      <w:r>
+        <w:t>be</w:t>
+      </w:r>
+      <w:r>
+        <w:t xml:space="preserve"> explained later. Let’s just </w:t>
+      </w:r>
+      <w:r>
+        <w:t>defend against</w:t>
+      </w:r>
+      <w:r>
+        <w:t xml:space="preserve"> </w:t>
+      </w:r>
+      <w:r>
+        <w:t xml:space="preserve">the </w:t>
+      </w:r>
+      <w:r>
+        <w:t>Abyssal Marauder</w:t>
+      </w:r>
+      <w:r>
+        <w:t xml:space="preserve"> for now</w:t>
+      </w:r>
+      <w:r>
+        <w:t>.</w:t>
+      </w:r>
+    </w:p>
+    <w:p>
+      <w:pPr>
+        <w:pStyle w:val="Pseoudocode"/>
+      </w:pPr>
+      <w:r>
+        <w:t xml:space="preserve">&gt; </w:t>
+      </w:r>
+      <w:r>
+        <w:rPr>
+          <w:rStyle w:val="PseudocodeInputChar"/>
+        </w:rPr>
+        <w:t>3</w:t>
+      </w:r>
+    </w:p>
+    <w:p>
+      <w:pPr>
+        <w:pStyle w:val="Pseoudocode"/>
+      </w:pPr>
+      <w:r>
+        <w:t xml:space="preserve">You chose to </w:t>
+      </w:r>
+      <w:proofErr w:type="gramStart"/>
+      <w:r>
+        <w:t>Defend!</w:t>
+      </w:r>
+      <w:proofErr w:type="gramEnd"/>
+    </w:p>
+    <w:p>
+      <w:pPr>
+        <w:pStyle w:val="Pseoudocode"/>
+      </w:pPr>
+    </w:p>
+    <w:p>
+      <w:pPr>
+        <w:pStyle w:val="Pseoudocode"/>
+      </w:pPr>
+      <w:proofErr w:type="spellStart"/>
+      <w:r>
+        <w:t>Starjumper</w:t>
+      </w:r>
+      <w:proofErr w:type="spellEnd"/>
+      <w:r>
+        <w:t xml:space="preserve"> is defending for 4.0 </w:t>
+      </w:r>
+      <w:proofErr w:type="gramStart"/>
+      <w:r>
+        <w:t>extra</w:t>
+      </w:r>
+      <w:proofErr w:type="gramEnd"/>
+      <w:r>
+        <w:t xml:space="preserve"> </w:t>
+      </w:r>
+      <w:proofErr w:type="gramStart"/>
+      <w:r>
+        <w:t>defense!</w:t>
+      </w:r>
+      <w:proofErr w:type="gramEnd"/>
+    </w:p>
+    <w:p>
+      <w:pPr>
+        <w:pStyle w:val="Pseoudocode"/>
+      </w:pPr>
+      <w:proofErr w:type="spellStart"/>
+      <w:r>
+        <w:t>Starjumper</w:t>
+      </w:r>
+      <w:proofErr w:type="spellEnd"/>
+      <w:r>
+        <w:t xml:space="preserve"> gained 10 </w:t>
+      </w:r>
+      <w:proofErr w:type="gramStart"/>
+      <w:r>
+        <w:t>PP!</w:t>
+      </w:r>
+      <w:proofErr w:type="gramEnd"/>
+      <w:r>
+        <w:t xml:space="preserve"> (Current </w:t>
+      </w:r>
+      <w:proofErr w:type="gramStart"/>
+      <w:r>
+        <w:t>PP:</w:t>
+      </w:r>
+      <w:proofErr w:type="gramEnd"/>
+      <w:r>
+        <w:t xml:space="preserve"> 20)</w:t>
+      </w:r>
+    </w:p>
+    <w:p>
+      <w:pPr>
+        <w:pStyle w:val="Pseoudocode"/>
+      </w:pPr>
+      <w:r>
+        <w:t xml:space="preserve">Abyssal Marauder attacks </w:t>
+      </w:r>
+      <w:proofErr w:type="spellStart"/>
+      <w:r>
+        <w:t>Starjumper</w:t>
+      </w:r>
+      <w:proofErr w:type="spellEnd"/>
+      <w:r>
+        <w:t xml:space="preserve"> for 14 </w:t>
+      </w:r>
+      <w:proofErr w:type="gramStart"/>
+      <w:r>
+        <w:t>damage!</w:t>
+      </w:r>
+      <w:proofErr w:type="gramEnd"/>
+    </w:p>
+    <w:p>
+      <w:pPr>
+        <w:pStyle w:val="Pseoudocode"/>
+      </w:pPr>
+      <w:proofErr w:type="spellStart"/>
+      <w:r>
+        <w:lastRenderedPageBreak/>
+        <w:t>Starjumper</w:t>
+      </w:r>
+      <w:proofErr w:type="spellEnd"/>
+      <w:r>
+        <w:t xml:space="preserve"> takes 0 </w:t>
+      </w:r>
+      <w:proofErr w:type="gramStart"/>
+      <w:r>
+        <w:t>damage!</w:t>
+      </w:r>
+      <w:proofErr w:type="gramEnd"/>
+    </w:p>
+    <w:p>
+      <w:pPr>
+        <w:pStyle w:val="Pseoudocode"/>
+      </w:pPr>
+      <w:proofErr w:type="spellStart"/>
+      <w:r>
+        <w:t>Starjumper</w:t>
+      </w:r>
+      <w:proofErr w:type="spellEnd"/>
+      <w:r>
+        <w:t xml:space="preserve"> stopped </w:t>
+      </w:r>
+      <w:proofErr w:type="gramStart"/>
+      <w:r>
+        <w:t>defending!</w:t>
+      </w:r>
+      <w:proofErr w:type="gramEnd"/>
+    </w:p>
+    <w:p/>
+    <w:p>
+      <w:pPr>
+        <w:pStyle w:val="Heading1"/>
+      </w:pPr>
+      <w:bookmarkStart w:id="7" w:name="_Toc214798867"/>
+      <w:proofErr w:type="spellStart"/>
+      <w:r>
+        <w:t>GameCharacter</w:t>
+      </w:r>
+      <w:bookmarkEnd w:id="7"/>
+      <w:proofErr w:type="spellEnd"/>
+    </w:p>
+    <w:p>
+      <w:r>
+        <w:t xml:space="preserve">// What </w:t>
+      </w:r>
+      <w:proofErr w:type="gramStart"/>
+      <w:r>
+        <w:t>does</w:t>
+      </w:r>
+      <w:proofErr w:type="gramEnd"/>
+      <w:r>
+        <w:t xml:space="preserve"> game </w:t>
+      </w:r>
+      <w:proofErr w:type="gramStart"/>
+      <w:r>
+        <w:t>character</w:t>
+      </w:r>
+      <w:proofErr w:type="gramEnd"/>
+      <w:r>
+        <w:t xml:space="preserve"> do</w:t>
+      </w:r>
+    </w:p>
+    <w:p>
+      <w:pPr>
+        <w:pStyle w:val="Heading2"/>
+      </w:pPr>
+      <w:bookmarkStart w:id="8" w:name="_Toc214798868"/>
+      <w:r>
+        <w:t>Player</w:t>
+      </w:r>
+      <w:bookmarkEnd w:id="8"/>
+    </w:p>
+    <w:p/>
+    <w:p>
+      <w:pPr>
+        <w:pStyle w:val="Heading2"/>
+      </w:pPr>
+      <w:bookmarkStart w:id="9" w:name="_Toc214798869"/>
+      <w:r>
+        <w:t>Enemy</w:t>
+      </w:r>
+      <w:bookmarkEnd w:id="9"/>
+    </w:p>
+    <w:p/>
+    <w:p>
+      <w:pPr>
+        <w:pStyle w:val="Heading1"/>
+      </w:pPr>
+      <w:bookmarkStart w:id="10" w:name="_Toc214798870"/>
+      <w:proofErr w:type="spellStart"/>
+      <w:proofErr w:type="gramStart"/>
+      <w:r>
+        <w:t>GameManager</w:t>
+      </w:r>
+      <w:bookmarkEnd w:id="10"/>
+      <w:proofErr w:type="spellEnd"/>
+      <w:proofErr w:type="gramEnd"/>
+    </w:p>
+    <w:p>
+      <w:pPr>
+        <w:pStyle w:val="Heading1"/>
+      </w:pPr>
+      <w:bookmarkStart w:id="11" w:name="_Toc214798871"/>
+      <w:r>
+        <w:t>Inventory</w:t>
+      </w:r>
+      <w:bookmarkEnd w:id="11"/>
+    </w:p>
+    <w:p>
+      <w:pPr>
+        <w:pStyle w:val="Heading1"/>
+      </w:pPr>
+      <w:bookmarkStart w:id="12" w:name="_Toc214798872"/>
+      <w:r>
+        <w:t>Items</w:t>
+      </w:r>
+      <w:bookmarkEnd w:id="12"/>
+    </w:p>
+    <w:p>
+      <w:pPr>
+        <w:pStyle w:val="Heading2"/>
+      </w:pPr>
+      <w:bookmarkStart w:id="13" w:name="_Toc214798873"/>
+      <w:r>
+        <w:t>Weapons</w:t>
+      </w:r>
+      <w:bookmarkEnd w:id="13"/>
+    </w:p>
+    <w:p/>
+    <w:p>
+      <w:pPr>
+        <w:pStyle w:val="Heading2"/>
+      </w:pPr>
+      <w:bookmarkStart w:id="14" w:name="_Toc214798874"/>
+      <w:r>
+        <w:t>Shields</w:t>
+      </w:r>
+      <w:bookmarkEnd w:id="14"/>
+    </w:p>
+    <w:p/>
+    <w:p>
+      <w:pPr>
+        <w:pStyle w:val="Heading2"/>
+      </w:pPr>
+      <w:bookmarkStart w:id="15" w:name="_Toc214798875"/>
+      <w:proofErr w:type="spellStart"/>
+      <w:r>
+        <w:t>Armours</w:t>
+      </w:r>
+      <w:bookmarkEnd w:id="15"/>
+      <w:proofErr w:type="spellEnd"/>
+    </w:p>
+    <w:p/>
+    <w:p>
+      <w:pPr>
+        <w:pStyle w:val="Heading2"/>
+      </w:pPr>
+      <w:bookmarkStart w:id="16" w:name="_Toc214798876"/>
+      <w:r>
+        <w:t>Healing Items</w:t>
+      </w:r>
+      <w:bookmarkEnd w:id="16"/>
+    </w:p>
+    <w:p/>
+    <w:p>
+      <w:pPr>
+        <w:pStyle w:val="Heading1"/>
+      </w:pPr>
+      <w:bookmarkStart w:id="17" w:name="_Toc214798877"/>
+      <w:r>
+        <w:lastRenderedPageBreak/>
+        <w:t>Factories</w:t>
+      </w:r>
+      <w:bookmarkEnd w:id="17"/>
+    </w:p>
+    <w:p>
+      <w:pPr>
+        <w:pStyle w:val="Heading1"/>
+      </w:pPr>
+      <w:bookmarkStart w:id="18" w:name="_Toc214798878"/>
+      <w:r>
+        <w:t>User Interface</w:t>
+      </w:r>
+      <w:bookmarkEnd w:id="18"/>
+    </w:p>
+    <w:p>
+      <w:pPr>
+        <w:pStyle w:val="Heading1"/>
+      </w:pPr>
+      <w:bookmarkStart w:id="19" w:name="_Toc214798879"/>
+      <w:r>
+        <w:t>Main Menu</w:t>
+      </w:r>
+      <w:bookmarkEnd w:id="19"/>
+    </w:p>
+    <w:p>
+      <w:pPr>
+        <w:pStyle w:val="Heading1"/>
+      </w:pPr>
+      <w:bookmarkStart w:id="20" w:name="_Toc214798880"/>
+      <w:r>
+        <w:t>Battles</w:t>
+      </w:r>
+      <w:bookmarkEnd w:id="20"/>
+    </w:p>
     <w:sectPr>
       <w:headerReference w:type="default" r:id="rId8"/>
       <w:footerReference w:type="default" r:id="rId9"/>
@@ -1486,7 +5341,6 @@
     <w:next w:val="Normal"/>
     <w:link w:val="Heading3Char"/>
     <w:uiPriority w:val="9"/>
-    <w:semiHidden/>
     <w:unhideWhenUsed/>
     <w:qFormat/>
     <w:rsid w:val="00CB3E76"/>
@@ -1640,7 +5494,6 @@
   <w:style w:type="character" w:default="1" w:styleId="DefaultParagraphFont">
     <w:name w:val="Default Paragraph Font"/>
     <w:uiPriority w:val="1"/>
-    <w:semiHidden/>
     <w:unhideWhenUsed/>
   </w:style>
   <w:style w:type="table" w:default="1" w:styleId="TableNormal">
@@ -1697,7 +5550,6 @@
     <w:basedOn w:val="DefaultParagraphFont"/>
     <w:link w:val="Heading3"/>
     <w:uiPriority w:val="9"/>
-    <w:semiHidden/>
     <w:rsid w:val="00CB3E76"/>
     <w:rPr>
       <w:rFonts w:ascii="Bahnschrift" w:eastAsiaTheme="majorEastAsia" w:hAnsi="Bahnschrift" w:cstheme="majorBidi"/>
@@ -2121,14 +5973,15 @@
     <w:basedOn w:val="Normal"/>
     <w:link w:val="PseoudocodeChar"/>
     <w:qFormat/>
-    <w:rsid w:val="00752A1C"/>
+    <w:rsid w:val="0062102F"/>
     <w:pPr>
       <w:spacing w:before="240" w:after="240"/>
+      <w:ind w:left="720"/>
       <w:contextualSpacing/>
       <w:jc w:val="left"/>
     </w:pPr>
     <w:rPr>
-      <w:rFonts w:ascii="Cascadia Code" w:hAnsi="Cascadia Code"/>
+      <w:rFonts w:ascii="JetBrains Mono" w:hAnsi="JetBrains Mono"/>
       <w:sz w:val="20"/>
       <w:lang w:val="fr-FR"/>
     </w:rPr>
@@ -2137,9 +5990,9 @@
     <w:name w:val="Pseoudocode Char"/>
     <w:basedOn w:val="DefaultParagraphFont"/>
     <w:link w:val="Pseoudocode"/>
-    <w:rsid w:val="00752A1C"/>
+    <w:rsid w:val="0062102F"/>
     <w:rPr>
-      <w:rFonts w:ascii="Cascadia Code" w:hAnsi="Cascadia Code"/>
+      <w:rFonts w:ascii="JetBrains Mono" w:hAnsi="JetBrains Mono"/>
       <w:sz w:val="20"/>
       <w:lang w:val="fr-FR"/>
     </w:rPr>
@@ -2162,6 +6015,70 @@
         <w:insideV w:val="single" w:sz="4" w:space="0" w:color="auto"/>
       </w:tblBorders>
     </w:tblPr>
+  </w:style>
+  <w:style w:type="paragraph" w:customStyle="1" w:styleId="excidium">
+    <w:name w:val="excidium"/>
+    <w:basedOn w:val="Normal"/>
+    <w:link w:val="excidiumChar"/>
+    <w:qFormat/>
+    <w:rsid w:val="00B77AAD"/>
+    <w:rPr>
+      <w:b/>
+      <w:bCs/>
+      <w:color w:val="196B24" w:themeColor="accent3"/>
+    </w:rPr>
+  </w:style>
+  <w:style w:type="character" w:customStyle="1" w:styleId="excidiumChar">
+    <w:name w:val="excidium Char"/>
+    <w:basedOn w:val="DefaultParagraphFont"/>
+    <w:link w:val="excidium"/>
+    <w:rsid w:val="00B77AAD"/>
+    <w:rPr>
+      <w:rFonts w:ascii="Bahnschrift" w:hAnsi="Bahnschrift"/>
+      <w:b/>
+      <w:bCs/>
+      <w:color w:val="196B24" w:themeColor="accent3"/>
+      <w:lang w:val="en-US"/>
+    </w:rPr>
+  </w:style>
+  <w:style w:type="paragraph" w:styleId="TOC3">
+    <w:name w:val="toc 3"/>
+    <w:basedOn w:val="Normal"/>
+    <w:next w:val="Normal"/>
+    <w:autoRedefine/>
+    <w:uiPriority w:val="39"/>
+    <w:unhideWhenUsed/>
+    <w:rsid w:val="001031F9"/>
+    <w:pPr>
+      <w:spacing w:after="100"/>
+      <w:ind w:left="480"/>
+    </w:pPr>
+  </w:style>
+  <w:style w:type="paragraph" w:customStyle="1" w:styleId="PseudocodeInput">
+    <w:name w:val="Pseudocode Input"/>
+    <w:basedOn w:val="Pseoudocode"/>
+    <w:link w:val="PseudocodeInputChar"/>
+    <w:qFormat/>
+    <w:rsid w:val="004F22C2"/>
+    <w:rPr>
+      <w:i/>
+      <w:iCs/>
+      <w:color w:val="4EA72E" w:themeColor="accent6"/>
+    </w:rPr>
+  </w:style>
+  <w:style w:type="character" w:customStyle="1" w:styleId="PseudocodeInputChar">
+    <w:name w:val="Pseudocode Input Char"/>
+    <w:basedOn w:val="PseoudocodeChar"/>
+    <w:link w:val="PseudocodeInput"/>
+    <w:rsid w:val="004F22C2"/>
+    <w:rPr>
+      <w:rFonts w:ascii="JetBrains Mono" w:hAnsi="JetBrains Mono"/>
+      <w:i/>
+      <w:iCs/>
+      <w:color w:val="4EA72E" w:themeColor="accent6"/>
+      <w:sz w:val="20"/>
+      <w:lang w:val="fr-FR"/>
+    </w:rPr>
   </w:style>
 </w:styles>
 </file>

</xml_diff>

<commit_message>
Fix defense check to use isDefending() method
Replaced the direct check of isDefending field with a call to the isDefending() method in getCurrentDefense(). This ensures proper encapsulation and correct behavior when determining if the character is defending.
</commit_message>
<xml_diff>
--- a/Modules/Semester_1/Modern Code/Aufgaben/03_Methods_and_Combat/Protocol.docx
+++ b/Modules/Semester_1/Modern Code/Aufgaben/03_Methods_and_Combat/Protocol.docx
@@ -2615,7 +2615,21 @@
         <w:rPr>
           <w:lang w:val="en-US"/>
         </w:rPr>
-        <w:t>\  ___/ &gt;    &lt;\  \___|  / /_/ | |  |  |  /  Y Y  \</w:t>
+        <w:t xml:space="preserve">\  ___/ &gt;    &lt;\  \___|  / /_/ | |  |  |  /  Y </w:t>
+      </w:r>
+      <w:proofErr w:type="spellStart"/>
+      <w:r>
+        <w:rPr>
+          <w:lang w:val="en-US"/>
+        </w:rPr>
+        <w:t>Y</w:t>
+      </w:r>
+      <w:proofErr w:type="spellEnd"/>
+      <w:r>
+        <w:rPr>
+          <w:lang w:val="en-US"/>
+        </w:rPr>
+        <w:t xml:space="preserve">  \</w:t>
       </w:r>
     </w:p>
     <w:p>
@@ -2794,7 +2808,21 @@
         <w:rPr>
           <w:lang w:val="en-US"/>
         </w:rPr>
-        <w:t>\  ___/ &gt;    &lt;\  \___|  / /_/ | |  |  |  /  Y Y  \</w:t>
+        <w:t xml:space="preserve">\  ___/ &gt;    &lt;\  \___|  / /_/ | |  |  |  /  Y </w:t>
+      </w:r>
+      <w:proofErr w:type="spellStart"/>
+      <w:r>
+        <w:rPr>
+          <w:lang w:val="en-US"/>
+        </w:rPr>
+        <w:t>Y</w:t>
+      </w:r>
+      <w:proofErr w:type="spellEnd"/>
+      <w:r>
+        <w:rPr>
+          <w:lang w:val="en-US"/>
+        </w:rPr>
+        <w:t xml:space="preserve">  \</w:t>
       </w:r>
     </w:p>
     <w:p>
@@ -7030,7 +7058,15 @@
         <w:pStyle w:val="Pseoudocode"/>
       </w:pPr>
       <w:r>
-        <w:t>3: Cute cat bandaid +25.0 HP | Weight: 0.1</w:t>
+        <w:t xml:space="preserve">3: Cute cat </w:t>
+      </w:r>
+      <w:proofErr w:type="spellStart"/>
+      <w:r>
+        <w:t>bandaid</w:t>
+      </w:r>
+      <w:proofErr w:type="spellEnd"/>
+      <w:r>
+        <w:t xml:space="preserve"> +25.0 HP | Weight: 0.1</w:t>
       </w:r>
     </w:p>
     <w:p>
@@ -7055,252 +7091,268 @@
         <w:pStyle w:val="Pseoudocode"/>
       </w:pPr>
       <w:r>
+        <w:t xml:space="preserve">6: Minor Lifeforce Potion +40.0 HP | </w:t>
+      </w:r>
+      <w:proofErr w:type="spellStart"/>
+      <w:r>
+        <w:t>Weight</w:t>
+      </w:r>
+      <w:proofErr w:type="spellEnd"/>
+      <w:r>
+        <w:t>: 1.2</w:t>
+      </w:r>
+    </w:p>
+    <w:p>
+      <w:pPr>
+        <w:pStyle w:val="Caption"/>
+      </w:pPr>
+      <w:r>
+        <w:t xml:space="preserve">Figure </w:t>
+      </w:r>
+      <w:r>
+        <w:fldChar w:fldCharType="begin"/>
+      </w:r>
+      <w:r>
+        <w:instrText xml:space="preserve"> SEQ Figure \* ARABIC </w:instrText>
+      </w:r>
+      <w:r>
+        <w:fldChar w:fldCharType="separate"/>
+      </w:r>
+      <w:r>
+        <w:rPr>
+          <w:noProof/>
+        </w:rPr>
+        <w:t>17</w:t>
+      </w:r>
+      <w:r>
+        <w:fldChar w:fldCharType="end"/>
+      </w:r>
+      <w:r>
+        <w:t>: View Character</w:t>
+      </w:r>
+    </w:p>
+    <w:p/>
+    <w:p>
+      <w:pPr>
+        <w:pStyle w:val="Heading3"/>
+      </w:pPr>
+      <w:bookmarkStart w:id="10" w:name="_Toc214802869"/>
+      <w:r>
+        <w:t>Use Stat Points</w:t>
+      </w:r>
+      <w:bookmarkEnd w:id="10"/>
+    </w:p>
+    <w:p>
+      <w:r>
+        <w:t xml:space="preserve">After leveling up, the player gains a spendable </w:t>
+      </w:r>
+      <w:r>
+        <w:t>skill</w:t>
+      </w:r>
+      <w:r>
+        <w:t xml:space="preserve"> point.</w:t>
+      </w:r>
+    </w:p>
+    <w:p>
+      <w:pPr>
+        <w:pStyle w:val="Pseoudocode"/>
+      </w:pPr>
+      <w:r>
+        <w:t>Allocate your skill points:</w:t>
+      </w:r>
+    </w:p>
+    <w:p>
+      <w:pPr>
+        <w:pStyle w:val="Pseoudocode"/>
+      </w:pPr>
+      <w:r>
+        <w:t>1. Strength: 5</w:t>
+      </w:r>
+    </w:p>
+    <w:p>
+      <w:pPr>
+        <w:pStyle w:val="Pseoudocode"/>
+      </w:pPr>
+      <w:r>
+        <w:t>2. Dexterity: 2</w:t>
+      </w:r>
+    </w:p>
+    <w:p>
+      <w:pPr>
+        <w:pStyle w:val="Pseoudocode"/>
+      </w:pPr>
+      <w:r>
+        <w:t>3. Intelligence: 1</w:t>
+      </w:r>
+    </w:p>
+    <w:p>
+      <w:pPr>
+        <w:pStyle w:val="Pseoudocode"/>
+      </w:pPr>
+      <w:r>
+        <w:t>Remaining Points: 1</w:t>
+      </w:r>
+    </w:p>
+    <w:p>
+      <w:pPr>
+        <w:pStyle w:val="Pseoudocode"/>
+      </w:pPr>
+      <w:r>
+        <w:t>Choose a stat to increase: (1=STR, 2=DEX, 3=INT)</w:t>
+      </w:r>
+    </w:p>
+    <w:p>
+      <w:pPr>
+        <w:pStyle w:val="Pseoudocode"/>
+      </w:pPr>
+      <w:r>
+        <w:t>&gt;</w:t>
+      </w:r>
+    </w:p>
+    <w:p>
+      <w:pPr>
+        <w:pStyle w:val="Caption"/>
+      </w:pPr>
+      <w:r>
+        <w:t xml:space="preserve">Figure </w:t>
+      </w:r>
+      <w:r>
+        <w:fldChar w:fldCharType="begin"/>
+      </w:r>
+      <w:r>
+        <w:instrText xml:space="preserve"> SEQ Figure \* ARABIC </w:instrText>
+      </w:r>
+      <w:r>
+        <w:fldChar w:fldCharType="separate"/>
+      </w:r>
+      <w:r>
+        <w:rPr>
+          <w:noProof/>
+        </w:rPr>
+        <w:t>18</w:t>
+      </w:r>
+      <w:r>
+        <w:fldChar w:fldCharType="end"/>
+      </w:r>
+      <w:r>
+        <w:t>: Allocate skill point</w:t>
+      </w:r>
+    </w:p>
+    <w:p>
+      <w:pPr>
+        <w:pStyle w:val="Heading3"/>
+      </w:pPr>
+      <w:bookmarkStart w:id="11" w:name="_Toc214802870"/>
+      <w:r>
+        <w:t>Item Actions</w:t>
+      </w:r>
+      <w:bookmarkEnd w:id="11"/>
+    </w:p>
+    <w:p>
+      <w:r>
+        <w:t>During rest the player can equip, drop or use items.</w:t>
+      </w:r>
+    </w:p>
+    <w:p>
+      <w:pPr>
+        <w:pStyle w:val="Pseoudocode"/>
+        <w:rPr>
+          <w:rStyle w:val="PseudocodeInputChar"/>
+        </w:rPr>
+      </w:pPr>
+      <w:r>
+        <w:t xml:space="preserve">&gt; </w:t>
+      </w:r>
+      <w:r>
+        <w:rPr>
+          <w:rStyle w:val="PseudocodeInputChar"/>
+        </w:rPr>
+        <w:t>3</w:t>
+      </w:r>
+    </w:p>
+    <w:p>
+      <w:pPr>
+        <w:pStyle w:val="Pseoudocode"/>
+      </w:pPr>
+      <w:r>
+        <w:t>Inventory:</w:t>
+      </w:r>
+    </w:p>
+    <w:p>
+      <w:pPr>
+        <w:pStyle w:val="Pseoudocode"/>
+      </w:pPr>
+      <w:r>
+        <w:t>Weight: 9.9/30.0</w:t>
+      </w:r>
+    </w:p>
+    <w:p>
+      <w:pPr>
+        <w:pStyle w:val="Pseoudocode"/>
+      </w:pPr>
+      <w:r>
+        <w:t>1: Refreshing Decoction +38.0 HP | Weight: 1.2</w:t>
+      </w:r>
+    </w:p>
+    <w:p>
+      <w:pPr>
+        <w:pStyle w:val="Pseoudocode"/>
+      </w:pPr>
+      <w:r>
+        <w:t>2: Stitching Kit +25.0 HP | Weight: 0.9</w:t>
+      </w:r>
+    </w:p>
+    <w:p>
+      <w:pPr>
+        <w:pStyle w:val="Pseoudocode"/>
+      </w:pPr>
+      <w:r>
+        <w:t xml:space="preserve">3: Cute cat </w:t>
+      </w:r>
+      <w:proofErr w:type="spellStart"/>
+      <w:r>
+        <w:t>bandaid</w:t>
+      </w:r>
+      <w:proofErr w:type="spellEnd"/>
+      <w:r>
+        <w:t xml:space="preserve"> +25.0 HP | Weight: 0.1</w:t>
+      </w:r>
+    </w:p>
+    <w:p>
+      <w:pPr>
+        <w:pStyle w:val="Pseoudocode"/>
+      </w:pPr>
+      <w:r>
+        <w:t>4: Rundown Vest +8.9 DEF (PRISTINE) | Weight: 3.5    Compare: +1.9 DEF</w:t>
+      </w:r>
+    </w:p>
+    <w:p>
+      <w:pPr>
+        <w:pStyle w:val="Pseoudocode"/>
+      </w:pPr>
+      <w:r>
+        <w:t>5: Cargo Clamp +7.0 DEF | Weight: 3.0    Compare: +3.0 DEF</w:t>
+      </w:r>
+    </w:p>
+    <w:p>
+      <w:pPr>
+        <w:pStyle w:val="Pseoudocode"/>
+      </w:pPr>
+      <w:r>
         <w:t>6: Minor Lifeforce Potion +40.0 HP | Weight: 1.2</w:t>
       </w:r>
     </w:p>
     <w:p>
       <w:pPr>
-        <w:pStyle w:val="Caption"/>
-      </w:pPr>
-      <w:r>
-        <w:t xml:space="preserve">Figure </w:t>
-      </w:r>
-      <w:r>
-        <w:fldChar w:fldCharType="begin"/>
-      </w:r>
-      <w:r>
-        <w:instrText xml:space="preserve"> SEQ Figure \* ARABIC </w:instrText>
-      </w:r>
-      <w:r>
-        <w:fldChar w:fldCharType="separate"/>
-      </w:r>
-      <w:r>
-        <w:rPr>
-          <w:noProof/>
-        </w:rPr>
-        <w:t>17</w:t>
-      </w:r>
-      <w:r>
-        <w:fldChar w:fldCharType="end"/>
-      </w:r>
-      <w:r>
-        <w:t>: View Character</w:t>
-      </w:r>
-    </w:p>
-    <w:p/>
-    <w:p>
-      <w:pPr>
-        <w:pStyle w:val="Heading3"/>
-      </w:pPr>
-      <w:bookmarkStart w:id="10" w:name="_Toc214802869"/>
-      <w:r>
-        <w:t>Use Stat Points</w:t>
-      </w:r>
-      <w:bookmarkEnd w:id="10"/>
-    </w:p>
-    <w:p>
-      <w:r>
-        <w:t xml:space="preserve">After leveling up, the player gains a spendable </w:t>
-      </w:r>
-      <w:r>
-        <w:t>skill</w:t>
-      </w:r>
-      <w:r>
-        <w:t xml:space="preserve"> point.</w:t>
-      </w:r>
-    </w:p>
-    <w:p>
-      <w:pPr>
-        <w:pStyle w:val="Pseoudocode"/>
-      </w:pPr>
-      <w:r>
-        <w:t>Allocate your skill points:</w:t>
-      </w:r>
-    </w:p>
-    <w:p>
-      <w:pPr>
-        <w:pStyle w:val="Pseoudocode"/>
-      </w:pPr>
-      <w:r>
-        <w:t>1. Strength: 5</w:t>
-      </w:r>
-    </w:p>
-    <w:p>
-      <w:pPr>
-        <w:pStyle w:val="Pseoudocode"/>
-      </w:pPr>
-      <w:r>
-        <w:t>2. Dexterity: 2</w:t>
-      </w:r>
-    </w:p>
-    <w:p>
-      <w:pPr>
-        <w:pStyle w:val="Pseoudocode"/>
-      </w:pPr>
-      <w:r>
-        <w:t>3. Intelligence: 1</w:t>
-      </w:r>
-    </w:p>
-    <w:p>
-      <w:pPr>
-        <w:pStyle w:val="Pseoudocode"/>
-      </w:pPr>
-      <w:r>
-        <w:t>Remaining Points: 1</w:t>
-      </w:r>
-    </w:p>
-    <w:p>
-      <w:pPr>
-        <w:pStyle w:val="Pseoudocode"/>
-      </w:pPr>
-      <w:r>
-        <w:t>Choose a stat to increase: (1=STR, 2=DEX, 3=INT)</w:t>
-      </w:r>
-    </w:p>
-    <w:p>
-      <w:pPr>
-        <w:pStyle w:val="Pseoudocode"/>
-      </w:pPr>
-      <w:r>
-        <w:t>&gt;</w:t>
-      </w:r>
-    </w:p>
-    <w:p>
-      <w:pPr>
-        <w:pStyle w:val="Caption"/>
-      </w:pPr>
-      <w:r>
-        <w:t xml:space="preserve">Figure </w:t>
-      </w:r>
-      <w:r>
-        <w:fldChar w:fldCharType="begin"/>
-      </w:r>
-      <w:r>
-        <w:instrText xml:space="preserve"> SEQ Figure \* ARABIC </w:instrText>
-      </w:r>
-      <w:r>
-        <w:fldChar w:fldCharType="separate"/>
-      </w:r>
-      <w:r>
-        <w:rPr>
-          <w:noProof/>
-        </w:rPr>
-        <w:t>18</w:t>
-      </w:r>
-      <w:r>
-        <w:fldChar w:fldCharType="end"/>
-      </w:r>
-      <w:r>
-        <w:t>: Allocate skill point</w:t>
-      </w:r>
-    </w:p>
-    <w:p>
-      <w:pPr>
-        <w:pStyle w:val="Heading3"/>
-      </w:pPr>
-      <w:bookmarkStart w:id="11" w:name="_Toc214802870"/>
-      <w:r>
-        <w:t>Item Actions</w:t>
-      </w:r>
-      <w:bookmarkEnd w:id="11"/>
-    </w:p>
-    <w:p>
-      <w:r>
-        <w:t>During rest the player can equip, drop or use items.</w:t>
-      </w:r>
-    </w:p>
-    <w:p>
-      <w:pPr>
-        <w:pStyle w:val="Pseoudocode"/>
+        <w:pStyle w:val="Pseoudocode"/>
+      </w:pPr>
+      <w:r>
+        <w:t xml:space="preserve">&gt; </w:t>
+      </w:r>
+      <w:r>
         <w:rPr>
           <w:rStyle w:val="PseudocodeInputChar"/>
         </w:rPr>
-      </w:pPr>
-      <w:r>
-        <w:t xml:space="preserve">&gt; </w:t>
-      </w:r>
-      <w:r>
-        <w:rPr>
-          <w:rStyle w:val="PseudocodeInputChar"/>
-        </w:rPr>
-        <w:t>3</w:t>
-      </w:r>
-    </w:p>
-    <w:p>
-      <w:pPr>
-        <w:pStyle w:val="Pseoudocode"/>
-      </w:pPr>
-      <w:r>
-        <w:t>Inventory:</w:t>
-      </w:r>
-    </w:p>
-    <w:p>
-      <w:pPr>
-        <w:pStyle w:val="Pseoudocode"/>
-      </w:pPr>
-      <w:r>
-        <w:t>Weight: 9.9/30.0</w:t>
-      </w:r>
-    </w:p>
-    <w:p>
-      <w:pPr>
-        <w:pStyle w:val="Pseoudocode"/>
-      </w:pPr>
-      <w:r>
-        <w:t>1: Refreshing Decoction +38.0 HP | Weight: 1.2</w:t>
-      </w:r>
-    </w:p>
-    <w:p>
-      <w:pPr>
-        <w:pStyle w:val="Pseoudocode"/>
-      </w:pPr>
-      <w:r>
-        <w:t>2: Stitching Kit +25.0 HP | Weight: 0.9</w:t>
-      </w:r>
-    </w:p>
-    <w:p>
-      <w:pPr>
-        <w:pStyle w:val="Pseoudocode"/>
-      </w:pPr>
-      <w:r>
-        <w:t>3: Cute cat bandaid +25.0 HP | Weight: 0.1</w:t>
-      </w:r>
-    </w:p>
-    <w:p>
-      <w:pPr>
-        <w:pStyle w:val="Pseoudocode"/>
-      </w:pPr>
-      <w:r>
-        <w:t>4: Rundown Vest +8.9 DEF (PRISTINE) | Weight: 3.5    Compare: +1.9 DEF</w:t>
-      </w:r>
-    </w:p>
-    <w:p>
-      <w:pPr>
-        <w:pStyle w:val="Pseoudocode"/>
-      </w:pPr>
-      <w:r>
-        <w:t>5: Cargo Clamp +7.0 DEF | Weight: 3.0    Compare: +3.0 DEF</w:t>
-      </w:r>
-    </w:p>
-    <w:p>
-      <w:pPr>
-        <w:pStyle w:val="Pseoudocode"/>
-      </w:pPr>
-      <w:r>
-        <w:t>6: Minor Lifeforce Potion +40.0 HP | Weight: 1.2</w:t>
-      </w:r>
-    </w:p>
-    <w:p>
-      <w:pPr>
-        <w:pStyle w:val="Pseoudocode"/>
-      </w:pPr>
-      <w:r>
-        <w:t xml:space="preserve">&gt; </w:t>
-      </w:r>
-      <w:r>
-        <w:rPr>
-          <w:rStyle w:val="PseudocodeInputChar"/>
-        </w:rPr>
         <w:t>4</w:t>
       </w:r>
     </w:p>
@@ -7309,15 +7361,55 @@
         <w:pStyle w:val="Pseoudocode"/>
       </w:pPr>
       <w:r>
-        <w:t>Starjumper obtained Clothes!</w:t>
-      </w:r>
-    </w:p>
-    <w:p>
-      <w:pPr>
-        <w:pStyle w:val="Pseoudocode"/>
-      </w:pPr>
-      <w:r>
-        <w:t>Starjumper equipped Rundown Vest!</w:t>
+        <w:t xml:space="preserve">Starjumper </w:t>
+      </w:r>
+      <w:proofErr w:type="spellStart"/>
+      <w:r>
+        <w:t>obtained</w:t>
+      </w:r>
+      <w:proofErr w:type="spellEnd"/>
+      <w:r>
+        <w:t xml:space="preserve"> </w:t>
+      </w:r>
+      <w:proofErr w:type="spellStart"/>
+      <w:r>
+        <w:t>Clothes</w:t>
+      </w:r>
+      <w:proofErr w:type="spellEnd"/>
+      <w:r>
+        <w:t>!</w:t>
+      </w:r>
+    </w:p>
+    <w:p>
+      <w:pPr>
+        <w:pStyle w:val="Pseoudocode"/>
+      </w:pPr>
+      <w:r>
+        <w:t xml:space="preserve">Starjumper </w:t>
+      </w:r>
+      <w:proofErr w:type="spellStart"/>
+      <w:r>
+        <w:t>equipped</w:t>
+      </w:r>
+      <w:proofErr w:type="spellEnd"/>
+      <w:r>
+        <w:t xml:space="preserve"> </w:t>
+      </w:r>
+      <w:proofErr w:type="spellStart"/>
+      <w:r>
+        <w:t>Rundown</w:t>
+      </w:r>
+      <w:proofErr w:type="spellEnd"/>
+      <w:r>
+        <w:t xml:space="preserve"> </w:t>
+      </w:r>
+      <w:proofErr w:type="spellStart"/>
+      <w:r>
+        <w:t>Vest</w:t>
+      </w:r>
+      <w:proofErr w:type="spellEnd"/>
+      <w:r>
+        <w:t>!</w:t>
       </w:r>
     </w:p>
     <w:p>
@@ -7427,7 +7519,15 @@
         <w:pStyle w:val="Pseoudocode"/>
       </w:pPr>
       <w:r>
-        <w:t>Starjumper takes 19 damage!</w:t>
+        <w:t xml:space="preserve">Starjumper </w:t>
+      </w:r>
+      <w:proofErr w:type="spellStart"/>
+      <w:r>
+        <w:t>takes</w:t>
+      </w:r>
+      <w:proofErr w:type="spellEnd"/>
+      <w:r>
+        <w:t xml:space="preserve"> 19 damage!</w:t>
       </w:r>
     </w:p>
     <w:p>
@@ -7565,7 +7665,15 @@
         <w:pStyle w:val="Pseoudocode"/>
       </w:pPr>
       <w:r>
-        <w:t>\  ___/ &gt;    &lt;\  \___|  / /_/ | |  |  |  /  Y Y  \</w:t>
+        <w:t xml:space="preserve">\  ___/ &gt;    &lt;\  \___|  / /_/ | |  |  |  /  Y </w:t>
+      </w:r>
+      <w:proofErr w:type="spellStart"/>
+      <w:r>
+        <w:t>Y</w:t>
+      </w:r>
+      <w:proofErr w:type="spellEnd"/>
+      <w:r>
+        <w:t xml:space="preserve">  \</w:t>
       </w:r>
     </w:p>
     <w:p>
@@ -7740,15 +7848,25 @@
       <w:pPr>
         <w:pStyle w:val="Heading1"/>
       </w:pPr>
+      <w:proofErr w:type="spellStart"/>
       <w:r>
         <w:lastRenderedPageBreak/>
         <w:t>GameCharacter</w:t>
       </w:r>
       <w:bookmarkEnd w:id="15"/>
-    </w:p>
-    <w:p>
-      <w:r>
-        <w:t>The GameCharacter class represents every character in the game.</w:t>
+      <w:proofErr w:type="spellEnd"/>
+    </w:p>
+    <w:p>
+      <w:r>
+        <w:t xml:space="preserve">The </w:t>
+      </w:r>
+      <w:proofErr w:type="spellStart"/>
+      <w:r>
+        <w:t>GameCharacter</w:t>
+      </w:r>
+      <w:proofErr w:type="spellEnd"/>
+      <w:r>
+        <w:t xml:space="preserve"> class represents every character in the game.</w:t>
       </w:r>
       <w:r>
         <w:t xml:space="preserve"> Due to the shear size of this class, only the most important portions will be covered in this document. Please refer to the source code or the</w:t>
@@ -7757,88 +7875,371 @@
         <w:t xml:space="preserve"> included</w:t>
       </w:r>
       <w:r>
-        <w:t xml:space="preserve"> JavaDoc for all details.</w:t>
-      </w:r>
-    </w:p>
-    <w:p>
-      <w:pPr>
-        <w:pStyle w:val="Pseoudocode"/>
-      </w:pPr>
-      <w:r>
-        <w:t>private String name;</w:t>
+        <w:t xml:space="preserve"> </w:t>
+      </w:r>
+      <w:proofErr w:type="spellStart"/>
+      <w:r>
+        <w:t>JavaDoc</w:t>
+      </w:r>
+      <w:proofErr w:type="spellEnd"/>
+      <w:r>
+        <w:t xml:space="preserve"> for all details.</w:t>
+      </w:r>
+    </w:p>
+    <w:p>
+      <w:pPr>
+        <w:pStyle w:val="Pseoudocode"/>
+      </w:pPr>
+      <w:proofErr w:type="spellStart"/>
+      <w:r>
+        <w:t>private</w:t>
+      </w:r>
+      <w:proofErr w:type="spellEnd"/>
+      <w:r>
+        <w:t xml:space="preserve"> String </w:t>
+      </w:r>
+      <w:proofErr w:type="spellStart"/>
+      <w:r>
+        <w:t>name</w:t>
+      </w:r>
+      <w:proofErr w:type="spellEnd"/>
+      <w:r>
+        <w:t>;</w:t>
       </w:r>
       <w:r>
         <w:br/>
-        <w:t>public ActionType nextAction;</w:t>
+        <w:t xml:space="preserve">public </w:t>
+      </w:r>
+      <w:proofErr w:type="spellStart"/>
+      <w:r>
+        <w:t>ActionType</w:t>
+      </w:r>
+      <w:proofErr w:type="spellEnd"/>
+      <w:r>
+        <w:t xml:space="preserve"> </w:t>
+      </w:r>
+      <w:proofErr w:type="spellStart"/>
+      <w:r>
+        <w:t>nextAction</w:t>
+      </w:r>
+      <w:proofErr w:type="spellEnd"/>
+      <w:r>
+        <w:t>;</w:t>
       </w:r>
       <w:r>
         <w:br/>
       </w:r>
       <w:r>
         <w:br/>
-        <w:t>private double health;</w:t>
+      </w:r>
+      <w:proofErr w:type="spellStart"/>
+      <w:r>
+        <w:t>private</w:t>
+      </w:r>
+      <w:proofErr w:type="spellEnd"/>
+      <w:r>
+        <w:t xml:space="preserve"> double </w:t>
+      </w:r>
+      <w:proofErr w:type="spellStart"/>
+      <w:r>
+        <w:t>health</w:t>
+      </w:r>
+      <w:proofErr w:type="spellEnd"/>
+      <w:r>
+        <w:t>;</w:t>
       </w:r>
       <w:r>
         <w:br/>
-        <w:t>private double maxHealth;</w:t>
+      </w:r>
+      <w:proofErr w:type="spellStart"/>
+      <w:r>
+        <w:t>private</w:t>
+      </w:r>
+      <w:proofErr w:type="spellEnd"/>
+      <w:r>
+        <w:t xml:space="preserve"> double </w:t>
+      </w:r>
+      <w:proofErr w:type="spellStart"/>
+      <w:r>
+        <w:t>maxHealth</w:t>
+      </w:r>
+      <w:proofErr w:type="spellEnd"/>
+      <w:r>
+        <w:t>;</w:t>
       </w:r>
       <w:r>
         <w:br/>
       </w:r>
       <w:r>
         <w:br/>
-        <w:t>private int strength;</w:t>
+      </w:r>
+      <w:proofErr w:type="spellStart"/>
+      <w:r>
+        <w:t>private</w:t>
+      </w:r>
+      <w:proofErr w:type="spellEnd"/>
+      <w:r>
+        <w:t xml:space="preserve"> </w:t>
+      </w:r>
+      <w:proofErr w:type="spellStart"/>
+      <w:r>
+        <w:t>int</w:t>
+      </w:r>
+      <w:proofErr w:type="spellEnd"/>
+      <w:r>
+        <w:t xml:space="preserve"> </w:t>
+      </w:r>
+      <w:proofErr w:type="spellStart"/>
+      <w:r>
+        <w:t>strength</w:t>
+      </w:r>
+      <w:proofErr w:type="spellEnd"/>
+      <w:r>
+        <w:t>;</w:t>
       </w:r>
       <w:r>
         <w:br/>
-        <w:t>private int dexterity;</w:t>
+      </w:r>
+      <w:proofErr w:type="spellStart"/>
+      <w:r>
+        <w:t>private</w:t>
+      </w:r>
+      <w:proofErr w:type="spellEnd"/>
+      <w:r>
+        <w:t xml:space="preserve"> </w:t>
+      </w:r>
+      <w:proofErr w:type="spellStart"/>
+      <w:r>
+        <w:t>int</w:t>
+      </w:r>
+      <w:proofErr w:type="spellEnd"/>
+      <w:r>
+        <w:t xml:space="preserve"> </w:t>
+      </w:r>
+      <w:proofErr w:type="spellStart"/>
+      <w:r>
+        <w:t>dexterity</w:t>
+      </w:r>
+      <w:proofErr w:type="spellEnd"/>
+      <w:r>
+        <w:t>;</w:t>
       </w:r>
       <w:r>
         <w:br/>
-        <w:t>private int intelligence;</w:t>
+      </w:r>
+      <w:proofErr w:type="spellStart"/>
+      <w:r>
+        <w:t>private</w:t>
+      </w:r>
+      <w:proofErr w:type="spellEnd"/>
+      <w:r>
+        <w:t xml:space="preserve"> </w:t>
+      </w:r>
+      <w:proofErr w:type="spellStart"/>
+      <w:r>
+        <w:t>int</w:t>
+      </w:r>
+      <w:proofErr w:type="spellEnd"/>
+      <w:r>
+        <w:t xml:space="preserve"> intelligence;</w:t>
       </w:r>
       <w:r>
         <w:br/>
       </w:r>
       <w:r>
         <w:br/>
-        <w:t>public static final int MIN_STAT_VALUE = 1;</w:t>
+        <w:t xml:space="preserve">public </w:t>
+      </w:r>
+      <w:proofErr w:type="spellStart"/>
+      <w:r>
+        <w:t>static</w:t>
+      </w:r>
+      <w:proofErr w:type="spellEnd"/>
+      <w:r>
+        <w:t xml:space="preserve"> final </w:t>
+      </w:r>
+      <w:proofErr w:type="spellStart"/>
+      <w:r>
+        <w:t>int</w:t>
+      </w:r>
+      <w:proofErr w:type="spellEnd"/>
+      <w:r>
+        <w:t xml:space="preserve"> MIN_STAT_VALUE = 1;</w:t>
       </w:r>
       <w:r>
         <w:br/>
       </w:r>
       <w:r>
         <w:br/>
-        <w:t>public static final int MAX_STAT_VALUE = 10;</w:t>
+        <w:t xml:space="preserve">public </w:t>
+      </w:r>
+      <w:proofErr w:type="spellStart"/>
+      <w:r>
+        <w:t>static</w:t>
+      </w:r>
+      <w:proofErr w:type="spellEnd"/>
+      <w:r>
+        <w:t xml:space="preserve"> final </w:t>
+      </w:r>
+      <w:proofErr w:type="spellStart"/>
+      <w:r>
+        <w:t>int</w:t>
+      </w:r>
+      <w:proofErr w:type="spellEnd"/>
+      <w:r>
+        <w:t xml:space="preserve"> MAX_STAT_VALUE = 10;</w:t>
       </w:r>
       <w:r>
         <w:br/>
       </w:r>
       <w:r>
         <w:br/>
-        <w:t>private Weapon equippedWeapon = WeaponFactory.createBaseWeapon();</w:t>
+      </w:r>
+      <w:proofErr w:type="spellStart"/>
+      <w:r>
+        <w:t>private</w:t>
+      </w:r>
+      <w:proofErr w:type="spellEnd"/>
+      <w:r>
+        <w:t xml:space="preserve"> </w:t>
+      </w:r>
+      <w:proofErr w:type="spellStart"/>
+      <w:r>
+        <w:t>Weapon</w:t>
+      </w:r>
+      <w:proofErr w:type="spellEnd"/>
+      <w:r>
+        <w:t xml:space="preserve"> </w:t>
+      </w:r>
+      <w:proofErr w:type="spellStart"/>
+      <w:r>
+        <w:t>equippedWeapon</w:t>
+      </w:r>
+      <w:proofErr w:type="spellEnd"/>
+      <w:r>
+        <w:t xml:space="preserve"> = </w:t>
+      </w:r>
+      <w:proofErr w:type="spellStart"/>
+      <w:r>
+        <w:t>WeaponFactory.createBaseWeapon</w:t>
+      </w:r>
+      <w:proofErr w:type="spellEnd"/>
+      <w:r>
+        <w:t>();</w:t>
       </w:r>
       <w:r>
         <w:br/>
-        <w:t>private Shield equippedShield = ShieldFactory.createBaseShield();</w:t>
+      </w:r>
+      <w:proofErr w:type="spellStart"/>
+      <w:r>
+        <w:t>private</w:t>
+      </w:r>
+      <w:proofErr w:type="spellEnd"/>
+      <w:r>
+        <w:t xml:space="preserve"> Shield </w:t>
+      </w:r>
+      <w:proofErr w:type="spellStart"/>
+      <w:r>
+        <w:t>equippedShield</w:t>
+      </w:r>
+      <w:proofErr w:type="spellEnd"/>
+      <w:r>
+        <w:t xml:space="preserve"> = </w:t>
+      </w:r>
+      <w:proofErr w:type="spellStart"/>
+      <w:r>
+        <w:t>ShieldFactory.createBaseShield</w:t>
+      </w:r>
+      <w:proofErr w:type="spellEnd"/>
+      <w:r>
+        <w:t>();</w:t>
       </w:r>
       <w:r>
         <w:br/>
-        <w:t>private Armour equippedArmour = ArmourFactory.createBaseArmour();</w:t>
+      </w:r>
+      <w:proofErr w:type="spellStart"/>
+      <w:r>
+        <w:t>private</w:t>
+      </w:r>
+      <w:proofErr w:type="spellEnd"/>
+      <w:r>
+        <w:t xml:space="preserve"> Armour </w:t>
+      </w:r>
+      <w:proofErr w:type="spellStart"/>
+      <w:r>
+        <w:t>equippedArmour</w:t>
+      </w:r>
+      <w:proofErr w:type="spellEnd"/>
+      <w:r>
+        <w:t xml:space="preserve"> = </w:t>
+      </w:r>
+      <w:proofErr w:type="spellStart"/>
+      <w:r>
+        <w:t>ArmourFactory.createBaseArmour</w:t>
+      </w:r>
+      <w:proofErr w:type="spellEnd"/>
+      <w:r>
+        <w:t>();</w:t>
       </w:r>
       <w:r>
         <w:br/>
       </w:r>
       <w:r>
         <w:br/>
-        <w:t>private boolean isDefending = false;</w:t>
+      </w:r>
+      <w:proofErr w:type="spellStart"/>
+      <w:r>
+        <w:t>private</w:t>
+      </w:r>
+      <w:proofErr w:type="spellEnd"/>
+      <w:r>
+        <w:t xml:space="preserve"> </w:t>
+      </w:r>
+      <w:proofErr w:type="spellStart"/>
+      <w:r>
+        <w:t>boolean</w:t>
+      </w:r>
+      <w:proofErr w:type="spellEnd"/>
+      <w:r>
+        <w:t xml:space="preserve"> </w:t>
+      </w:r>
+      <w:proofErr w:type="spellStart"/>
+      <w:r>
+        <w:t>isDefending</w:t>
+      </w:r>
+      <w:proofErr w:type="spellEnd"/>
+      <w:r>
+        <w:t xml:space="preserve"> = false;</w:t>
       </w:r>
       <w:r>
         <w:br/>
       </w:r>
       <w:r>
         <w:br/>
-        <w:t>private final Inventory inventory = new Inventory(this);</w:t>
+      </w:r>
+      <w:proofErr w:type="spellStart"/>
+      <w:r>
+        <w:t>private</w:t>
+      </w:r>
+      <w:proofErr w:type="spellEnd"/>
+      <w:r>
+        <w:t xml:space="preserve"> final Inventory </w:t>
+      </w:r>
+      <w:proofErr w:type="spellStart"/>
+      <w:r>
+        <w:t>inventory</w:t>
+      </w:r>
+      <w:proofErr w:type="spellEnd"/>
+      <w:r>
+        <w:t xml:space="preserve"> = new Inventory(</w:t>
+      </w:r>
+      <w:proofErr w:type="spellStart"/>
+      <w:r>
+        <w:t>this</w:t>
+      </w:r>
+      <w:proofErr w:type="spellEnd"/>
+      <w:r>
+        <w:t>);</w:t>
       </w:r>
     </w:p>
     <w:p>
@@ -7867,7 +8268,15 @@
         <w:fldChar w:fldCharType="end"/>
       </w:r>
       <w:r>
-        <w:t>: GameCharacter Fields</w:t>
+        <w:t xml:space="preserve">: </w:t>
+      </w:r>
+      <w:proofErr w:type="spellStart"/>
+      <w:r>
+        <w:t>GameCharacter</w:t>
+      </w:r>
+      <w:proofErr w:type="spellEnd"/>
+      <w:r>
+        <w:t xml:space="preserve"> Fields</w:t>
       </w:r>
     </w:p>
     <w:p>
@@ -7916,11 +8325,19 @@
           <w:lang w:val="en-AT"/>
         </w:rPr>
       </w:pPr>
+      <w:proofErr w:type="spellStart"/>
       <w:r>
         <w:rPr>
           <w:lang w:val="en-AT"/>
         </w:rPr>
-        <w:t>GameCharacter handles all combat actions like attacking or defending.</w:t>
+        <w:t>GameCharacter</w:t>
+      </w:r>
+      <w:proofErr w:type="spellEnd"/>
+      <w:r>
+        <w:rPr>
+          <w:lang w:val="en-AT"/>
+        </w:rPr>
+        <w:t xml:space="preserve"> handles all combat actions like attacking or defending.</w:t>
       </w:r>
     </w:p>
     <w:p>
@@ -7965,19 +8382,89 @@
         <w:rPr>
           <w:lang w:val="en-AT"/>
         </w:rPr>
-        <w:t xml:space="preserve"> method gets a GameCharacter as its target. </w:t>
-      </w:r>
+        <w:t xml:space="preserve"> method gets a </w:t>
+      </w:r>
+      <w:proofErr w:type="spellStart"/>
       <w:r>
         <w:rPr>
           <w:lang w:val="en-AT"/>
         </w:rPr>
-        <w:t xml:space="preserve">It calls the the takeDamage() method on the target. </w:t>
-      </w:r>
+        <w:t>GameCharacter</w:t>
+      </w:r>
+      <w:proofErr w:type="spellEnd"/>
       <w:r>
         <w:rPr>
           <w:lang w:val="en-AT"/>
         </w:rPr>
-        <w:t>If the GameCharacter is a player, it also calls the gainPP method.</w:t>
+        <w:t xml:space="preserve"> as its target. </w:t>
+      </w:r>
+      <w:r>
+        <w:rPr>
+          <w:lang w:val="en-AT"/>
+        </w:rPr>
+        <w:t xml:space="preserve">It calls the </w:t>
+      </w:r>
+      <w:proofErr w:type="spellStart"/>
+      <w:r>
+        <w:rPr>
+          <w:lang w:val="en-AT"/>
+        </w:rPr>
+        <w:t>the</w:t>
+      </w:r>
+      <w:proofErr w:type="spellEnd"/>
+      <w:r>
+        <w:rPr>
+          <w:lang w:val="en-AT"/>
+        </w:rPr>
+        <w:t xml:space="preserve"> </w:t>
+      </w:r>
+      <w:proofErr w:type="spellStart"/>
+      <w:r>
+        <w:rPr>
+          <w:lang w:val="en-AT"/>
+        </w:rPr>
+        <w:t>takeDamage</w:t>
+      </w:r>
+      <w:proofErr w:type="spellEnd"/>
+      <w:r>
+        <w:rPr>
+          <w:lang w:val="en-AT"/>
+        </w:rPr>
+        <w:t xml:space="preserve">() method on the target. </w:t>
+      </w:r>
+      <w:r>
+        <w:rPr>
+          <w:lang w:val="en-AT"/>
+        </w:rPr>
+        <w:t xml:space="preserve">If the </w:t>
+      </w:r>
+      <w:proofErr w:type="spellStart"/>
+      <w:r>
+        <w:rPr>
+          <w:lang w:val="en-AT"/>
+        </w:rPr>
+        <w:t>GameCharacter</w:t>
+      </w:r>
+      <w:proofErr w:type="spellEnd"/>
+      <w:r>
+        <w:rPr>
+          <w:lang w:val="en-AT"/>
+        </w:rPr>
+        <w:t xml:space="preserve"> is a player, it also calls the </w:t>
+      </w:r>
+      <w:proofErr w:type="spellStart"/>
+      <w:r>
+        <w:rPr>
+          <w:lang w:val="en-AT"/>
+        </w:rPr>
+        <w:t>gainPP</w:t>
+      </w:r>
+      <w:proofErr w:type="spellEnd"/>
+      <w:r>
+        <w:rPr>
+          <w:lang w:val="en-AT"/>
+        </w:rPr>
+        <w:t xml:space="preserve"> method.</w:t>
       </w:r>
     </w:p>
     <w:p>
@@ -8009,7 +8496,23 @@
       </w:r>
       <w:r>
         <w:br/>
-        <w:t>public void attack(GameCharacter target)</w:t>
+        <w:t xml:space="preserve">public void </w:t>
+      </w:r>
+      <w:proofErr w:type="spellStart"/>
+      <w:r>
+        <w:t>attack</w:t>
+      </w:r>
+      <w:proofErr w:type="spellEnd"/>
+      <w:r>
+        <w:t>(</w:t>
+      </w:r>
+      <w:proofErr w:type="spellStart"/>
+      <w:r>
+        <w:t>GameCharacter</w:t>
+      </w:r>
+      <w:proofErr w:type="spellEnd"/>
+      <w:r>
+        <w:t xml:space="preserve"> target)</w:t>
       </w:r>
       <w:r>
         <w:br/>
@@ -8017,7 +8520,15 @@
       </w:r>
       <w:r>
         <w:br/>
-        <w:t xml:space="preserve">    if (!target.isAlive())</w:t>
+        <w:t xml:space="preserve">    if (!</w:t>
+      </w:r>
+      <w:proofErr w:type="spellStart"/>
+      <w:r>
+        <w:t>target.isAlive</w:t>
+      </w:r>
+      <w:proofErr w:type="spellEnd"/>
+      <w:r>
+        <w:t>())</w:t>
       </w:r>
       <w:r>
         <w:br/>
@@ -8036,7 +8547,15 @@
       </w:r>
       <w:r>
         <w:br/>
-        <w:t xml:space="preserve">    if (this instanceof Player player)</w:t>
+        <w:t xml:space="preserve">    if (this </w:t>
+      </w:r>
+      <w:proofErr w:type="spellStart"/>
+      <w:r>
+        <w:t>instanceof</w:t>
+      </w:r>
+      <w:proofErr w:type="spellEnd"/>
+      <w:r>
+        <w:t xml:space="preserve"> Player player)</w:t>
       </w:r>
       <w:r>
         <w:br/>
@@ -8044,7 +8563,23 @@
       </w:r>
       <w:r>
         <w:br/>
-        <w:t xml:space="preserve">        player.gainPP(equippedWeapon.getPpGainPerUse());</w:t>
+        <w:t xml:space="preserve">        </w:t>
+      </w:r>
+      <w:proofErr w:type="spellStart"/>
+      <w:r>
+        <w:t>player.gainPP</w:t>
+      </w:r>
+      <w:proofErr w:type="spellEnd"/>
+      <w:r>
+        <w:t>(</w:t>
+      </w:r>
+      <w:proofErr w:type="spellStart"/>
+      <w:r>
+        <w:t>equippedWeapon.getPpGainPerUse</w:t>
+      </w:r>
+      <w:proofErr w:type="spellEnd"/>
+      <w:r>
+        <w:t>());</w:t>
       </w:r>
       <w:r>
         <w:br/>
@@ -8055,11 +8590,67 @@
       </w:r>
       <w:r>
         <w:br/>
-        <w:t xml:space="preserve">    IO.println(getName() + " attacks " + target.getName() + " for " + Math.round(getDamage()) + " damage!");</w:t>
+        <w:t xml:space="preserve">    </w:t>
+      </w:r>
+      <w:proofErr w:type="spellStart"/>
+      <w:r>
+        <w:t>IO.println</w:t>
+      </w:r>
+      <w:proofErr w:type="spellEnd"/>
+      <w:r>
+        <w:t>(</w:t>
+      </w:r>
+      <w:proofErr w:type="spellStart"/>
+      <w:r>
+        <w:t>getName</w:t>
+      </w:r>
+      <w:proofErr w:type="spellEnd"/>
+      <w:r>
+        <w:t xml:space="preserve">() + " attacks " + </w:t>
+      </w:r>
+      <w:proofErr w:type="spellStart"/>
+      <w:r>
+        <w:t>target.getName</w:t>
+      </w:r>
+      <w:proofErr w:type="spellEnd"/>
+      <w:r>
+        <w:t xml:space="preserve">() + " for " + </w:t>
+      </w:r>
+      <w:proofErr w:type="spellStart"/>
+      <w:r>
+        <w:t>Math.round</w:t>
+      </w:r>
+      <w:proofErr w:type="spellEnd"/>
+      <w:r>
+        <w:t>(</w:t>
+      </w:r>
+      <w:proofErr w:type="spellStart"/>
+      <w:r>
+        <w:t>getDamage</w:t>
+      </w:r>
+      <w:proofErr w:type="spellEnd"/>
+      <w:r>
+        <w:t>()) + " damage!");</w:t>
       </w:r>
       <w:r>
         <w:br/>
-        <w:t xml:space="preserve">    target.takeDamage(getDamage());</w:t>
+        <w:t xml:space="preserve">    </w:t>
+      </w:r>
+      <w:proofErr w:type="spellStart"/>
+      <w:r>
+        <w:t>target.takeDamage</w:t>
+      </w:r>
+      <w:proofErr w:type="spellEnd"/>
+      <w:r>
+        <w:t>(</w:t>
+      </w:r>
+      <w:proofErr w:type="spellStart"/>
+      <w:r>
+        <w:t>getDamage</w:t>
+      </w:r>
+      <w:proofErr w:type="spellEnd"/>
+      <w:r>
+        <w:t>());</w:t>
       </w:r>
       <w:r>
         <w:br/>
@@ -8107,12 +8698,40 @@
         <w:rPr>
           <w:lang w:val="en-AT"/>
         </w:rPr>
-        <w:t>The getDamage() method returns the damage the GameCharacter can do.</w:t>
-      </w:r>
+        <w:t xml:space="preserve">The </w:t>
+      </w:r>
+      <w:proofErr w:type="spellStart"/>
       <w:r>
         <w:rPr>
           <w:lang w:val="en-AT"/>
         </w:rPr>
+        <w:t>getDamage</w:t>
+      </w:r>
+      <w:proofErr w:type="spellEnd"/>
+      <w:r>
+        <w:rPr>
+          <w:lang w:val="en-AT"/>
+        </w:rPr>
+        <w:t xml:space="preserve">() method returns the damage the </w:t>
+      </w:r>
+      <w:proofErr w:type="spellStart"/>
+      <w:r>
+        <w:rPr>
+          <w:lang w:val="en-AT"/>
+        </w:rPr>
+        <w:t>GameCharacter</w:t>
+      </w:r>
+      <w:proofErr w:type="spellEnd"/>
+      <w:r>
+        <w:rPr>
+          <w:lang w:val="en-AT"/>
+        </w:rPr>
+        <w:t xml:space="preserve"> can do.</w:t>
+      </w:r>
+      <w:r>
+        <w:rPr>
+          <w:lang w:val="en-AT"/>
+        </w:rPr>
         <w:t xml:space="preserve"> Damage is determined by the equipped Weapon, the strength and the intelligence </w:t>
       </w:r>
       <w:r>
@@ -8168,22 +8787,37 @@
       <w:pPr>
         <w:pStyle w:val="Pseoudocode"/>
       </w:pPr>
+      <w:proofErr w:type="spellStart"/>
       <w:r>
         <w:lastRenderedPageBreak/>
-        <w:t xml:space="preserve">equippedWeapon.getDamage() * (1 + </w:t>
+        <w:t>equippedWeapon.getDamage</w:t>
+      </w:r>
+      <w:proofErr w:type="spellEnd"/>
+      <w:r>
+        <w:t xml:space="preserve">() * (1 + </w:t>
       </w:r>
       <w:r>
         <w:t>stat</w:t>
       </w:r>
       <w:r>
-        <w:t xml:space="preserve"> * GameManager.DAMAGE_MULTIPLIER_PER_</w:t>
+        <w:t xml:space="preserve"> * </w:t>
+      </w:r>
+      <w:proofErr w:type="spellStart"/>
+      <w:r>
+        <w:t>GameManager.DAMAGE_MULTIPLIER_PER_</w:t>
       </w:r>
       <w:r>
         <w:t>STAT</w:t>
       </w:r>
-      <w:r>
-        <w:t>) * damage_multiplier</w:t>
-      </w:r>
+      <w:proofErr w:type="spellEnd"/>
+      <w:r>
+        <w:t xml:space="preserve">) * </w:t>
+      </w:r>
+      <w:proofErr w:type="spellStart"/>
+      <w:r>
+        <w:t>damage_multiplier</w:t>
+      </w:r>
+      <w:proofErr w:type="spellEnd"/>
     </w:p>
     <w:p>
       <w:pPr>
@@ -8248,7 +8882,15 @@
       </w:r>
       <w:r>
         <w:br/>
-        <w:t>public double getDamage()</w:t>
+        <w:t xml:space="preserve">public double </w:t>
+      </w:r>
+      <w:proofErr w:type="spellStart"/>
+      <w:r>
+        <w:t>getDamage</w:t>
+      </w:r>
+      <w:proofErr w:type="spellEnd"/>
+      <w:r>
+        <w:t>()</w:t>
       </w:r>
       <w:r>
         <w:br/>
@@ -8256,14 +8898,38 @@
       </w:r>
       <w:r>
         <w:br/>
-        <w:t xml:space="preserve">    double damage_multiplier = 1;</w:t>
+        <w:t xml:space="preserve">    double </w:t>
+      </w:r>
+      <w:proofErr w:type="spellStart"/>
+      <w:r>
+        <w:t>damage_multiplier</w:t>
+      </w:r>
+      <w:proofErr w:type="spellEnd"/>
+      <w:r>
+        <w:t xml:space="preserve"> = 1;</w:t>
       </w:r>
       <w:r>
         <w:br/>
       </w:r>
       <w:r>
         <w:br/>
-        <w:t xml:space="preserve">    if (getStatus() == CharacterStatus.CRITICALLY_HURT)</w:t>
+        <w:t xml:space="preserve">    if (</w:t>
+      </w:r>
+      <w:proofErr w:type="spellStart"/>
+      <w:r>
+        <w:t>getStatus</w:t>
+      </w:r>
+      <w:proofErr w:type="spellEnd"/>
+      <w:r>
+        <w:t xml:space="preserve">() == </w:t>
+      </w:r>
+      <w:proofErr w:type="spellStart"/>
+      <w:r>
+        <w:t>CharacterStatus.CRITICALLY_HURT</w:t>
+      </w:r>
+      <w:proofErr w:type="spellEnd"/>
+      <w:r>
+        <w:t>)</w:t>
       </w:r>
       <w:r>
         <w:br/>
@@ -8271,7 +8937,23 @@
       </w:r>
       <w:r>
         <w:br/>
-        <w:t xml:space="preserve">        damage_multiplier = GameManager.DAMAGE_REDUCTION_WHEN_CRITICAL_STATUS;</w:t>
+        <w:t xml:space="preserve">        </w:t>
+      </w:r>
+      <w:proofErr w:type="spellStart"/>
+      <w:r>
+        <w:t>damage_multiplier</w:t>
+      </w:r>
+      <w:proofErr w:type="spellEnd"/>
+      <w:r>
+        <w:t xml:space="preserve"> = </w:t>
+      </w:r>
+      <w:proofErr w:type="spellStart"/>
+      <w:r>
+        <w:t>GameManager.DAMAGE_REDUCTION_WHEN_CRITICAL_STATUS</w:t>
+      </w:r>
+      <w:proofErr w:type="spellEnd"/>
+      <w:r>
+        <w:t>;</w:t>
       </w:r>
       <w:r>
         <w:br/>
@@ -8282,7 +8964,15 @@
       </w:r>
       <w:r>
         <w:br/>
-        <w:t xml:space="preserve">    if (equippedWeapon.isMagic())</w:t>
+        <w:t xml:space="preserve">    if (</w:t>
+      </w:r>
+      <w:proofErr w:type="spellStart"/>
+      <w:r>
+        <w:t>equippedWeapon.isMagic</w:t>
+      </w:r>
+      <w:proofErr w:type="spellEnd"/>
+      <w:r>
+        <w:t>())</w:t>
       </w:r>
       <w:r>
         <w:br/>
@@ -8290,7 +8980,31 @@
       </w:r>
       <w:r>
         <w:br/>
-        <w:t xml:space="preserve">        return equippedWeapon.getDamage() * (1 + intelligence * GameManager.DAMAGE_MULTIPLIER_PER_INTELLIGENCE) * damage_multiplier;</w:t>
+        <w:t xml:space="preserve">        return </w:t>
+      </w:r>
+      <w:proofErr w:type="spellStart"/>
+      <w:r>
+        <w:t>equippedWeapon.getDamage</w:t>
+      </w:r>
+      <w:proofErr w:type="spellEnd"/>
+      <w:r>
+        <w:t xml:space="preserve">() * (1 + intelligence * </w:t>
+      </w:r>
+      <w:proofErr w:type="spellStart"/>
+      <w:r>
+        <w:t>GameManager.DAMAGE_MULTIPLIER_PER_INTELLIGENCE</w:t>
+      </w:r>
+      <w:proofErr w:type="spellEnd"/>
+      <w:r>
+        <w:t xml:space="preserve">) * </w:t>
+      </w:r>
+      <w:proofErr w:type="spellStart"/>
+      <w:r>
+        <w:t>damage_multiplier</w:t>
+      </w:r>
+      <w:proofErr w:type="spellEnd"/>
+      <w:r>
+        <w:t>;</w:t>
       </w:r>
       <w:r>
         <w:br/>
@@ -8301,7 +9015,31 @@
       </w:r>
       <w:r>
         <w:br/>
-        <w:t xml:space="preserve">    return equippedWeapon.getDamage() * (1 + strength * GameManager.DAMAGE_MULTIPLIER_PER_STRENGTH) * damage_multiplier;</w:t>
+        <w:t xml:space="preserve">    return </w:t>
+      </w:r>
+      <w:proofErr w:type="spellStart"/>
+      <w:r>
+        <w:t>equippedWeapon.getDamage</w:t>
+      </w:r>
+      <w:proofErr w:type="spellEnd"/>
+      <w:r>
+        <w:t xml:space="preserve">() * (1 + strength * </w:t>
+      </w:r>
+      <w:proofErr w:type="spellStart"/>
+      <w:r>
+        <w:t>GameManager.DAMAGE_MULTIPLIER_PER_STRENGTH</w:t>
+      </w:r>
+      <w:proofErr w:type="spellEnd"/>
+      <w:r>
+        <w:t xml:space="preserve">) * </w:t>
+      </w:r>
+      <w:proofErr w:type="spellStart"/>
+      <w:r>
+        <w:t>damage_multiplier</w:t>
+      </w:r>
+      <w:proofErr w:type="spellEnd"/>
+      <w:r>
+        <w:t>;</w:t>
       </w:r>
       <w:r>
         <w:br/>
@@ -8334,7 +9072,15 @@
         <w:fldChar w:fldCharType="end"/>
       </w:r>
       <w:r>
-        <w:t>: getDamage method</w:t>
+        <w:t xml:space="preserve">: </w:t>
+      </w:r>
+      <w:proofErr w:type="spellStart"/>
+      <w:r>
+        <w:t>getDamage</w:t>
+      </w:r>
+      <w:proofErr w:type="spellEnd"/>
+      <w:r>
+        <w:t xml:space="preserve"> method</w:t>
       </w:r>
     </w:p>
     <w:p>
@@ -8342,24 +9088,52 @@
         <w:rPr>
           <w:lang w:val="en-AT"/>
         </w:rPr>
-        <w:t>The takeDamage method handles incoming damage.</w:t>
-      </w:r>
+        <w:t xml:space="preserve">The </w:t>
+      </w:r>
+      <w:proofErr w:type="spellStart"/>
       <w:r>
         <w:rPr>
           <w:lang w:val="en-AT"/>
         </w:rPr>
+        <w:t>takeDamage</w:t>
+      </w:r>
+      <w:proofErr w:type="spellEnd"/>
+      <w:r>
+        <w:rPr>
+          <w:lang w:val="en-AT"/>
+        </w:rPr>
+        <w:t xml:space="preserve"> method handles incoming damage.</w:t>
+      </w:r>
+      <w:r>
+        <w:rPr>
+          <w:lang w:val="en-AT"/>
+        </w:rPr>
         <w:t xml:space="preserve"> </w:t>
       </w:r>
       <w:r>
         <w:rPr>
           <w:lang w:val="en-AT"/>
         </w:rPr>
-        <w:t>First, the dodgeRoll method gets called, which determines a dodge</w:t>
-      </w:r>
+        <w:t xml:space="preserve">First, the </w:t>
+      </w:r>
+      <w:proofErr w:type="spellStart"/>
       <w:r>
         <w:rPr>
           <w:lang w:val="en-AT"/>
         </w:rPr>
+        <w:t>dodgeRoll</w:t>
+      </w:r>
+      <w:proofErr w:type="spellEnd"/>
+      <w:r>
+        <w:rPr>
+          <w:lang w:val="en-AT"/>
+        </w:rPr>
+        <w:t xml:space="preserve"> method gets called, which determines a dodge</w:t>
+      </w:r>
+      <w:r>
+        <w:rPr>
+          <w:lang w:val="en-AT"/>
+        </w:rPr>
         <w:t xml:space="preserve"> based on the players dexterity.</w:t>
       </w:r>
       <w:r>
@@ -8378,7 +9152,15 @@
         <w:t xml:space="preserve">Current health gets reduced by the damage after the defense got subtracted. </w:t>
       </w:r>
       <w:r>
-        <w:t>If the character reaches zero health, the abstract onDeath method gets called.</w:t>
+        <w:t xml:space="preserve">If the character reaches zero health, the abstract </w:t>
+      </w:r>
+      <w:proofErr w:type="spellStart"/>
+      <w:r>
+        <w:t>onDeath</w:t>
+      </w:r>
+      <w:proofErr w:type="spellEnd"/>
+      <w:r>
+        <w:t xml:space="preserve"> method gets called.</w:t>
       </w:r>
     </w:p>
     <w:p>
@@ -8395,7 +9177,15 @@
       </w:r>
       <w:r>
         <w:br/>
-        <w:t xml:space="preserve"> * Damage is reduced by defense, then subtracted from health.</w:t>
+        <w:t xml:space="preserve"> * Damage is reduced by </w:t>
+      </w:r>
+      <w:proofErr w:type="spellStart"/>
+      <w:r>
+        <w:t>defense</w:t>
+      </w:r>
+      <w:proofErr w:type="spellEnd"/>
+      <w:r>
+        <w:t>, then subtracted from health.</w:t>
       </w:r>
       <w:r>
         <w:br/>
@@ -8415,7 +9205,15 @@
       </w:r>
       <w:r>
         <w:br/>
-        <w:t>public void takeDamage(double damage)</w:t>
+        <w:t xml:space="preserve">public void </w:t>
+      </w:r>
+      <w:proofErr w:type="spellStart"/>
+      <w:r>
+        <w:t>takeDamage</w:t>
+      </w:r>
+      <w:proofErr w:type="spellEnd"/>
+      <w:r>
+        <w:t>(double damage)</w:t>
       </w:r>
       <w:r>
         <w:br/>
@@ -8423,7 +9221,15 @@
       </w:r>
       <w:r>
         <w:br/>
-        <w:t xml:space="preserve">    if (dodgeRoll())</w:t>
+        <w:t xml:space="preserve">    if (</w:t>
+      </w:r>
+      <w:proofErr w:type="spellStart"/>
+      <w:r>
+        <w:t>dodgeRoll</w:t>
+      </w:r>
+      <w:proofErr w:type="spellEnd"/>
+      <w:r>
+        <w:t>())</w:t>
       </w:r>
       <w:r>
         <w:br/>
@@ -8431,7 +9237,23 @@
       </w:r>
       <w:r>
         <w:br/>
-        <w:t xml:space="preserve">        IO.println(getName() + " dodged the attack!");</w:t>
+        <w:t xml:space="preserve">        </w:t>
+      </w:r>
+      <w:proofErr w:type="spellStart"/>
+      <w:r>
+        <w:t>IO.println</w:t>
+      </w:r>
+      <w:proofErr w:type="spellEnd"/>
+      <w:r>
+        <w:t>(</w:t>
+      </w:r>
+      <w:proofErr w:type="spellStart"/>
+      <w:r>
+        <w:t>getName</w:t>
+      </w:r>
+      <w:proofErr w:type="spellEnd"/>
+      <w:r>
+        <w:t>() + " dodged the attack!");</w:t>
       </w:r>
       <w:r>
         <w:br/>
@@ -8446,25 +9268,113 @@
       </w:r>
       <w:r>
         <w:br/>
-        <w:t xml:space="preserve">    double damageTaken = Math.max(damage - getCurrentDefense(), 0);</w:t>
+        <w:t xml:space="preserve">    double </w:t>
+      </w:r>
+      <w:proofErr w:type="spellStart"/>
+      <w:r>
+        <w:t>damageTaken</w:t>
+      </w:r>
+      <w:proofErr w:type="spellEnd"/>
+      <w:r>
+        <w:t xml:space="preserve"> = </w:t>
+      </w:r>
+      <w:proofErr w:type="spellStart"/>
+      <w:r>
+        <w:t>Math.max</w:t>
+      </w:r>
+      <w:proofErr w:type="spellEnd"/>
+      <w:r>
+        <w:t xml:space="preserve">(damage - </w:t>
+      </w:r>
+      <w:proofErr w:type="spellStart"/>
+      <w:r>
+        <w:t>getCurrentDefense</w:t>
+      </w:r>
+      <w:proofErr w:type="spellEnd"/>
+      <w:r>
+        <w:t>(), 0);</w:t>
       </w:r>
       <w:r>
         <w:br/>
-        <w:t xml:space="preserve">    IO.println(getName() + " takes " + Math.round(damageTaken) + " damage!");</w:t>
+        <w:t xml:space="preserve">    </w:t>
+      </w:r>
+      <w:proofErr w:type="spellStart"/>
+      <w:r>
+        <w:t>IO.println</w:t>
+      </w:r>
+      <w:proofErr w:type="spellEnd"/>
+      <w:r>
+        <w:t>(</w:t>
+      </w:r>
+      <w:proofErr w:type="spellStart"/>
+      <w:r>
+        <w:t>getName</w:t>
+      </w:r>
+      <w:proofErr w:type="spellEnd"/>
+      <w:r>
+        <w:t xml:space="preserve">() + " takes " + </w:t>
+      </w:r>
+      <w:proofErr w:type="spellStart"/>
+      <w:r>
+        <w:t>Math.round</w:t>
+      </w:r>
+      <w:proofErr w:type="spellEnd"/>
+      <w:r>
+        <w:t>(</w:t>
+      </w:r>
+      <w:proofErr w:type="spellStart"/>
+      <w:r>
+        <w:t>damageTaken</w:t>
+      </w:r>
+      <w:proofErr w:type="spellEnd"/>
+      <w:r>
+        <w:t>) + " damage!");</w:t>
       </w:r>
       <w:r>
         <w:br/>
       </w:r>
       <w:r>
         <w:br/>
-        <w:t xml:space="preserve">    getEquippedArmour().reduceDurability(damageTaken);</w:t>
+        <w:t xml:space="preserve">    </w:t>
+      </w:r>
+      <w:proofErr w:type="spellStart"/>
+      <w:r>
+        <w:t>getEquippedArmour</w:t>
+      </w:r>
+      <w:proofErr w:type="spellEnd"/>
+      <w:r>
+        <w:t>().</w:t>
+      </w:r>
+      <w:proofErr w:type="spellStart"/>
+      <w:r>
+        <w:t>reduceDurability</w:t>
+      </w:r>
+      <w:proofErr w:type="spellEnd"/>
+      <w:r>
+        <w:t>(</w:t>
+      </w:r>
+      <w:proofErr w:type="spellStart"/>
+      <w:r>
+        <w:t>damageTaken</w:t>
+      </w:r>
+      <w:proofErr w:type="spellEnd"/>
+      <w:r>
+        <w:t>);</w:t>
       </w:r>
       <w:r>
         <w:br/>
       </w:r>
       <w:r>
         <w:br/>
-        <w:t xml:space="preserve">    health -= damageTaken;</w:t>
+        <w:t xml:space="preserve">    health -= </w:t>
+      </w:r>
+      <w:proofErr w:type="spellStart"/>
+      <w:r>
+        <w:t>damageTaken</w:t>
+      </w:r>
+      <w:proofErr w:type="spellEnd"/>
+      <w:r>
+        <w:t>;</w:t>
       </w:r>
       <w:r>
         <w:br/>
@@ -8480,11 +9390,35 @@
       </w:r>
       <w:r>
         <w:br/>
-        <w:t xml:space="preserve">        IO.println(getName() + " died!");</w:t>
+        <w:t xml:space="preserve">        </w:t>
+      </w:r>
+      <w:proofErr w:type="spellStart"/>
+      <w:r>
+        <w:t>IO.println</w:t>
+      </w:r>
+      <w:proofErr w:type="spellEnd"/>
+      <w:r>
+        <w:t>(</w:t>
+      </w:r>
+      <w:proofErr w:type="spellStart"/>
+      <w:r>
+        <w:t>getName</w:t>
+      </w:r>
+      <w:proofErr w:type="spellEnd"/>
+      <w:r>
+        <w:t>() + " died!");</w:t>
       </w:r>
       <w:r>
         <w:br/>
-        <w:t xml:space="preserve">        onDeath();</w:t>
+        <w:t xml:space="preserve">        </w:t>
+      </w:r>
+      <w:proofErr w:type="spellStart"/>
+      <w:r>
+        <w:t>onDeath</w:t>
+      </w:r>
+      <w:proofErr w:type="spellEnd"/>
+      <w:r>
+        <w:t>();</w:t>
       </w:r>
       <w:r>
         <w:br/>
@@ -8524,12 +9458,200 @@
         <w:fldChar w:fldCharType="end"/>
       </w:r>
       <w:r>
-        <w:t>: takeDamage method</w:t>
+        <w:t xml:space="preserve">: </w:t>
+      </w:r>
+      <w:proofErr w:type="spellStart"/>
+      <w:r>
+        <w:t>takeDamage</w:t>
+      </w:r>
+      <w:proofErr w:type="spellEnd"/>
+      <w:r>
+        <w:t xml:space="preserve"> method</w:t>
+      </w:r>
+    </w:p>
+    <w:p>
+      <w:pPr>
+        <w:pStyle w:val="Heading3"/>
+      </w:pPr>
+      <w:r>
+        <w:t>Defense</w:t>
       </w:r>
     </w:p>
     <w:p/>
     <w:p>
       <w:pPr>
+        <w:pStyle w:val="Pseoudocode"/>
+      </w:pPr>
+      <w:r>
+        <w:t>/**</w:t>
+      </w:r>
+      <w:r>
+        <w:br/>
+        <w:t xml:space="preserve"> * Puts the character in a defensive stance.</w:t>
+      </w:r>
+      <w:r>
+        <w:br/>
+        <w:t xml:space="preserve"> * While defending, the character gains additional </w:t>
+      </w:r>
+      <w:proofErr w:type="spellStart"/>
+      <w:r>
+        <w:t>defense</w:t>
+      </w:r>
+      <w:proofErr w:type="spellEnd"/>
+      <w:r>
+        <w:t xml:space="preserve"> from their shield.</w:t>
+      </w:r>
+      <w:r>
+        <w:br/>
+        <w:t xml:space="preserve"> */</w:t>
+      </w:r>
+      <w:r>
+        <w:br/>
+        <w:t>public void defend()</w:t>
+      </w:r>
+      <w:r>
+        <w:br/>
+      </w:r>
+      <w:r>
+        <w:lastRenderedPageBreak/>
+        <w:t>{</w:t>
+      </w:r>
+      <w:r>
+        <w:br/>
+        <w:t xml:space="preserve">    </w:t>
+      </w:r>
+      <w:proofErr w:type="spellStart"/>
+      <w:r>
+        <w:t>IO.println</w:t>
+      </w:r>
+      <w:proofErr w:type="spellEnd"/>
+      <w:r>
+        <w:t>(</w:t>
+      </w:r>
+      <w:proofErr w:type="spellStart"/>
+      <w:r>
+        <w:t>getName</w:t>
+      </w:r>
+      <w:proofErr w:type="spellEnd"/>
+      <w:r>
+        <w:t xml:space="preserve">() + " is defending for " + </w:t>
+      </w:r>
+      <w:proofErr w:type="spellStart"/>
+      <w:r>
+        <w:t>equippedShield.getDefense</w:t>
+      </w:r>
+      <w:proofErr w:type="spellEnd"/>
+      <w:r>
+        <w:t xml:space="preserve">() + " extra </w:t>
+      </w:r>
+      <w:proofErr w:type="spellStart"/>
+      <w:r>
+        <w:t>defense</w:t>
+      </w:r>
+      <w:proofErr w:type="spellEnd"/>
+      <w:r>
+        <w:t>!");</w:t>
+      </w:r>
+      <w:r>
+        <w:br/>
+        <w:t xml:space="preserve">    </w:t>
+      </w:r>
+      <w:proofErr w:type="spellStart"/>
+      <w:r>
+        <w:t>isDefending</w:t>
+      </w:r>
+      <w:proofErr w:type="spellEnd"/>
+      <w:r>
+        <w:t xml:space="preserve"> = true;</w:t>
+      </w:r>
+      <w:r>
+        <w:br/>
+        <w:t xml:space="preserve">    </w:t>
+      </w:r>
+      <w:r>
+        <w:br/>
+        <w:t xml:space="preserve">    // Grant PP to players when defending</w:t>
+      </w:r>
+      <w:r>
+        <w:br/>
+        <w:t xml:space="preserve">    if (this </w:t>
+      </w:r>
+      <w:proofErr w:type="spellStart"/>
+      <w:r>
+        <w:t>instanceof</w:t>
+      </w:r>
+      <w:proofErr w:type="spellEnd"/>
+      <w:r>
+        <w:t xml:space="preserve"> Player player)</w:t>
+      </w:r>
+      <w:r>
+        <w:br/>
+        <w:t xml:space="preserve">    {</w:t>
+      </w:r>
+      <w:r>
+        <w:br/>
+        <w:t xml:space="preserve">        </w:t>
+      </w:r>
+      <w:proofErr w:type="spellStart"/>
+      <w:r>
+        <w:t>player.gainPP</w:t>
+      </w:r>
+      <w:proofErr w:type="spellEnd"/>
+      <w:r>
+        <w:t>(</w:t>
+      </w:r>
+      <w:proofErr w:type="spellStart"/>
+      <w:r>
+        <w:t>equippedShield.getPpGain</w:t>
+      </w:r>
+      <w:proofErr w:type="spellEnd"/>
+      <w:r>
+        <w:t>());</w:t>
+      </w:r>
+      <w:r>
+        <w:br/>
+        <w:t xml:space="preserve">    }</w:t>
+      </w:r>
+      <w:r>
+        <w:br/>
+        <w:t>}</w:t>
+      </w:r>
+    </w:p>
+    <w:p>
+      <w:pPr>
+        <w:pStyle w:val="Caption"/>
+        <w:rPr>
+          <w:lang w:val="en-AT"/>
+        </w:rPr>
+      </w:pPr>
+      <w:r>
+        <w:t xml:space="preserve">Figure </w:t>
+      </w:r>
+      <w:r>
+        <w:fldChar w:fldCharType="begin"/>
+      </w:r>
+      <w:r>
+        <w:instrText xml:space="preserve"> SEQ Figure \* ARABIC </w:instrText>
+      </w:r>
+      <w:r>
+        <w:fldChar w:fldCharType="separate"/>
+      </w:r>
+      <w:r>
+        <w:rPr>
+          <w:noProof/>
+        </w:rPr>
+        <w:t>25</w:t>
+      </w:r>
+      <w:r>
+        <w:fldChar w:fldCharType="end"/>
+      </w:r>
+      <w:r>
+        <w:t>: defend Method</w:t>
+      </w:r>
+    </w:p>
+    <w:p/>
+    <w:p>
+      <w:pPr>
         <w:pStyle w:val="Heading2"/>
       </w:pPr>
       <w:bookmarkStart w:id="17" w:name="_Toc214802875"/>
@@ -8555,71 +9677,75 @@
         <w:pStyle w:val="Heading1"/>
       </w:pPr>
       <w:bookmarkStart w:id="19" w:name="_Toc214802877"/>
+      <w:proofErr w:type="spellStart"/>
+      <w:r>
+        <w:t>GameManager</w:t>
+      </w:r>
+      <w:bookmarkEnd w:id="19"/>
+      <w:proofErr w:type="spellEnd"/>
+    </w:p>
+    <w:p>
+      <w:pPr>
+        <w:pStyle w:val="Heading1"/>
+      </w:pPr>
+      <w:bookmarkStart w:id="20" w:name="_Toc214802878"/>
+      <w:r>
+        <w:t>Inventory</w:t>
+      </w:r>
+      <w:bookmarkEnd w:id="20"/>
+    </w:p>
+    <w:p>
+      <w:pPr>
+        <w:pStyle w:val="Heading1"/>
+      </w:pPr>
+      <w:bookmarkStart w:id="21" w:name="_Toc214802879"/>
+      <w:r>
+        <w:t>Items</w:t>
+      </w:r>
+      <w:bookmarkEnd w:id="21"/>
+    </w:p>
+    <w:p>
+      <w:pPr>
+        <w:pStyle w:val="Heading2"/>
+      </w:pPr>
+      <w:bookmarkStart w:id="22" w:name="_Toc214802880"/>
+      <w:r>
+        <w:t>Weapons</w:t>
+      </w:r>
+      <w:bookmarkEnd w:id="22"/>
+    </w:p>
+    <w:p/>
+    <w:p>
+      <w:pPr>
+        <w:pStyle w:val="Heading2"/>
+      </w:pPr>
+      <w:bookmarkStart w:id="23" w:name="_Toc214802881"/>
+      <w:r>
+        <w:t>Shields</w:t>
+      </w:r>
+      <w:bookmarkEnd w:id="23"/>
+    </w:p>
+    <w:p/>
+    <w:p>
+      <w:pPr>
+        <w:pStyle w:val="Heading2"/>
+      </w:pPr>
+      <w:bookmarkStart w:id="24" w:name="_Toc214802882"/>
+      <w:proofErr w:type="spellStart"/>
+      <w:r>
+        <w:t>Armours</w:t>
+      </w:r>
+      <w:bookmarkEnd w:id="24"/>
+      <w:proofErr w:type="spellEnd"/>
+    </w:p>
+    <w:p/>
+    <w:p>
+      <w:pPr>
+        <w:pStyle w:val="Heading2"/>
+      </w:pPr>
+      <w:bookmarkStart w:id="25" w:name="_Toc214802883"/>
       <w:r>
         <w:lastRenderedPageBreak/>
-        <w:t>GameManager</w:t>
-      </w:r>
-      <w:bookmarkEnd w:id="19"/>
-    </w:p>
-    <w:p>
-      <w:pPr>
-        <w:pStyle w:val="Heading1"/>
-      </w:pPr>
-      <w:bookmarkStart w:id="20" w:name="_Toc214802878"/>
-      <w:r>
-        <w:t>Inventory</w:t>
-      </w:r>
-      <w:bookmarkEnd w:id="20"/>
-    </w:p>
-    <w:p>
-      <w:pPr>
-        <w:pStyle w:val="Heading1"/>
-      </w:pPr>
-      <w:bookmarkStart w:id="21" w:name="_Toc214802879"/>
-      <w:r>
-        <w:t>Items</w:t>
-      </w:r>
-      <w:bookmarkEnd w:id="21"/>
-    </w:p>
-    <w:p>
-      <w:pPr>
-        <w:pStyle w:val="Heading2"/>
-      </w:pPr>
-      <w:bookmarkStart w:id="22" w:name="_Toc214802880"/>
-      <w:r>
-        <w:t>Weapons</w:t>
-      </w:r>
-      <w:bookmarkEnd w:id="22"/>
-    </w:p>
-    <w:p/>
-    <w:p>
-      <w:pPr>
-        <w:pStyle w:val="Heading2"/>
-      </w:pPr>
-      <w:bookmarkStart w:id="23" w:name="_Toc214802881"/>
-      <w:r>
-        <w:t>Shields</w:t>
-      </w:r>
-      <w:bookmarkEnd w:id="23"/>
-    </w:p>
-    <w:p/>
-    <w:p>
-      <w:pPr>
-        <w:pStyle w:val="Heading2"/>
-      </w:pPr>
-      <w:bookmarkStart w:id="24" w:name="_Toc214802882"/>
-      <w:r>
-        <w:t>Armours</w:t>
-      </w:r>
-      <w:bookmarkEnd w:id="24"/>
-    </w:p>
-    <w:p/>
-    <w:p>
-      <w:pPr>
-        <w:pStyle w:val="Heading2"/>
-      </w:pPr>
-      <w:bookmarkStart w:id="25" w:name="_Toc214802883"/>
-      <w:r>
         <w:t>Healing Items</w:t>
       </w:r>
       <w:bookmarkEnd w:id="25"/>

</xml_diff>

<commit_message>
Fix typo in weapon description string
Corrected the description for the 'PP Knife' weapon from 'PP is flowing your veins.' to 'PP is flowing through your veins.' in WeaponFactory.java.
</commit_message>
<xml_diff>
--- a/Modules/Semester_1/Modern Code/Aufgaben/03_Methods_and_Combat/Protocol.docx
+++ b/Modules/Semester_1/Modern Code/Aufgaben/03_Methods_and_Combat/Protocol.docx
@@ -9491,109 +9491,206 @@
         <w:t>: useItem method</w:t>
       </w:r>
     </w:p>
+    <w:p>
+      <w:pPr>
+        <w:pStyle w:val="Heading2"/>
+      </w:pPr>
+      <w:r>
+        <w:t>DisplayBoxes</w:t>
+      </w:r>
+    </w:p>
+    <w:p>
+      <w:r>
+        <w:t>The static getDisplayBox() and combineEnemyBoxes() methods are responsible for displaying the</w:t>
+      </w:r>
+      <w:r>
+        <w:t xml:space="preserve"> character boxes seen in the battles.</w:t>
+      </w:r>
+    </w:p>
+    <w:p>
+      <w:pPr>
+        <w:pStyle w:val="Heading1"/>
+      </w:pPr>
+      <w:r>
+        <w:t>Player</w:t>
+      </w:r>
+      <w:bookmarkEnd w:id="18"/>
+    </w:p>
+    <w:p>
+      <w:r>
+        <w:t>The player extends the GameCharacter class.</w:t>
+      </w:r>
+      <w:r>
+        <w:t xml:space="preserve"> </w:t>
+      </w:r>
+      <w:r>
+        <w:t>It adds level management and power points.</w:t>
+      </w:r>
+    </w:p>
+    <w:p>
+      <w:pPr>
+        <w:pStyle w:val="Pseoudocode"/>
+      </w:pPr>
+      <w:r>
+        <w:t>private int level = 1;</w:t>
+      </w:r>
+      <w:r>
+        <w:br/>
+        <w:t>private int experience = 0;</w:t>
+      </w:r>
+      <w:r>
+        <w:br/>
+        <w:t>private int availableStatPoints = 0;</w:t>
+      </w:r>
+      <w:r>
+        <w:br/>
+        <w:t>private int currentPP = 0;</w:t>
+      </w:r>
+      <w:r>
+        <w:br/>
+        <w:t>private int maxPP = 100;</w:t>
+      </w:r>
+      <w:r>
+        <w:br/>
+        <w:t>public static double DEFAULT_PLAYER_MAX_HEALTH = 100.0;</w:t>
+      </w:r>
+    </w:p>
+    <w:p>
+      <w:pPr>
+        <w:pStyle w:val="Pseoudocode"/>
+      </w:pPr>
+      <w:r>
+        <w:t>public static int DEFAULT_PLAYER_MAX_PP = 100;</w:t>
+      </w:r>
+    </w:p>
+    <w:p>
+      <w:pPr>
+        <w:pStyle w:val="Caption"/>
+      </w:pPr>
+      <w:r>
+        <w:t xml:space="preserve">Figure </w:t>
+      </w:r>
+      <w:r>
+        <w:fldChar w:fldCharType="begin"/>
+      </w:r>
+      <w:r>
+        <w:instrText xml:space="preserve"> SEQ Figure \* ARABIC </w:instrText>
+      </w:r>
+      <w:r>
+        <w:fldChar w:fldCharType="separate"/>
+      </w:r>
+      <w:r>
+        <w:rPr>
+          <w:noProof/>
+        </w:rPr>
+        <w:t>30</w:t>
+      </w:r>
+      <w:r>
+        <w:fldChar w:fldCharType="end"/>
+      </w:r>
+      <w:r>
+        <w:t>: Player fields</w:t>
+      </w:r>
+    </w:p>
+    <w:p>
+      <w:pPr>
+        <w:rPr>
+          <w:lang w:val="en-AT"/>
+        </w:rPr>
+      </w:pPr>
+    </w:p>
+    <w:p>
+      <w:pPr>
+        <w:pStyle w:val="Heading2"/>
+      </w:pPr>
+      <w:bookmarkStart w:id="19" w:name="_Toc214802876"/>
+      <w:r>
+        <w:t>Enemy</w:t>
+      </w:r>
+      <w:bookmarkEnd w:id="19"/>
+    </w:p>
     <w:p/>
     <w:p>
       <w:pPr>
+        <w:pStyle w:val="Heading1"/>
+      </w:pPr>
+      <w:bookmarkStart w:id="20" w:name="_Toc214802877"/>
+      <w:r>
+        <w:lastRenderedPageBreak/>
+        <w:t>GameManager</w:t>
+      </w:r>
+      <w:bookmarkEnd w:id="20"/>
+    </w:p>
+    <w:p>
+      <w:pPr>
+        <w:pStyle w:val="Heading1"/>
+      </w:pPr>
+      <w:bookmarkStart w:id="21" w:name="_Toc214802878"/>
+      <w:r>
+        <w:t>Inventory</w:t>
+      </w:r>
+      <w:bookmarkEnd w:id="21"/>
+    </w:p>
+    <w:p>
+      <w:pPr>
+        <w:pStyle w:val="Heading1"/>
+      </w:pPr>
+      <w:bookmarkStart w:id="22" w:name="_Toc214802879"/>
+      <w:r>
+        <w:t>Items</w:t>
+      </w:r>
+      <w:bookmarkEnd w:id="22"/>
+    </w:p>
+    <w:p>
+      <w:pPr>
         <w:pStyle w:val="Heading2"/>
       </w:pPr>
-      <w:r>
-        <w:t>Player</w:t>
-      </w:r>
-      <w:bookmarkEnd w:id="18"/>
+      <w:bookmarkStart w:id="23" w:name="_Toc214802880"/>
+      <w:r>
+        <w:t>Weapons</w:t>
+      </w:r>
+      <w:bookmarkEnd w:id="23"/>
     </w:p>
     <w:p/>
     <w:p>
       <w:pPr>
         <w:pStyle w:val="Heading2"/>
       </w:pPr>
-      <w:bookmarkStart w:id="19" w:name="_Toc214802876"/>
-      <w:r>
-        <w:t>Enemy</w:t>
-      </w:r>
-      <w:bookmarkEnd w:id="19"/>
+      <w:bookmarkStart w:id="24" w:name="_Toc214802881"/>
+      <w:r>
+        <w:t>Shields</w:t>
+      </w:r>
+      <w:bookmarkEnd w:id="24"/>
     </w:p>
     <w:p/>
     <w:p>
       <w:pPr>
+        <w:pStyle w:val="Heading2"/>
+      </w:pPr>
+      <w:bookmarkStart w:id="25" w:name="_Toc214802882"/>
+      <w:r>
+        <w:t>Armours</w:t>
+      </w:r>
+      <w:bookmarkEnd w:id="25"/>
+    </w:p>
+    <w:p/>
+    <w:p>
+      <w:pPr>
+        <w:pStyle w:val="Heading2"/>
+      </w:pPr>
+      <w:bookmarkStart w:id="26" w:name="_Toc214802883"/>
+      <w:r>
+        <w:t>Healing Items</w:t>
+      </w:r>
+      <w:bookmarkEnd w:id="26"/>
+    </w:p>
+    <w:p/>
+    <w:p>
+      <w:pPr>
         <w:pStyle w:val="Heading1"/>
       </w:pPr>
-      <w:bookmarkStart w:id="20" w:name="_Toc214802877"/>
-      <w:r>
-        <w:t>GameManager</w:t>
-      </w:r>
-      <w:bookmarkEnd w:id="20"/>
-    </w:p>
-    <w:p>
-      <w:pPr>
-        <w:pStyle w:val="Heading1"/>
-      </w:pPr>
-      <w:bookmarkStart w:id="21" w:name="_Toc214802878"/>
-      <w:r>
-        <w:t>Inventory</w:t>
-      </w:r>
-      <w:bookmarkEnd w:id="21"/>
-    </w:p>
-    <w:p>
-      <w:pPr>
-        <w:pStyle w:val="Heading1"/>
-      </w:pPr>
-      <w:bookmarkStart w:id="22" w:name="_Toc214802879"/>
-      <w:r>
-        <w:t>Items</w:t>
-      </w:r>
-      <w:bookmarkEnd w:id="22"/>
-    </w:p>
-    <w:p>
-      <w:pPr>
-        <w:pStyle w:val="Heading2"/>
-      </w:pPr>
-      <w:bookmarkStart w:id="23" w:name="_Toc214802880"/>
-      <w:r>
-        <w:t>Weapons</w:t>
-      </w:r>
-      <w:bookmarkEnd w:id="23"/>
-    </w:p>
-    <w:p/>
-    <w:p>
-      <w:pPr>
-        <w:pStyle w:val="Heading2"/>
-      </w:pPr>
-      <w:bookmarkStart w:id="24" w:name="_Toc214802881"/>
-      <w:r>
-        <w:t>Shields</w:t>
-      </w:r>
-      <w:bookmarkEnd w:id="24"/>
-    </w:p>
-    <w:p/>
-    <w:p>
-      <w:pPr>
-        <w:pStyle w:val="Heading2"/>
-      </w:pPr>
-      <w:bookmarkStart w:id="25" w:name="_Toc214802882"/>
-      <w:r>
-        <w:t>Armours</w:t>
-      </w:r>
-      <w:bookmarkEnd w:id="25"/>
-    </w:p>
-    <w:p/>
-    <w:p>
-      <w:pPr>
-        <w:pStyle w:val="Heading2"/>
-      </w:pPr>
-      <w:bookmarkStart w:id="26" w:name="_Toc214802883"/>
-      <w:r>
-        <w:t>Healing Items</w:t>
-      </w:r>
-      <w:bookmarkEnd w:id="26"/>
-    </w:p>
-    <w:p/>
-    <w:p>
-      <w:pPr>
-        <w:pStyle w:val="Heading1"/>
-      </w:pPr>
       <w:bookmarkStart w:id="27" w:name="_Toc214802884"/>
       <w:r>
-        <w:lastRenderedPageBreak/>
         <w:t>Factories</w:t>
       </w:r>
       <w:bookmarkEnd w:id="27"/>

</xml_diff>

<commit_message>
Update Protocol documents for Methods and Combat
Revised Protocol.docx and Protocol.pdf files in the Methods and Combat assignment folder. The updates likely include content or formatting changes to the protocol documentation.
</commit_message>
<xml_diff>
--- a/Modules/Semester_1/Modern Code/Aufgaben/03_Methods_and_Combat/Protocol.docx
+++ b/Modules/Semester_1/Modern Code/Aufgaben/03_Methods_and_Combat/Protocol.docx
@@ -11337,7 +11337,13 @@
         <w:fldChar w:fldCharType="separate"/>
       </w:r>
       <w:r>
-        <w:t>Figure 22</w:t>
+        <w:t xml:space="preserve">Figure </w:t>
+      </w:r>
+      <w:r>
+        <w:rPr>
+          <w:noProof/>
+        </w:rPr>
+        <w:t>22</w:t>
       </w:r>
       <w:r>
         <w:fldChar w:fldCharType="end"/>
@@ -12428,7 +12434,13 @@
         <w:fldChar w:fldCharType="separate"/>
       </w:r>
       <w:r>
-        <w:t>Figure 26</w:t>
+        <w:t xml:space="preserve">Figure </w:t>
+      </w:r>
+      <w:r>
+        <w:rPr>
+          <w:noProof/>
+        </w:rPr>
+        <w:t>26</w:t>
       </w:r>
       <w:r>
         <w:fldChar w:fldCharType="end"/>
@@ -20534,7 +20546,13 @@
         <w:fldChar w:fldCharType="separate"/>
       </w:r>
       <w:r>
-        <w:t>Figure 49</w:t>
+        <w:t xml:space="preserve">Figure </w:t>
+      </w:r>
+      <w:r>
+        <w:rPr>
+          <w:noProof/>
+        </w:rPr>
+        <w:t>49</w:t>
       </w:r>
       <w:r>
         <w:fldChar w:fldCharType="end"/>

</xml_diff>